<commit_message>
continuando o site em HTML junto ao professor
</commit_message>
<xml_diff>
--- a/apostila/Projeto Space For Men.docx
+++ b/apostila/Projeto Space For Men.docx
@@ -7,13 +7,8 @@
         <w:jc w:val="center"/>
       </w:pPr>
       <w:r>
-        <w:t xml:space="preserve">Projeto Space For </w:t>
-      </w:r>
-      <w:proofErr w:type="spellStart"/>
-      <w:r>
-        <w:t>Men</w:t>
-      </w:r>
-      <w:proofErr w:type="spellEnd"/>
+        <w:t>Projeto Space For Men</w:t>
+      </w:r>
     </w:p>
     <w:p>
       <w:pPr>
@@ -22,7 +17,13 @@
     </w:p>
     <w:p>
       <w:r>
-        <w:t xml:space="preserve">1- </w:t>
+        <w:t>1</w:t>
+      </w:r>
+      <w:r>
+        <w:t xml:space="preserve"> </w:t>
+      </w:r>
+      <w:r>
+        <w:t xml:space="preserve">- </w:t>
       </w:r>
       <w:r>
         <w:t>Clonamos o repositório</w:t>
@@ -129,7 +130,7 @@
                     <pic:cNvPicPr/>
                   </pic:nvPicPr>
                   <pic:blipFill>
-                    <a:blip r:embed="rId5" cstate="print">
+                    <a:blip r:embed="rId6" cstate="print">
                       <a:extLst>
                         <a:ext uri="{28A0092B-C50C-407E-A947-70E740481C1C}">
                           <a14:useLocalDpi xmlns:a14="http://schemas.microsoft.com/office/drawing/2010/main" val="0"/>
@@ -157,15 +158,10 @@
       </w:r>
     </w:p>
     <w:p>
-      <w:proofErr w:type="spellStart"/>
-      <w:r>
-        <w:t>git</w:t>
-      </w:r>
-      <w:proofErr w:type="spellEnd"/>
-      <w:r>
-        <w:t xml:space="preserve"> clone </w:t>
-      </w:r>
-      <w:hyperlink r:id="rId6" w:history="1">
+      <w:r>
+        <w:t xml:space="preserve">git clone </w:t>
+      </w:r>
+      <w:hyperlink r:id="rId7" w:history="1">
         <w:r>
           <w:rPr>
             <w:rStyle w:val="Hyperlink"/>
@@ -177,15 +173,13 @@
     <w:p/>
     <w:p>
       <w:r>
-        <w:t xml:space="preserve">2- Abrimos o </w:t>
-      </w:r>
-      <w:proofErr w:type="spellStart"/>
-      <w:r>
-        <w:t>VScode</w:t>
-      </w:r>
-      <w:proofErr w:type="spellEnd"/>
-      <w:r>
-        <w:t xml:space="preserve"> na pasta e criamos</w:t>
+        <w:t>2</w:t>
+      </w:r>
+      <w:r>
+        <w:t xml:space="preserve"> </w:t>
+      </w:r>
+      <w:r>
+        <w:t>- Abrimos o VScode na pasta e criamos</w:t>
       </w:r>
       <w:r>
         <w:t xml:space="preserve"> os arquivos index.html e style.css</w:t>
@@ -215,7 +209,7 @@
                     <pic:cNvPicPr/>
                   </pic:nvPicPr>
                   <pic:blipFill>
-                    <a:blip r:embed="rId7"/>
+                    <a:blip r:embed="rId8"/>
                     <a:stretch>
                       <a:fillRect/>
                     </a:stretch>
@@ -241,34 +235,16 @@
     <w:p>
       <w:r>
         <w:lastRenderedPageBreak/>
-        <w:t xml:space="preserve">3- Dentro do index.html fazer o comando de “!” e colocar o </w:t>
-      </w:r>
-      <w:proofErr w:type="spellStart"/>
-      <w:r>
-        <w:t>lang</w:t>
-      </w:r>
-      <w:proofErr w:type="spellEnd"/>
-      <w:r>
-        <w:t xml:space="preserve"> em “</w:t>
-      </w:r>
-      <w:proofErr w:type="spellStart"/>
-      <w:r>
-        <w:t>pt-br</w:t>
-      </w:r>
-      <w:proofErr w:type="spellEnd"/>
-      <w:r>
-        <w:t>”</w:t>
-      </w:r>
-      <w:r>
-        <w:t xml:space="preserve">, e </w:t>
-      </w:r>
-      <w:proofErr w:type="spellStart"/>
-      <w:r>
-        <w:t>linkar</w:t>
-      </w:r>
-      <w:proofErr w:type="spellEnd"/>
-      <w:r>
-        <w:t xml:space="preserve"> o CSS.</w:t>
+        <w:t>3</w:t>
+      </w:r>
+      <w:r>
+        <w:t xml:space="preserve"> </w:t>
+      </w:r>
+      <w:r>
+        <w:t>- Dentro do index.html fazer o comando de “!” e colocar o lang em “pt-br”</w:t>
+      </w:r>
+      <w:r>
+        <w:t>, e linkar o CSS.</w:t>
       </w:r>
     </w:p>
     <w:p>
@@ -343,6 +319,9 @@
         </mc:AlternateContent>
       </w:r>
       <w:r>
+        <w:rPr>
+          <w:noProof/>
+        </w:rPr>
         <w:drawing>
           <wp:inline distT="0" distB="0" distL="0" distR="0" wp14:anchorId="229667BB" wp14:editId="6B18DDCA">
             <wp:extent cx="5400040" cy="2122170"/>
@@ -359,7 +338,7 @@
                     <pic:cNvPicPr/>
                   </pic:nvPicPr>
                   <pic:blipFill>
-                    <a:blip r:embed="rId8"/>
+                    <a:blip r:embed="rId9"/>
                     <a:stretch>
                       <a:fillRect/>
                     </a:stretch>
@@ -514,6 +493,9 @@
         </mc:AlternateContent>
       </w:r>
       <w:r>
+        <w:rPr>
+          <w:noProof/>
+        </w:rPr>
         <w:drawing>
           <wp:inline distT="0" distB="0" distL="0" distR="0" wp14:anchorId="105E5A1A" wp14:editId="7BC0ED95">
             <wp:extent cx="5400040" cy="1699895"/>
@@ -530,7 +512,7 @@
                     <pic:cNvPicPr/>
                   </pic:nvPicPr>
                   <pic:blipFill>
-                    <a:blip r:embed="rId9"/>
+                    <a:blip r:embed="rId10"/>
                     <a:stretch>
                       <a:fillRect/>
                     </a:stretch>
@@ -691,15 +673,13 @@
         </mc:AlternateContent>
       </w:r>
       <w:r>
-        <w:t xml:space="preserve">4- No texto do index.html utilizamos </w:t>
-      </w:r>
-      <w:proofErr w:type="spellStart"/>
-      <w:r>
-        <w:t>tags</w:t>
-      </w:r>
-      <w:proofErr w:type="spellEnd"/>
-      <w:r>
-        <w:t xml:space="preserve"> alinhadas tendo a regra a primeira que abre é a ultima que fecha conforme imagem</w:t>
+        <w:t>4</w:t>
+      </w:r>
+      <w:r>
+        <w:t xml:space="preserve"> </w:t>
+      </w:r>
+      <w:r>
+        <w:t>- No texto do index.html utilizamos tags alinhadas tendo a regra a primeira que abre é a ultima que fecha conforme imagem</w:t>
       </w:r>
     </w:p>
     <w:p>
@@ -733,7 +713,7 @@
                     </pic:cNvPicPr>
                   </pic:nvPicPr>
                   <pic:blipFill>
-                    <a:blip r:embed="rId10">
+                    <a:blip r:embed="rId11">
                       <a:extLst>
                         <a:ext uri="{28A0092B-C50C-407E-A947-70E740481C1C}">
                           <a14:useLocalDpi xmlns:a14="http://schemas.microsoft.com/office/drawing/2010/main" val="0"/>
@@ -762,77 +742,25 @@
         </w:drawing>
       </w:r>
       <w:r>
-        <w:t>5- Colocamos a cor vermelha utilizando o CSS através de referência conforme o código:</w:t>
-      </w:r>
-    </w:p>
-    <w:p>
-      <w:r>
+        <w:t>5</w:t>
+      </w:r>
+      <w:r>
+        <w:t xml:space="preserve"> </w:t>
+      </w:r>
+      <w:r>
+        <w:t>- Colocamos a cor vermelha utilizando o CSS através de referência conforme o código:</w:t>
+      </w:r>
+    </w:p>
+    <w:p>
+      <w:r>
+        <w:rPr>
+          <w:noProof/>
+        </w:rPr>
         <w:drawing>
           <wp:inline distT="0" distB="0" distL="0" distR="0" wp14:anchorId="5DD61697" wp14:editId="61B8481C">
             <wp:extent cx="2305050" cy="1043337"/>
             <wp:effectExtent l="0" t="0" r="0" b="4445"/>
             <wp:docPr id="15" name="Imagem 15"/>
-            <wp:cNvGraphicFramePr>
-              <a:graphicFrameLocks xmlns:a="http://schemas.openxmlformats.org/drawingml/2006/main" noChangeAspect="1"/>
-            </wp:cNvGraphicFramePr>
-            <a:graphic xmlns:a="http://schemas.openxmlformats.org/drawingml/2006/main">
-              <a:graphicData uri="http://schemas.openxmlformats.org/drawingml/2006/picture">
-                <pic:pic xmlns:pic="http://schemas.openxmlformats.org/drawingml/2006/picture">
-                  <pic:nvPicPr>
-                    <pic:cNvPr id="1" name=""/>
-                    <pic:cNvPicPr/>
-                  </pic:nvPicPr>
-                  <pic:blipFill>
-                    <a:blip r:embed="rId11"/>
-                    <a:stretch>
-                      <a:fillRect/>
-                    </a:stretch>
-                  </pic:blipFill>
-                  <pic:spPr>
-                    <a:xfrm>
-                      <a:off x="0" y="0"/>
-                      <a:ext cx="2336048" cy="1057367"/>
-                    </a:xfrm>
-                    <a:prstGeom prst="rect">
-                      <a:avLst/>
-                    </a:prstGeom>
-                  </pic:spPr>
-                </pic:pic>
-              </a:graphicData>
-            </a:graphic>
-          </wp:inline>
-        </w:drawing>
-      </w:r>
-    </w:p>
-    <w:p>
-      <w:r>
-        <w:t>6- No HTML i</w:t>
-      </w:r>
-      <w:r>
-        <w:t>n</w:t>
-      </w:r>
-      <w:r>
-        <w:t>serimos uma imagem</w:t>
-      </w:r>
-      <w:r>
-        <w:t xml:space="preserve"> utilizando o seguinte código e adicionamos uma </w:t>
-      </w:r>
-      <w:proofErr w:type="spellStart"/>
-      <w:r>
-        <w:t>class</w:t>
-      </w:r>
-      <w:proofErr w:type="spellEnd"/>
-      <w:r>
-        <w:t>:</w:t>
-      </w:r>
-    </w:p>
-    <w:p>
-      <w:r>
-        <w:drawing>
-          <wp:inline distT="0" distB="0" distL="0" distR="0" wp14:anchorId="3866D9BC" wp14:editId="2C5F740F">
-            <wp:extent cx="5257806" cy="219075"/>
-            <wp:effectExtent l="0" t="0" r="0" b="9525"/>
-            <wp:docPr id="16" name="Imagem 16"/>
             <wp:cNvGraphicFramePr>
               <a:graphicFrameLocks xmlns:a="http://schemas.openxmlformats.org/drawingml/2006/main" noChangeAspect="1"/>
             </wp:cNvGraphicFramePr>
@@ -852,7 +780,7 @@
                   <pic:spPr>
                     <a:xfrm>
                       <a:off x="0" y="0"/>
-                      <a:ext cx="5270454" cy="219602"/>
+                      <a:ext cx="2336048" cy="1057367"/>
                     </a:xfrm>
                     <a:prstGeom prst="rect">
                       <a:avLst/>
@@ -867,16 +795,34 @@
     </w:p>
     <w:p>
       <w:r>
-        <w:t>No CSS definimos que a imagem ocupasse 100% do tamanho da nossa tela:</w:t>
-      </w:r>
-    </w:p>
-    <w:p>
-      <w:r>
+        <w:t>6</w:t>
+      </w:r>
+      <w:r>
+        <w:t xml:space="preserve"> </w:t>
+      </w:r>
+      <w:r>
+        <w:t>- No HTML i</w:t>
+      </w:r>
+      <w:r>
+        <w:t>n</w:t>
+      </w:r>
+      <w:r>
+        <w:t>serimos uma imagem</w:t>
+      </w:r>
+      <w:r>
+        <w:t xml:space="preserve"> utilizando o seguinte código e adicionamos uma class:</w:t>
+      </w:r>
+    </w:p>
+    <w:p>
+      <w:r>
+        <w:rPr>
+          <w:noProof/>
+        </w:rPr>
         <w:drawing>
-          <wp:inline distT="0" distB="0" distL="0" distR="0" wp14:anchorId="39ECB85A" wp14:editId="45853DD6">
-            <wp:extent cx="2541134" cy="1000125"/>
-            <wp:effectExtent l="0" t="0" r="0" b="0"/>
-            <wp:docPr id="17" name="Imagem 17"/>
+          <wp:inline distT="0" distB="0" distL="0" distR="0" wp14:anchorId="3866D9BC" wp14:editId="2C5F740F">
+            <wp:extent cx="5257806" cy="219075"/>
+            <wp:effectExtent l="0" t="0" r="0" b="9525"/>
+            <wp:docPr id="16" name="Imagem 16"/>
             <wp:cNvGraphicFramePr>
               <a:graphicFrameLocks xmlns:a="http://schemas.openxmlformats.org/drawingml/2006/main" noChangeAspect="1"/>
             </wp:cNvGraphicFramePr>
@@ -896,7 +842,7 @@
                   <pic:spPr>
                     <a:xfrm>
                       <a:off x="0" y="0"/>
-                      <a:ext cx="2545236" cy="1001739"/>
+                      <a:ext cx="5270454" cy="219602"/>
                     </a:xfrm>
                     <a:prstGeom prst="rect">
                       <a:avLst/>
@@ -909,20 +855,21 @@
         </w:drawing>
       </w:r>
     </w:p>
-    <w:p/>
-    <w:p>
-      <w:r>
-        <w:lastRenderedPageBreak/>
-        <w:t>7- No CSS centralizamos o nosso título h1:</w:t>
-      </w:r>
-    </w:p>
-    <w:p>
-      <w:r>
+    <w:p>
+      <w:r>
+        <w:t>No CSS definimos que a imagem ocupasse 100% do tamanho da nossa tela:</w:t>
+      </w:r>
+    </w:p>
+    <w:p>
+      <w:r>
+        <w:rPr>
+          <w:noProof/>
+        </w:rPr>
         <w:drawing>
-          <wp:inline distT="0" distB="0" distL="0" distR="0" wp14:anchorId="7D8C38AF" wp14:editId="71141925">
-            <wp:extent cx="2305050" cy="743958"/>
+          <wp:inline distT="0" distB="0" distL="0" distR="0" wp14:anchorId="39ECB85A" wp14:editId="45853DD6">
+            <wp:extent cx="2541134" cy="1000125"/>
             <wp:effectExtent l="0" t="0" r="0" b="0"/>
-            <wp:docPr id="18" name="Imagem 18"/>
+            <wp:docPr id="17" name="Imagem 17"/>
             <wp:cNvGraphicFramePr>
               <a:graphicFrameLocks xmlns:a="http://schemas.openxmlformats.org/drawingml/2006/main" noChangeAspect="1"/>
             </wp:cNvGraphicFramePr>
@@ -942,7 +889,7 @@
                   <pic:spPr>
                     <a:xfrm>
                       <a:off x="0" y="0"/>
-                      <a:ext cx="2345560" cy="757033"/>
+                      <a:ext cx="2545236" cy="1001739"/>
                     </a:xfrm>
                     <a:prstGeom prst="rect">
                       <a:avLst/>
@@ -955,42 +902,29 @@
         </w:drawing>
       </w:r>
     </w:p>
-    <w:p>
-      <w:r>
-        <w:t xml:space="preserve">8- </w:t>
-      </w:r>
-      <w:r>
-        <w:t xml:space="preserve">No parágrafo a Missão queremos que ele fique com uma fonte maior ou seja aumentando o tamanho dele utilizando </w:t>
-      </w:r>
-      <w:proofErr w:type="spellStart"/>
-      <w:r>
-        <w:t>font-size</w:t>
-      </w:r>
-      <w:proofErr w:type="spellEnd"/>
-      <w:r>
-        <w:t>.</w:t>
-      </w:r>
-    </w:p>
-    <w:p>
-      <w:r>
-        <w:t xml:space="preserve">E no HTML incluímos uma </w:t>
-      </w:r>
-      <w:proofErr w:type="spellStart"/>
-      <w:r>
-        <w:t>class</w:t>
-      </w:r>
-      <w:proofErr w:type="spellEnd"/>
-      <w:r>
-        <w:t xml:space="preserve"> para trabalhar com o parágrafo especifico</w:t>
-      </w:r>
-    </w:p>
-    <w:p>
-      <w:r>
+    <w:p/>
+    <w:p>
+      <w:r>
+        <w:lastRenderedPageBreak/>
+        <w:t>7</w:t>
+      </w:r>
+      <w:r>
+        <w:t xml:space="preserve"> </w:t>
+      </w:r>
+      <w:r>
+        <w:t>- No CSS centralizamos o nosso título h1:</w:t>
+      </w:r>
+    </w:p>
+    <w:p>
+      <w:r>
+        <w:rPr>
+          <w:noProof/>
+        </w:rPr>
         <w:drawing>
-          <wp:inline distT="0" distB="0" distL="0" distR="0" wp14:anchorId="2C7424BB" wp14:editId="6173709C">
-            <wp:extent cx="6314440" cy="285750"/>
+          <wp:inline distT="0" distB="0" distL="0" distR="0" wp14:anchorId="7D8C38AF" wp14:editId="71141925">
+            <wp:extent cx="2305050" cy="743958"/>
             <wp:effectExtent l="0" t="0" r="0" b="0"/>
-            <wp:docPr id="20" name="Imagem 20"/>
+            <wp:docPr id="18" name="Imagem 18"/>
             <wp:cNvGraphicFramePr>
               <a:graphicFrameLocks xmlns:a="http://schemas.openxmlformats.org/drawingml/2006/main" noChangeAspect="1"/>
             </wp:cNvGraphicFramePr>
@@ -1010,7 +944,7 @@
                   <pic:spPr>
                     <a:xfrm>
                       <a:off x="0" y="0"/>
-                      <a:ext cx="6314440" cy="285750"/>
+                      <a:ext cx="2345560" cy="757033"/>
                     </a:xfrm>
                     <a:prstGeom prst="rect">
                       <a:avLst/>
@@ -1025,11 +959,33 @@
     </w:p>
     <w:p>
       <w:r>
+        <w:t>8</w:t>
+      </w:r>
+      <w:r>
+        <w:t xml:space="preserve"> </w:t>
+      </w:r>
+      <w:r>
+        <w:t xml:space="preserve">- </w:t>
+      </w:r>
+      <w:r>
+        <w:t>No parágrafo a Missão queremos que ele fique com uma fonte maior ou seja aumentando o tamanho dele utilizando font-size.</w:t>
+      </w:r>
+    </w:p>
+    <w:p>
+      <w:r>
+        <w:t>E no HTML incluímos uma class para trabalhar com o parágrafo especifico</w:t>
+      </w:r>
+    </w:p>
+    <w:p>
+      <w:r>
+        <w:rPr>
+          <w:noProof/>
+        </w:rPr>
         <w:drawing>
-          <wp:inline distT="0" distB="0" distL="0" distR="0" wp14:anchorId="0097E5CC" wp14:editId="7A84D184">
-            <wp:extent cx="2371725" cy="871538"/>
-            <wp:effectExtent l="0" t="0" r="0" b="5080"/>
-            <wp:docPr id="19" name="Imagem 19"/>
+          <wp:inline distT="0" distB="0" distL="0" distR="0" wp14:anchorId="2C7424BB" wp14:editId="6173709C">
+            <wp:extent cx="6314440" cy="285750"/>
+            <wp:effectExtent l="0" t="0" r="0" b="0"/>
+            <wp:docPr id="20" name="Imagem 20"/>
             <wp:cNvGraphicFramePr>
               <a:graphicFrameLocks xmlns:a="http://schemas.openxmlformats.org/drawingml/2006/main" noChangeAspect="1"/>
             </wp:cNvGraphicFramePr>
@@ -1049,7 +1005,7 @@
                   <pic:spPr>
                     <a:xfrm>
                       <a:off x="0" y="0"/>
-                      <a:ext cx="2417593" cy="888393"/>
+                      <a:ext cx="6314440" cy="285750"/>
                     </a:xfrm>
                     <a:prstGeom prst="rect">
                       <a:avLst/>
@@ -1064,19 +1020,14 @@
     </w:p>
     <w:p>
       <w:r>
-        <w:t xml:space="preserve">9- No HTML </w:t>
-      </w:r>
-      <w:r>
-        <w:t>inserimos um subtítulo e criamos uma lista não ordenada.</w:t>
-      </w:r>
-    </w:p>
-    <w:p>
-      <w:r>
+        <w:rPr>
+          <w:noProof/>
+        </w:rPr>
         <w:drawing>
-          <wp:inline distT="0" distB="0" distL="0" distR="0" wp14:anchorId="6EC7FD91" wp14:editId="01340C21">
-            <wp:extent cx="3590925" cy="1073922"/>
-            <wp:effectExtent l="0" t="0" r="0" b="0"/>
-            <wp:docPr id="21" name="Imagem 21"/>
+          <wp:inline distT="0" distB="0" distL="0" distR="0" wp14:anchorId="0097E5CC" wp14:editId="7A84D184">
+            <wp:extent cx="2371725" cy="871538"/>
+            <wp:effectExtent l="0" t="0" r="0" b="5080"/>
+            <wp:docPr id="19" name="Imagem 19"/>
             <wp:cNvGraphicFramePr>
               <a:graphicFrameLocks xmlns:a="http://schemas.openxmlformats.org/drawingml/2006/main" noChangeAspect="1"/>
             </wp:cNvGraphicFramePr>
@@ -1096,6 +1047,62 @@
                   <pic:spPr>
                     <a:xfrm>
                       <a:off x="0" y="0"/>
+                      <a:ext cx="2417593" cy="888393"/>
+                    </a:xfrm>
+                    <a:prstGeom prst="rect">
+                      <a:avLst/>
+                    </a:prstGeom>
+                  </pic:spPr>
+                </pic:pic>
+              </a:graphicData>
+            </a:graphic>
+          </wp:inline>
+        </w:drawing>
+      </w:r>
+    </w:p>
+    <w:p>
+      <w:r>
+        <w:t>9</w:t>
+      </w:r>
+      <w:r>
+        <w:t xml:space="preserve"> </w:t>
+      </w:r>
+      <w:r>
+        <w:t xml:space="preserve">- No HTML </w:t>
+      </w:r>
+      <w:r>
+        <w:t>inserimos um subtítulo e criamos uma lista não ordenada.</w:t>
+      </w:r>
+    </w:p>
+    <w:p>
+      <w:r>
+        <w:rPr>
+          <w:noProof/>
+        </w:rPr>
+        <w:drawing>
+          <wp:inline distT="0" distB="0" distL="0" distR="0" wp14:anchorId="6EC7FD91" wp14:editId="01340C21">
+            <wp:extent cx="3590925" cy="1073922"/>
+            <wp:effectExtent l="0" t="0" r="0" b="0"/>
+            <wp:docPr id="21" name="Imagem 21"/>
+            <wp:cNvGraphicFramePr>
+              <a:graphicFrameLocks xmlns:a="http://schemas.openxmlformats.org/drawingml/2006/main" noChangeAspect="1"/>
+            </wp:cNvGraphicFramePr>
+            <a:graphic xmlns:a="http://schemas.openxmlformats.org/drawingml/2006/main">
+              <a:graphicData uri="http://schemas.openxmlformats.org/drawingml/2006/picture">
+                <pic:pic xmlns:pic="http://schemas.openxmlformats.org/drawingml/2006/picture">
+                  <pic:nvPicPr>
+                    <pic:cNvPr id="1" name=""/>
+                    <pic:cNvPicPr/>
+                  </pic:nvPicPr>
+                  <pic:blipFill>
+                    <a:blip r:embed="rId18"/>
+                    <a:stretch>
+                      <a:fillRect/>
+                    </a:stretch>
+                  </pic:blipFill>
+                  <pic:spPr>
+                    <a:xfrm>
+                      <a:off x="0" y="0"/>
                       <a:ext cx="3612649" cy="1080419"/>
                     </a:xfrm>
                     <a:prstGeom prst="rect">
@@ -1111,7 +1118,3149 @@
     </w:p>
     <w:p>
       <w:r>
-        <w:t xml:space="preserve">10- </w:t>
+        <w:t>10</w:t>
+      </w:r>
+      <w:r>
+        <w:t xml:space="preserve"> </w:t>
+      </w:r>
+      <w:r>
+        <w:t xml:space="preserve">- </w:t>
+      </w:r>
+      <w:r>
+        <w:t>Nos itens da lista adicionamos class com mesmo nome para que o comportamento se repita para todos os itens da lista.</w:t>
+      </w:r>
+    </w:p>
+    <w:p>
+      <w:r>
+        <w:t>(os itens todos ficaram em itálico)</w:t>
+      </w:r>
+    </w:p>
+    <w:p>
+      <w:r>
+        <w:rPr>
+          <w:noProof/>
+        </w:rPr>
+        <mc:AlternateContent>
+          <mc:Choice Requires="wps">
+            <w:drawing>
+              <wp:anchor distT="0" distB="0" distL="114300" distR="114300" simplePos="0" relativeHeight="251666432" behindDoc="0" locked="0" layoutInCell="1" allowOverlap="1">
+                <wp:simplePos x="0" y="0"/>
+                <wp:positionH relativeFrom="column">
+                  <wp:posOffset>443866</wp:posOffset>
+                </wp:positionH>
+                <wp:positionV relativeFrom="paragraph">
+                  <wp:posOffset>7619</wp:posOffset>
+                </wp:positionV>
+                <wp:extent cx="552450" cy="161925"/>
+                <wp:effectExtent l="0" t="0" r="76200" b="66675"/>
+                <wp:wrapNone/>
+                <wp:docPr id="9" name="Conector de Seta Reta 9"/>
+                <wp:cNvGraphicFramePr/>
+                <a:graphic xmlns:a="http://schemas.openxmlformats.org/drawingml/2006/main">
+                  <a:graphicData uri="http://schemas.microsoft.com/office/word/2010/wordprocessingShape">
+                    <wps:wsp>
+                      <wps:cNvCnPr/>
+                      <wps:spPr>
+                        <a:xfrm>
+                          <a:off x="0" y="0"/>
+                          <a:ext cx="552450" cy="161925"/>
+                        </a:xfrm>
+                        <a:prstGeom prst="straightConnector1">
+                          <a:avLst/>
+                        </a:prstGeom>
+                        <a:ln>
+                          <a:tailEnd type="triangle"/>
+                        </a:ln>
+                      </wps:spPr>
+                      <wps:style>
+                        <a:lnRef idx="1">
+                          <a:schemeClr val="accent1"/>
+                        </a:lnRef>
+                        <a:fillRef idx="0">
+                          <a:schemeClr val="accent1"/>
+                        </a:fillRef>
+                        <a:effectRef idx="0">
+                          <a:schemeClr val="accent1"/>
+                        </a:effectRef>
+                        <a:fontRef idx="minor">
+                          <a:schemeClr val="tx1"/>
+                        </a:fontRef>
+                      </wps:style>
+                      <wps:bodyPr/>
+                    </wps:wsp>
+                  </a:graphicData>
+                </a:graphic>
+                <wp14:sizeRelH relativeFrom="margin">
+                  <wp14:pctWidth>0</wp14:pctWidth>
+                </wp14:sizeRelH>
+                <wp14:sizeRelV relativeFrom="margin">
+                  <wp14:pctHeight>0</wp14:pctHeight>
+                </wp14:sizeRelV>
+              </wp:anchor>
+            </w:drawing>
+          </mc:Choice>
+          <mc:Fallback>
+            <w:pict>
+              <v:shapetype w14:anchorId="257D3F2A" id="_x0000_t32" coordsize="21600,21600" o:spt="32" o:oned="t" path="m,l21600,21600e" filled="f">
+                <v:path arrowok="t" fillok="f" o:connecttype="none"/>
+                <o:lock v:ext="edit" shapetype="t"/>
+              </v:shapetype>
+              <v:shape id="Conector de Seta Reta 9" o:spid="_x0000_s1026" type="#_x0000_t32" style="position:absolute;margin-left:34.95pt;margin-top:.6pt;width:43.5pt;height:12.75pt;z-index:251666432;visibility:visible;mso-wrap-style:square;mso-width-percent:0;mso-height-percent:0;mso-wrap-distance-left:9pt;mso-wrap-distance-top:0;mso-wrap-distance-right:9pt;mso-wrap-distance-bottom:0;mso-position-horizontal:absolute;mso-position-horizontal-relative:text;mso-position-vertical:absolute;mso-position-vertical-relative:text;mso-width-percent:0;mso-height-percent:0;mso-width-relative:margin;mso-height-relative:margin" o:gfxdata="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" strokecolor="#4472c4 [3204]" strokeweight=".5pt">
+                <v:stroke endarrow="block" joinstyle="miter"/>
+              </v:shape>
+            </w:pict>
+          </mc:Fallback>
+        </mc:AlternateContent>
+      </w:r>
+      <w:r>
+        <w:rPr>
+          <w:noProof/>
+        </w:rPr>
+        <mc:AlternateContent>
+          <mc:Choice Requires="wps">
+            <w:drawing>
+              <wp:anchor distT="0" distB="0" distL="114300" distR="114300" simplePos="0" relativeHeight="251667456" behindDoc="0" locked="0" layoutInCell="1" allowOverlap="1">
+                <wp:simplePos x="0" y="0"/>
+                <wp:positionH relativeFrom="column">
+                  <wp:posOffset>1472564</wp:posOffset>
+                </wp:positionH>
+                <wp:positionV relativeFrom="paragraph">
+                  <wp:posOffset>760095</wp:posOffset>
+                </wp:positionV>
+                <wp:extent cx="409575" cy="266700"/>
+                <wp:effectExtent l="38100" t="0" r="28575" b="57150"/>
+                <wp:wrapNone/>
+                <wp:docPr id="10" name="Conector de Seta Reta 10"/>
+                <wp:cNvGraphicFramePr/>
+                <a:graphic xmlns:a="http://schemas.openxmlformats.org/drawingml/2006/main">
+                  <a:graphicData uri="http://schemas.microsoft.com/office/word/2010/wordprocessingShape">
+                    <wps:wsp>
+                      <wps:cNvCnPr/>
+                      <wps:spPr>
+                        <a:xfrm flipH="1">
+                          <a:off x="0" y="0"/>
+                          <a:ext cx="409575" cy="266700"/>
+                        </a:xfrm>
+                        <a:prstGeom prst="straightConnector1">
+                          <a:avLst/>
+                        </a:prstGeom>
+                        <a:ln>
+                          <a:tailEnd type="triangle"/>
+                        </a:ln>
+                      </wps:spPr>
+                      <wps:style>
+                        <a:lnRef idx="1">
+                          <a:schemeClr val="accent1"/>
+                        </a:lnRef>
+                        <a:fillRef idx="0">
+                          <a:schemeClr val="accent1"/>
+                        </a:fillRef>
+                        <a:effectRef idx="0">
+                          <a:schemeClr val="accent1"/>
+                        </a:effectRef>
+                        <a:fontRef idx="minor">
+                          <a:schemeClr val="tx1"/>
+                        </a:fontRef>
+                      </wps:style>
+                      <wps:bodyPr/>
+                    </wps:wsp>
+                  </a:graphicData>
+                </a:graphic>
+                <wp14:sizeRelH relativeFrom="margin">
+                  <wp14:pctWidth>0</wp14:pctWidth>
+                </wp14:sizeRelH>
+                <wp14:sizeRelV relativeFrom="margin">
+                  <wp14:pctHeight>0</wp14:pctHeight>
+                </wp14:sizeRelV>
+              </wp:anchor>
+            </w:drawing>
+          </mc:Choice>
+          <mc:Fallback>
+            <w:pict>
+              <v:shape w14:anchorId="74EAF569" id="Conector de Seta Reta 10" o:spid="_x0000_s1026" type="#_x0000_t32" style="position:absolute;margin-left:115.95pt;margin-top:59.85pt;width:32.25pt;height:21pt;flip:x;z-index:251667456;visibility:visible;mso-wrap-style:square;mso-width-percent:0;mso-height-percent:0;mso-wrap-distance-left:9pt;mso-wrap-distance-top:0;mso-wrap-distance-right:9pt;mso-wrap-distance-bottom:0;mso-position-horizontal:absolute;mso-position-horizontal-relative:text;mso-position-vertical:absolute;mso-position-vertical-relative:text;mso-width-percent:0;mso-height-percent:0;mso-width-relative:margin;mso-height-relative:margin" o:gfxdata="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" strokecolor="#4472c4 [3204]" strokeweight=".5pt">
+                <v:stroke endarrow="block" joinstyle="miter"/>
+              </v:shape>
+            </w:pict>
+          </mc:Fallback>
+        </mc:AlternateContent>
+      </w:r>
+      <w:r>
+        <w:rPr>
+          <w:noProof/>
+        </w:rPr>
+        <w:drawing>
+          <wp:inline distT="0" distB="0" distL="0" distR="0" wp14:anchorId="1795D98B" wp14:editId="5BC6D5E6">
+            <wp:extent cx="3952875" cy="866775"/>
+            <wp:effectExtent l="0" t="0" r="9525" b="9525"/>
+            <wp:docPr id="8" name="Imagem 8"/>
+            <wp:cNvGraphicFramePr>
+              <a:graphicFrameLocks xmlns:a="http://schemas.openxmlformats.org/drawingml/2006/main" noChangeAspect="1"/>
+            </wp:cNvGraphicFramePr>
+            <a:graphic xmlns:a="http://schemas.openxmlformats.org/drawingml/2006/main">
+              <a:graphicData uri="http://schemas.openxmlformats.org/drawingml/2006/picture">
+                <pic:pic xmlns:pic="http://schemas.openxmlformats.org/drawingml/2006/picture">
+                  <pic:nvPicPr>
+                    <pic:cNvPr id="1" name=""/>
+                    <pic:cNvPicPr/>
+                  </pic:nvPicPr>
+                  <pic:blipFill>
+                    <a:blip r:embed="rId19"/>
+                    <a:stretch>
+                      <a:fillRect/>
+                    </a:stretch>
+                  </pic:blipFill>
+                  <pic:spPr>
+                    <a:xfrm>
+                      <a:off x="0" y="0"/>
+                      <a:ext cx="4209592" cy="923067"/>
+                    </a:xfrm>
+                    <a:prstGeom prst="rect">
+                      <a:avLst/>
+                    </a:prstGeom>
+                  </pic:spPr>
+                </pic:pic>
+              </a:graphicData>
+            </a:graphic>
+          </wp:inline>
+        </w:drawing>
+      </w:r>
+      <w:r>
+        <w:rPr>
+          <w:noProof/>
+        </w:rPr>
+        <w:drawing>
+          <wp:inline distT="0" distB="0" distL="0" distR="0" wp14:anchorId="23882511" wp14:editId="3C13D0BB">
+            <wp:extent cx="1733792" cy="552527"/>
+            <wp:effectExtent l="0" t="0" r="0" b="0"/>
+            <wp:docPr id="22" name="Imagem 22"/>
+            <wp:cNvGraphicFramePr>
+              <a:graphicFrameLocks xmlns:a="http://schemas.openxmlformats.org/drawingml/2006/main" noChangeAspect="1"/>
+            </wp:cNvGraphicFramePr>
+            <a:graphic xmlns:a="http://schemas.openxmlformats.org/drawingml/2006/main">
+              <a:graphicData uri="http://schemas.openxmlformats.org/drawingml/2006/picture">
+                <pic:pic xmlns:pic="http://schemas.openxmlformats.org/drawingml/2006/picture">
+                  <pic:nvPicPr>
+                    <pic:cNvPr id="1" name=""/>
+                    <pic:cNvPicPr/>
+                  </pic:nvPicPr>
+                  <pic:blipFill>
+                    <a:blip r:embed="rId20"/>
+                    <a:stretch>
+                      <a:fillRect/>
+                    </a:stretch>
+                  </pic:blipFill>
+                  <pic:spPr>
+                    <a:xfrm>
+                      <a:off x="0" y="0"/>
+                      <a:ext cx="1733792" cy="552527"/>
+                    </a:xfrm>
+                    <a:prstGeom prst="rect">
+                      <a:avLst/>
+                    </a:prstGeom>
+                  </pic:spPr>
+                </pic:pic>
+              </a:graphicData>
+            </a:graphic>
+          </wp:inline>
+        </w:drawing>
+      </w:r>
+    </w:p>
+    <w:p/>
+    <w:p/>
+    <w:p/>
+    <w:p/>
+    <w:p/>
+    <w:p/>
+    <w:p>
+      <w:r>
+        <w:lastRenderedPageBreak/>
+        <w:t xml:space="preserve">11 </w:t>
+      </w:r>
+      <w:r>
+        <w:t>–</w:t>
+      </w:r>
+      <w:r>
+        <w:t xml:space="preserve"> </w:t>
+      </w:r>
+      <w:r>
+        <w:t>Dividimos a nossa página em duas:</w:t>
+      </w:r>
+    </w:p>
+    <w:p>
+      <w:r>
+        <w:t>Primeira parte sendo a principal onde adicionamos uma div que iniciou acima do header e fechou em baixo do nosso último parágrafo.</w:t>
+      </w:r>
+    </w:p>
+    <w:p>
+      <w:r>
+        <w:t>E deixamos o fundo dessa divisão com a cor branca.</w:t>
+      </w:r>
+    </w:p>
+    <w:p>
+      <w:r>
+        <w:rPr>
+          <w:noProof/>
+        </w:rPr>
+        <mc:AlternateContent>
+          <mc:Choice Requires="wps">
+            <w:drawing>
+              <wp:anchor distT="0" distB="0" distL="114300" distR="114300" simplePos="0" relativeHeight="251669504" behindDoc="0" locked="0" layoutInCell="1" allowOverlap="1">
+                <wp:simplePos x="0" y="0"/>
+                <wp:positionH relativeFrom="column">
+                  <wp:posOffset>-203835</wp:posOffset>
+                </wp:positionH>
+                <wp:positionV relativeFrom="paragraph">
+                  <wp:posOffset>1259840</wp:posOffset>
+                </wp:positionV>
+                <wp:extent cx="266700" cy="200025"/>
+                <wp:effectExtent l="0" t="0" r="76200" b="47625"/>
+                <wp:wrapNone/>
+                <wp:docPr id="25" name="Conector de Seta Reta 25"/>
+                <wp:cNvGraphicFramePr/>
+                <a:graphic xmlns:a="http://schemas.openxmlformats.org/drawingml/2006/main">
+                  <a:graphicData uri="http://schemas.microsoft.com/office/word/2010/wordprocessingShape">
+                    <wps:wsp>
+                      <wps:cNvCnPr/>
+                      <wps:spPr>
+                        <a:xfrm>
+                          <a:off x="0" y="0"/>
+                          <a:ext cx="266700" cy="200025"/>
+                        </a:xfrm>
+                        <a:prstGeom prst="straightConnector1">
+                          <a:avLst/>
+                        </a:prstGeom>
+                        <a:ln>
+                          <a:tailEnd type="triangle"/>
+                        </a:ln>
+                      </wps:spPr>
+                      <wps:style>
+                        <a:lnRef idx="1">
+                          <a:schemeClr val="accent1"/>
+                        </a:lnRef>
+                        <a:fillRef idx="0">
+                          <a:schemeClr val="accent1"/>
+                        </a:fillRef>
+                        <a:effectRef idx="0">
+                          <a:schemeClr val="accent1"/>
+                        </a:effectRef>
+                        <a:fontRef idx="minor">
+                          <a:schemeClr val="tx1"/>
+                        </a:fontRef>
+                      </wps:style>
+                      <wps:bodyPr/>
+                    </wps:wsp>
+                  </a:graphicData>
+                </a:graphic>
+              </wp:anchor>
+            </w:drawing>
+          </mc:Choice>
+          <mc:Fallback>
+            <w:pict>
+              <v:shape w14:anchorId="31C520C8" id="Conector de Seta Reta 25" o:spid="_x0000_s1026" type="#_x0000_t32" style="position:absolute;margin-left:-16.05pt;margin-top:99.2pt;width:21pt;height:15.75pt;z-index:251669504;visibility:visible;mso-wrap-style:square;mso-wrap-distance-left:9pt;mso-wrap-distance-top:0;mso-wrap-distance-right:9pt;mso-wrap-distance-bottom:0;mso-position-horizontal:absolute;mso-position-horizontal-relative:text;mso-position-vertical:absolute;mso-position-vertical-relative:text" o:gfxdata="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" strokecolor="#4472c4 [3204]" strokeweight=".5pt">
+                <v:stroke endarrow="block" joinstyle="miter"/>
+              </v:shape>
+            </w:pict>
+          </mc:Fallback>
+        </mc:AlternateContent>
+      </w:r>
+      <w:r>
+        <w:rPr>
+          <w:noProof/>
+        </w:rPr>
+        <mc:AlternateContent>
+          <mc:Choice Requires="wps">
+            <w:drawing>
+              <wp:anchor distT="0" distB="0" distL="114300" distR="114300" simplePos="0" relativeHeight="251668480" behindDoc="0" locked="0" layoutInCell="1" allowOverlap="1">
+                <wp:simplePos x="0" y="0"/>
+                <wp:positionH relativeFrom="column">
+                  <wp:posOffset>-270510</wp:posOffset>
+                </wp:positionH>
+                <wp:positionV relativeFrom="paragraph">
+                  <wp:posOffset>107315</wp:posOffset>
+                </wp:positionV>
+                <wp:extent cx="323850" cy="180975"/>
+                <wp:effectExtent l="0" t="38100" r="57150" b="28575"/>
+                <wp:wrapNone/>
+                <wp:docPr id="24" name="Conector de Seta Reta 24"/>
+                <wp:cNvGraphicFramePr/>
+                <a:graphic xmlns:a="http://schemas.openxmlformats.org/drawingml/2006/main">
+                  <a:graphicData uri="http://schemas.microsoft.com/office/word/2010/wordprocessingShape">
+                    <wps:wsp>
+                      <wps:cNvCnPr/>
+                      <wps:spPr>
+                        <a:xfrm flipV="1">
+                          <a:off x="0" y="0"/>
+                          <a:ext cx="323850" cy="180975"/>
+                        </a:xfrm>
+                        <a:prstGeom prst="straightConnector1">
+                          <a:avLst/>
+                        </a:prstGeom>
+                        <a:ln>
+                          <a:tailEnd type="triangle"/>
+                        </a:ln>
+                      </wps:spPr>
+                      <wps:style>
+                        <a:lnRef idx="1">
+                          <a:schemeClr val="accent1"/>
+                        </a:lnRef>
+                        <a:fillRef idx="0">
+                          <a:schemeClr val="accent1"/>
+                        </a:fillRef>
+                        <a:effectRef idx="0">
+                          <a:schemeClr val="accent1"/>
+                        </a:effectRef>
+                        <a:fontRef idx="minor">
+                          <a:schemeClr val="tx1"/>
+                        </a:fontRef>
+                      </wps:style>
+                      <wps:bodyPr/>
+                    </wps:wsp>
+                  </a:graphicData>
+                </a:graphic>
+              </wp:anchor>
+            </w:drawing>
+          </mc:Choice>
+          <mc:Fallback>
+            <w:pict>
+              <v:shape w14:anchorId="52B61858" id="Conector de Seta Reta 24" o:spid="_x0000_s1026" type="#_x0000_t32" style="position:absolute;margin-left:-21.3pt;margin-top:8.45pt;width:25.5pt;height:14.25pt;flip:y;z-index:251668480;visibility:visible;mso-wrap-style:square;mso-wrap-distance-left:9pt;mso-wrap-distance-top:0;mso-wrap-distance-right:9pt;mso-wrap-distance-bottom:0;mso-position-horizontal:absolute;mso-position-horizontal-relative:text;mso-position-vertical:absolute;mso-position-vertical-relative:text" o:gfxdata="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" strokecolor="#4472c4 [3204]" strokeweight=".5pt">
+                <v:stroke endarrow="block" joinstyle="miter"/>
+              </v:shape>
+            </w:pict>
+          </mc:Fallback>
+        </mc:AlternateContent>
+      </w:r>
+      <w:r>
+        <w:rPr>
+          <w:noProof/>
+        </w:rPr>
+        <w:drawing>
+          <wp:inline distT="0" distB="0" distL="0" distR="0" wp14:anchorId="2F1CB9E0" wp14:editId="3D8B21D2">
+            <wp:extent cx="5400040" cy="1586230"/>
+            <wp:effectExtent l="0" t="0" r="0" b="0"/>
+            <wp:docPr id="23" name="Imagem 23"/>
+            <wp:cNvGraphicFramePr>
+              <a:graphicFrameLocks xmlns:a="http://schemas.openxmlformats.org/drawingml/2006/main" noChangeAspect="1"/>
+            </wp:cNvGraphicFramePr>
+            <a:graphic xmlns:a="http://schemas.openxmlformats.org/drawingml/2006/main">
+              <a:graphicData uri="http://schemas.openxmlformats.org/drawingml/2006/picture">
+                <pic:pic xmlns:pic="http://schemas.openxmlformats.org/drawingml/2006/picture">
+                  <pic:nvPicPr>
+                    <pic:cNvPr id="1" name=""/>
+                    <pic:cNvPicPr/>
+                  </pic:nvPicPr>
+                  <pic:blipFill>
+                    <a:blip r:embed="rId21"/>
+                    <a:stretch>
+                      <a:fillRect/>
+                    </a:stretch>
+                  </pic:blipFill>
+                  <pic:spPr>
+                    <a:xfrm>
+                      <a:off x="0" y="0"/>
+                      <a:ext cx="5400040" cy="1586230"/>
+                    </a:xfrm>
+                    <a:prstGeom prst="rect">
+                      <a:avLst/>
+                    </a:prstGeom>
+                  </pic:spPr>
+                </pic:pic>
+              </a:graphicData>
+            </a:graphic>
+          </wp:inline>
+        </w:drawing>
+      </w:r>
+    </w:p>
+    <w:p>
+      <w:r>
+        <w:rPr>
+          <w:noProof/>
+        </w:rPr>
+        <mc:AlternateContent>
+          <mc:Choice Requires="wps">
+            <w:drawing>
+              <wp:anchor distT="0" distB="0" distL="114300" distR="114300" simplePos="0" relativeHeight="251670528" behindDoc="0" locked="0" layoutInCell="1" allowOverlap="1">
+                <wp:simplePos x="0" y="0"/>
+                <wp:positionH relativeFrom="column">
+                  <wp:posOffset>1539239</wp:posOffset>
+                </wp:positionH>
+                <wp:positionV relativeFrom="paragraph">
+                  <wp:posOffset>339090</wp:posOffset>
+                </wp:positionV>
+                <wp:extent cx="295275" cy="257175"/>
+                <wp:effectExtent l="0" t="38100" r="47625" b="28575"/>
+                <wp:wrapNone/>
+                <wp:docPr id="27" name="Conector de Seta Reta 27"/>
+                <wp:cNvGraphicFramePr/>
+                <a:graphic xmlns:a="http://schemas.openxmlformats.org/drawingml/2006/main">
+                  <a:graphicData uri="http://schemas.microsoft.com/office/word/2010/wordprocessingShape">
+                    <wps:wsp>
+                      <wps:cNvCnPr/>
+                      <wps:spPr>
+                        <a:xfrm flipV="1">
+                          <a:off x="0" y="0"/>
+                          <a:ext cx="295275" cy="257175"/>
+                        </a:xfrm>
+                        <a:prstGeom prst="straightConnector1">
+                          <a:avLst/>
+                        </a:prstGeom>
+                        <a:ln>
+                          <a:tailEnd type="triangle"/>
+                        </a:ln>
+                      </wps:spPr>
+                      <wps:style>
+                        <a:lnRef idx="1">
+                          <a:schemeClr val="accent1"/>
+                        </a:lnRef>
+                        <a:fillRef idx="0">
+                          <a:schemeClr val="accent1"/>
+                        </a:fillRef>
+                        <a:effectRef idx="0">
+                          <a:schemeClr val="accent1"/>
+                        </a:effectRef>
+                        <a:fontRef idx="minor">
+                          <a:schemeClr val="tx1"/>
+                        </a:fontRef>
+                      </wps:style>
+                      <wps:bodyPr/>
+                    </wps:wsp>
+                  </a:graphicData>
+                </a:graphic>
+                <wp14:sizeRelH relativeFrom="margin">
+                  <wp14:pctWidth>0</wp14:pctWidth>
+                </wp14:sizeRelH>
+                <wp14:sizeRelV relativeFrom="margin">
+                  <wp14:pctHeight>0</wp14:pctHeight>
+                </wp14:sizeRelV>
+              </wp:anchor>
+            </w:drawing>
+          </mc:Choice>
+          <mc:Fallback>
+            <w:pict>
+              <v:shape w14:anchorId="54A5BB8F" id="Conector de Seta Reta 27" o:spid="_x0000_s1026" type="#_x0000_t32" style="position:absolute;margin-left:121.2pt;margin-top:26.7pt;width:23.25pt;height:20.25pt;flip:y;z-index:251670528;visibility:visible;mso-wrap-style:square;mso-width-percent:0;mso-height-percent:0;mso-wrap-distance-left:9pt;mso-wrap-distance-top:0;mso-wrap-distance-right:9pt;mso-wrap-distance-bottom:0;mso-position-horizontal:absolute;mso-position-horizontal-relative:text;mso-position-vertical:absolute;mso-position-vertical-relative:text;mso-width-percent:0;mso-height-percent:0;mso-width-relative:margin;mso-height-relative:margin" o:gfxdata="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" strokecolor="#4472c4 [3204]" strokeweight=".5pt">
+                <v:stroke endarrow="block" joinstyle="miter"/>
+              </v:shape>
+            </w:pict>
+          </mc:Fallback>
+        </mc:AlternateContent>
+      </w:r>
+      <w:r>
+        <w:rPr>
+          <w:noProof/>
+        </w:rPr>
+        <w:drawing>
+          <wp:inline distT="0" distB="0" distL="0" distR="0" wp14:anchorId="3B0CE11B" wp14:editId="323E17EF">
+            <wp:extent cx="2391109" cy="685896"/>
+            <wp:effectExtent l="0" t="0" r="0" b="0"/>
+            <wp:docPr id="26" name="Imagem 26"/>
+            <wp:cNvGraphicFramePr>
+              <a:graphicFrameLocks xmlns:a="http://schemas.openxmlformats.org/drawingml/2006/main" noChangeAspect="1"/>
+            </wp:cNvGraphicFramePr>
+            <a:graphic xmlns:a="http://schemas.openxmlformats.org/drawingml/2006/main">
+              <a:graphicData uri="http://schemas.openxmlformats.org/drawingml/2006/picture">
+                <pic:pic xmlns:pic="http://schemas.openxmlformats.org/drawingml/2006/picture">
+                  <pic:nvPicPr>
+                    <pic:cNvPr id="1" name=""/>
+                    <pic:cNvPicPr/>
+                  </pic:nvPicPr>
+                  <pic:blipFill>
+                    <a:blip r:embed="rId22"/>
+                    <a:stretch>
+                      <a:fillRect/>
+                    </a:stretch>
+                  </pic:blipFill>
+                  <pic:spPr>
+                    <a:xfrm>
+                      <a:off x="0" y="0"/>
+                      <a:ext cx="2391109" cy="685896"/>
+                    </a:xfrm>
+                    <a:prstGeom prst="rect">
+                      <a:avLst/>
+                    </a:prstGeom>
+                  </pic:spPr>
+                </pic:pic>
+              </a:graphicData>
+            </a:graphic>
+          </wp:inline>
+        </w:drawing>
+      </w:r>
+    </w:p>
+    <w:p>
+      <w:r>
+        <w:t xml:space="preserve">A segunda div sendo acima do </w:t>
+      </w:r>
+      <w:r>
+        <w:t>segundo título</w:t>
+      </w:r>
+      <w:r>
+        <w:t xml:space="preserve"> Benefícios e fechando embaixo da última lista não ordenada.</w:t>
+      </w:r>
+    </w:p>
+    <w:p>
+      <w:r>
+        <w:t>E deixamos com uma cor</w:t>
+      </w:r>
+      <w:r>
+        <w:t xml:space="preserve"> de fundo</w:t>
+      </w:r>
+      <w:r>
+        <w:t xml:space="preserve"> cinza claro.</w:t>
+      </w:r>
+    </w:p>
+    <w:p>
+      <w:r>
+        <w:rPr>
+          <w:noProof/>
+        </w:rPr>
+        <mc:AlternateContent>
+          <mc:Choice Requires="wps">
+            <w:drawing>
+              <wp:anchor distT="0" distB="0" distL="114300" distR="114300" simplePos="0" relativeHeight="251672576" behindDoc="0" locked="0" layoutInCell="1" allowOverlap="1">
+                <wp:simplePos x="0" y="0"/>
+                <wp:positionH relativeFrom="column">
+                  <wp:posOffset>81915</wp:posOffset>
+                </wp:positionH>
+                <wp:positionV relativeFrom="paragraph">
+                  <wp:posOffset>1002665</wp:posOffset>
+                </wp:positionV>
+                <wp:extent cx="171450" cy="171450"/>
+                <wp:effectExtent l="0" t="0" r="76200" b="57150"/>
+                <wp:wrapNone/>
+                <wp:docPr id="30" name="Conector de Seta Reta 30"/>
+                <wp:cNvGraphicFramePr/>
+                <a:graphic xmlns:a="http://schemas.openxmlformats.org/drawingml/2006/main">
+                  <a:graphicData uri="http://schemas.microsoft.com/office/word/2010/wordprocessingShape">
+                    <wps:wsp>
+                      <wps:cNvCnPr/>
+                      <wps:spPr>
+                        <a:xfrm>
+                          <a:off x="0" y="0"/>
+                          <a:ext cx="171450" cy="171450"/>
+                        </a:xfrm>
+                        <a:prstGeom prst="straightConnector1">
+                          <a:avLst/>
+                        </a:prstGeom>
+                        <a:ln>
+                          <a:tailEnd type="triangle"/>
+                        </a:ln>
+                      </wps:spPr>
+                      <wps:style>
+                        <a:lnRef idx="1">
+                          <a:schemeClr val="accent1"/>
+                        </a:lnRef>
+                        <a:fillRef idx="0">
+                          <a:schemeClr val="accent1"/>
+                        </a:fillRef>
+                        <a:effectRef idx="0">
+                          <a:schemeClr val="accent1"/>
+                        </a:effectRef>
+                        <a:fontRef idx="minor">
+                          <a:schemeClr val="tx1"/>
+                        </a:fontRef>
+                      </wps:style>
+                      <wps:bodyPr/>
+                    </wps:wsp>
+                  </a:graphicData>
+                </a:graphic>
+              </wp:anchor>
+            </w:drawing>
+          </mc:Choice>
+          <mc:Fallback>
+            <w:pict>
+              <v:shape w14:anchorId="26B70B07" id="Conector de Seta Reta 30" o:spid="_x0000_s1026" type="#_x0000_t32" style="position:absolute;margin-left:6.45pt;margin-top:78.95pt;width:13.5pt;height:13.5pt;z-index:251672576;visibility:visible;mso-wrap-style:square;mso-wrap-distance-left:9pt;mso-wrap-distance-top:0;mso-wrap-distance-right:9pt;mso-wrap-distance-bottom:0;mso-position-horizontal:absolute;mso-position-horizontal-relative:text;mso-position-vertical:absolute;mso-position-vertical-relative:text" o:gfxdata="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" strokecolor="#4472c4 [3204]" strokeweight=".5pt">
+                <v:stroke endarrow="block" joinstyle="miter"/>
+              </v:shape>
+            </w:pict>
+          </mc:Fallback>
+        </mc:AlternateContent>
+      </w:r>
+      <w:r>
+        <w:rPr>
+          <w:noProof/>
+        </w:rPr>
+        <mc:AlternateContent>
+          <mc:Choice Requires="wps">
+            <w:drawing>
+              <wp:anchor distT="0" distB="0" distL="114300" distR="114300" simplePos="0" relativeHeight="251671552" behindDoc="0" locked="0" layoutInCell="1" allowOverlap="1">
+                <wp:simplePos x="0" y="0"/>
+                <wp:positionH relativeFrom="column">
+                  <wp:posOffset>53340</wp:posOffset>
+                </wp:positionH>
+                <wp:positionV relativeFrom="paragraph">
+                  <wp:posOffset>193040</wp:posOffset>
+                </wp:positionV>
+                <wp:extent cx="247650" cy="209550"/>
+                <wp:effectExtent l="0" t="38100" r="57150" b="19050"/>
+                <wp:wrapNone/>
+                <wp:docPr id="29" name="Conector de Seta Reta 29"/>
+                <wp:cNvGraphicFramePr/>
+                <a:graphic xmlns:a="http://schemas.openxmlformats.org/drawingml/2006/main">
+                  <a:graphicData uri="http://schemas.microsoft.com/office/word/2010/wordprocessingShape">
+                    <wps:wsp>
+                      <wps:cNvCnPr/>
+                      <wps:spPr>
+                        <a:xfrm flipV="1">
+                          <a:off x="0" y="0"/>
+                          <a:ext cx="247650" cy="209550"/>
+                        </a:xfrm>
+                        <a:prstGeom prst="straightConnector1">
+                          <a:avLst/>
+                        </a:prstGeom>
+                        <a:ln>
+                          <a:tailEnd type="triangle"/>
+                        </a:ln>
+                      </wps:spPr>
+                      <wps:style>
+                        <a:lnRef idx="1">
+                          <a:schemeClr val="accent1"/>
+                        </a:lnRef>
+                        <a:fillRef idx="0">
+                          <a:schemeClr val="accent1"/>
+                        </a:fillRef>
+                        <a:effectRef idx="0">
+                          <a:schemeClr val="accent1"/>
+                        </a:effectRef>
+                        <a:fontRef idx="minor">
+                          <a:schemeClr val="tx1"/>
+                        </a:fontRef>
+                      </wps:style>
+                      <wps:bodyPr/>
+                    </wps:wsp>
+                  </a:graphicData>
+                </a:graphic>
+              </wp:anchor>
+            </w:drawing>
+          </mc:Choice>
+          <mc:Fallback>
+            <w:pict>
+              <v:shape w14:anchorId="5429EF0E" id="Conector de Seta Reta 29" o:spid="_x0000_s1026" type="#_x0000_t32" style="position:absolute;margin-left:4.2pt;margin-top:15.2pt;width:19.5pt;height:16.5pt;flip:y;z-index:251671552;visibility:visible;mso-wrap-style:square;mso-wrap-distance-left:9pt;mso-wrap-distance-top:0;mso-wrap-distance-right:9pt;mso-wrap-distance-bottom:0;mso-position-horizontal:absolute;mso-position-horizontal-relative:text;mso-position-vertical:absolute;mso-position-vertical-relative:text" o:gfxdata="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" strokecolor="#4472c4 [3204]" strokeweight=".5pt">
+                <v:stroke endarrow="block" joinstyle="miter"/>
+              </v:shape>
+            </w:pict>
+          </mc:Fallback>
+        </mc:AlternateContent>
+      </w:r>
+      <w:r>
+        <w:rPr>
+          <w:noProof/>
+        </w:rPr>
+        <w:drawing>
+          <wp:inline distT="0" distB="0" distL="0" distR="0" wp14:anchorId="0AC34364" wp14:editId="2706B503">
+            <wp:extent cx="4286848" cy="1448002"/>
+            <wp:effectExtent l="0" t="0" r="0" b="0"/>
+            <wp:docPr id="28" name="Imagem 28"/>
+            <wp:cNvGraphicFramePr>
+              <a:graphicFrameLocks xmlns:a="http://schemas.openxmlformats.org/drawingml/2006/main" noChangeAspect="1"/>
+            </wp:cNvGraphicFramePr>
+            <a:graphic xmlns:a="http://schemas.openxmlformats.org/drawingml/2006/main">
+              <a:graphicData uri="http://schemas.openxmlformats.org/drawingml/2006/picture">
+                <pic:pic xmlns:pic="http://schemas.openxmlformats.org/drawingml/2006/picture">
+                  <pic:nvPicPr>
+                    <pic:cNvPr id="1" name=""/>
+                    <pic:cNvPicPr/>
+                  </pic:nvPicPr>
+                  <pic:blipFill>
+                    <a:blip r:embed="rId23"/>
+                    <a:stretch>
+                      <a:fillRect/>
+                    </a:stretch>
+                  </pic:blipFill>
+                  <pic:spPr>
+                    <a:xfrm>
+                      <a:off x="0" y="0"/>
+                      <a:ext cx="4286848" cy="1448002"/>
+                    </a:xfrm>
+                    <a:prstGeom prst="rect">
+                      <a:avLst/>
+                    </a:prstGeom>
+                  </pic:spPr>
+                </pic:pic>
+              </a:graphicData>
+            </a:graphic>
+          </wp:inline>
+        </w:drawing>
+      </w:r>
+    </w:p>
+    <w:p>
+      <w:r>
+        <w:rPr>
+          <w:noProof/>
+        </w:rPr>
+        <mc:AlternateContent>
+          <mc:Choice Requires="wps">
+            <w:drawing>
+              <wp:anchor distT="0" distB="0" distL="114300" distR="114300" simplePos="0" relativeHeight="251673600" behindDoc="0" locked="0" layoutInCell="1" allowOverlap="1">
+                <wp:simplePos x="0" y="0"/>
+                <wp:positionH relativeFrom="column">
+                  <wp:posOffset>1463040</wp:posOffset>
+                </wp:positionH>
+                <wp:positionV relativeFrom="paragraph">
+                  <wp:posOffset>325755</wp:posOffset>
+                </wp:positionV>
+                <wp:extent cx="438150" cy="161925"/>
+                <wp:effectExtent l="0" t="38100" r="57150" b="28575"/>
+                <wp:wrapNone/>
+                <wp:docPr id="32" name="Conector de Seta Reta 32"/>
+                <wp:cNvGraphicFramePr/>
+                <a:graphic xmlns:a="http://schemas.openxmlformats.org/drawingml/2006/main">
+                  <a:graphicData uri="http://schemas.microsoft.com/office/word/2010/wordprocessingShape">
+                    <wps:wsp>
+                      <wps:cNvCnPr/>
+                      <wps:spPr>
+                        <a:xfrm flipV="1">
+                          <a:off x="0" y="0"/>
+                          <a:ext cx="438150" cy="161925"/>
+                        </a:xfrm>
+                        <a:prstGeom prst="straightConnector1">
+                          <a:avLst/>
+                        </a:prstGeom>
+                        <a:ln>
+                          <a:tailEnd type="triangle"/>
+                        </a:ln>
+                      </wps:spPr>
+                      <wps:style>
+                        <a:lnRef idx="1">
+                          <a:schemeClr val="accent1"/>
+                        </a:lnRef>
+                        <a:fillRef idx="0">
+                          <a:schemeClr val="accent1"/>
+                        </a:fillRef>
+                        <a:effectRef idx="0">
+                          <a:schemeClr val="accent1"/>
+                        </a:effectRef>
+                        <a:fontRef idx="minor">
+                          <a:schemeClr val="tx1"/>
+                        </a:fontRef>
+                      </wps:style>
+                      <wps:bodyPr/>
+                    </wps:wsp>
+                  </a:graphicData>
+                </a:graphic>
+                <wp14:sizeRelH relativeFrom="margin">
+                  <wp14:pctWidth>0</wp14:pctWidth>
+                </wp14:sizeRelH>
+                <wp14:sizeRelV relativeFrom="margin">
+                  <wp14:pctHeight>0</wp14:pctHeight>
+                </wp14:sizeRelV>
+              </wp:anchor>
+            </w:drawing>
+          </mc:Choice>
+          <mc:Fallback>
+            <w:pict>
+              <v:shape w14:anchorId="208DBACE" id="Conector de Seta Reta 32" o:spid="_x0000_s1026" type="#_x0000_t32" style="position:absolute;margin-left:115.2pt;margin-top:25.65pt;width:34.5pt;height:12.75pt;flip:y;z-index:251673600;visibility:visible;mso-wrap-style:square;mso-width-percent:0;mso-height-percent:0;mso-wrap-distance-left:9pt;mso-wrap-distance-top:0;mso-wrap-distance-right:9pt;mso-wrap-distance-bottom:0;mso-position-horizontal:absolute;mso-position-horizontal-relative:text;mso-position-vertical:absolute;mso-position-vertical-relative:text;mso-width-percent:0;mso-height-percent:0;mso-width-relative:margin;mso-height-relative:margin" o:gfxdata="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" strokecolor="#4472c4 [3204]" strokeweight=".5pt">
+                <v:stroke endarrow="block" joinstyle="miter"/>
+              </v:shape>
+            </w:pict>
+          </mc:Fallback>
+        </mc:AlternateContent>
+      </w:r>
+      <w:r>
+        <w:rPr>
+          <w:noProof/>
+        </w:rPr>
+        <w:drawing>
+          <wp:inline distT="0" distB="0" distL="0" distR="0" wp14:anchorId="641D0FFE" wp14:editId="2A63AB29">
+            <wp:extent cx="2391109" cy="533474"/>
+            <wp:effectExtent l="0" t="0" r="9525" b="0"/>
+            <wp:docPr id="31" name="Imagem 31"/>
+            <wp:cNvGraphicFramePr>
+              <a:graphicFrameLocks xmlns:a="http://schemas.openxmlformats.org/drawingml/2006/main" noChangeAspect="1"/>
+            </wp:cNvGraphicFramePr>
+            <a:graphic xmlns:a="http://schemas.openxmlformats.org/drawingml/2006/main">
+              <a:graphicData uri="http://schemas.openxmlformats.org/drawingml/2006/picture">
+                <pic:pic xmlns:pic="http://schemas.openxmlformats.org/drawingml/2006/picture">
+                  <pic:nvPicPr>
+                    <pic:cNvPr id="1" name=""/>
+                    <pic:cNvPicPr/>
+                  </pic:nvPicPr>
+                  <pic:blipFill>
+                    <a:blip r:embed="rId24"/>
+                    <a:stretch>
+                      <a:fillRect/>
+                    </a:stretch>
+                  </pic:blipFill>
+                  <pic:spPr>
+                    <a:xfrm>
+                      <a:off x="0" y="0"/>
+                      <a:ext cx="2391109" cy="533474"/>
+                    </a:xfrm>
+                    <a:prstGeom prst="rect">
+                      <a:avLst/>
+                    </a:prstGeom>
+                  </pic:spPr>
+                </pic:pic>
+              </a:graphicData>
+            </a:graphic>
+          </wp:inline>
+        </w:drawing>
+      </w:r>
+    </w:p>
+    <w:p>
+      <w:r>
+        <w:t xml:space="preserve">12 </w:t>
+      </w:r>
+      <w:r>
+        <w:t>–</w:t>
+      </w:r>
+      <w:r>
+        <w:t xml:space="preserve"> </w:t>
+      </w:r>
+      <w:r>
+        <w:t>Adicionamos uma imagem na div benefícios e reduzimos o tamanho da imagem através do css utilizando width:</w:t>
+      </w:r>
+      <w:r>
+        <w:rPr>
+          <w:noProof/>
+        </w:rPr>
+        <w:drawing>
+          <wp:inline distT="0" distB="0" distL="0" distR="0" wp14:anchorId="61C3CA76" wp14:editId="0B9E4CC5">
+            <wp:extent cx="5400040" cy="123825"/>
+            <wp:effectExtent l="0" t="0" r="0" b="9525"/>
+            <wp:docPr id="33" name="Imagem 33"/>
+            <wp:cNvGraphicFramePr>
+              <a:graphicFrameLocks xmlns:a="http://schemas.openxmlformats.org/drawingml/2006/main" noChangeAspect="1"/>
+            </wp:cNvGraphicFramePr>
+            <a:graphic xmlns:a="http://schemas.openxmlformats.org/drawingml/2006/main">
+              <a:graphicData uri="http://schemas.openxmlformats.org/drawingml/2006/picture">
+                <pic:pic xmlns:pic="http://schemas.openxmlformats.org/drawingml/2006/picture">
+                  <pic:nvPicPr>
+                    <pic:cNvPr id="1" name=""/>
+                    <pic:cNvPicPr/>
+                  </pic:nvPicPr>
+                  <pic:blipFill>
+                    <a:blip r:embed="rId25"/>
+                    <a:stretch>
+                      <a:fillRect/>
+                    </a:stretch>
+                  </pic:blipFill>
+                  <pic:spPr>
+                    <a:xfrm>
+                      <a:off x="0" y="0"/>
+                      <a:ext cx="5400040" cy="123825"/>
+                    </a:xfrm>
+                    <a:prstGeom prst="rect">
+                      <a:avLst/>
+                    </a:prstGeom>
+                  </pic:spPr>
+                </pic:pic>
+              </a:graphicData>
+            </a:graphic>
+          </wp:inline>
+        </w:drawing>
+      </w:r>
+    </w:p>
+    <w:p>
+      <w:r>
+        <w:rPr>
+          <w:noProof/>
+        </w:rPr>
+        <w:drawing>
+          <wp:inline distT="0" distB="0" distL="0" distR="0" wp14:anchorId="49430DA0" wp14:editId="288D0C9E">
+            <wp:extent cx="1543265" cy="571580"/>
+            <wp:effectExtent l="0" t="0" r="0" b="0"/>
+            <wp:docPr id="36" name="Imagem 36"/>
+            <wp:cNvGraphicFramePr>
+              <a:graphicFrameLocks xmlns:a="http://schemas.openxmlformats.org/drawingml/2006/main" noChangeAspect="1"/>
+            </wp:cNvGraphicFramePr>
+            <a:graphic xmlns:a="http://schemas.openxmlformats.org/drawingml/2006/main">
+              <a:graphicData uri="http://schemas.openxmlformats.org/drawingml/2006/picture">
+                <pic:pic xmlns:pic="http://schemas.openxmlformats.org/drawingml/2006/picture">
+                  <pic:nvPicPr>
+                    <pic:cNvPr id="1" name=""/>
+                    <pic:cNvPicPr/>
+                  </pic:nvPicPr>
+                  <pic:blipFill>
+                    <a:blip r:embed="rId26"/>
+                    <a:stretch>
+                      <a:fillRect/>
+                    </a:stretch>
+                  </pic:blipFill>
+                  <pic:spPr>
+                    <a:xfrm>
+                      <a:off x="0" y="0"/>
+                      <a:ext cx="1543265" cy="571580"/>
+                    </a:xfrm>
+                    <a:prstGeom prst="rect">
+                      <a:avLst/>
+                    </a:prstGeom>
+                  </pic:spPr>
+                </pic:pic>
+              </a:graphicData>
+            </a:graphic>
+          </wp:inline>
+        </w:drawing>
+      </w:r>
+    </w:p>
+    <w:p/>
+    <w:p/>
+    <w:p/>
+    <w:p>
+      <w:r>
+        <w:lastRenderedPageBreak/>
+        <w:t>13 – Para colocar a lista ao lado da imagem mudamos a natureza da lista utilizando display: inline-block conforme imagem abaixo.</w:t>
+      </w:r>
+    </w:p>
+    <w:p>
+      <w:r>
+        <w:rPr>
+          <w:noProof/>
+        </w:rPr>
+        <w:drawing>
+          <wp:inline distT="0" distB="0" distL="0" distR="0" wp14:anchorId="653FF239" wp14:editId="613C5357">
+            <wp:extent cx="1952898" cy="523948"/>
+            <wp:effectExtent l="0" t="0" r="9525" b="9525"/>
+            <wp:docPr id="34" name="Imagem 34"/>
+            <wp:cNvGraphicFramePr>
+              <a:graphicFrameLocks xmlns:a="http://schemas.openxmlformats.org/drawingml/2006/main" noChangeAspect="1"/>
+            </wp:cNvGraphicFramePr>
+            <a:graphic xmlns:a="http://schemas.openxmlformats.org/drawingml/2006/main">
+              <a:graphicData uri="http://schemas.openxmlformats.org/drawingml/2006/picture">
+                <pic:pic xmlns:pic="http://schemas.openxmlformats.org/drawingml/2006/picture">
+                  <pic:nvPicPr>
+                    <pic:cNvPr id="1" name=""/>
+                    <pic:cNvPicPr/>
+                  </pic:nvPicPr>
+                  <pic:blipFill>
+                    <a:blip r:embed="rId27"/>
+                    <a:stretch>
+                      <a:fillRect/>
+                    </a:stretch>
+                  </pic:blipFill>
+                  <pic:spPr>
+                    <a:xfrm>
+                      <a:off x="0" y="0"/>
+                      <a:ext cx="1952898" cy="523948"/>
+                    </a:xfrm>
+                    <a:prstGeom prst="rect">
+                      <a:avLst/>
+                    </a:prstGeom>
+                  </pic:spPr>
+                </pic:pic>
+              </a:graphicData>
+            </a:graphic>
+          </wp:inline>
+        </w:drawing>
+      </w:r>
+    </w:p>
+    <w:p>
+      <w:r>
+        <w:rPr>
+          <w:noProof/>
+        </w:rPr>
+        <w:drawing>
+          <wp:inline distT="0" distB="0" distL="0" distR="0" wp14:anchorId="56AEB579" wp14:editId="0774C1D2">
+            <wp:extent cx="5400040" cy="2777490"/>
+            <wp:effectExtent l="0" t="0" r="0" b="3810"/>
+            <wp:docPr id="37" name="Imagem 37"/>
+            <wp:cNvGraphicFramePr>
+              <a:graphicFrameLocks xmlns:a="http://schemas.openxmlformats.org/drawingml/2006/main" noChangeAspect="1"/>
+            </wp:cNvGraphicFramePr>
+            <a:graphic xmlns:a="http://schemas.openxmlformats.org/drawingml/2006/main">
+              <a:graphicData uri="http://schemas.openxmlformats.org/drawingml/2006/picture">
+                <pic:pic xmlns:pic="http://schemas.openxmlformats.org/drawingml/2006/picture">
+                  <pic:nvPicPr>
+                    <pic:cNvPr id="1" name=""/>
+                    <pic:cNvPicPr/>
+                  </pic:nvPicPr>
+                  <pic:blipFill>
+                    <a:blip r:embed="rId28"/>
+                    <a:stretch>
+                      <a:fillRect/>
+                    </a:stretch>
+                  </pic:blipFill>
+                  <pic:spPr>
+                    <a:xfrm>
+                      <a:off x="0" y="0"/>
+                      <a:ext cx="5400040" cy="2777490"/>
+                    </a:xfrm>
+                    <a:prstGeom prst="rect">
+                      <a:avLst/>
+                    </a:prstGeom>
+                  </pic:spPr>
+                </pic:pic>
+              </a:graphicData>
+            </a:graphic>
+          </wp:inline>
+        </w:drawing>
+      </w:r>
+    </w:p>
+    <w:p>
+      <w:r>
+        <w:t>14 – Para alinhar a lista ao top da imagem utilizamos o seguinte comando:</w:t>
+      </w:r>
+    </w:p>
+    <w:p>
+      <w:r>
+        <w:rPr>
+          <w:noProof/>
+        </w:rPr>
+        <mc:AlternateContent>
+          <mc:Choice Requires="wps">
+            <w:drawing>
+              <wp:anchor distT="0" distB="0" distL="114300" distR="114300" simplePos="0" relativeHeight="251674624" behindDoc="0" locked="0" layoutInCell="1" allowOverlap="1">
+                <wp:simplePos x="0" y="0"/>
+                <wp:positionH relativeFrom="column">
+                  <wp:posOffset>1396365</wp:posOffset>
+                </wp:positionH>
+                <wp:positionV relativeFrom="paragraph">
+                  <wp:posOffset>581660</wp:posOffset>
+                </wp:positionV>
+                <wp:extent cx="581025" cy="171450"/>
+                <wp:effectExtent l="38100" t="38100" r="28575" b="19050"/>
+                <wp:wrapNone/>
+                <wp:docPr id="41" name="Conector de Seta Reta 41"/>
+                <wp:cNvGraphicFramePr/>
+                <a:graphic xmlns:a="http://schemas.openxmlformats.org/drawingml/2006/main">
+                  <a:graphicData uri="http://schemas.microsoft.com/office/word/2010/wordprocessingShape">
+                    <wps:wsp>
+                      <wps:cNvCnPr/>
+                      <wps:spPr>
+                        <a:xfrm flipH="1" flipV="1">
+                          <a:off x="0" y="0"/>
+                          <a:ext cx="581025" cy="171450"/>
+                        </a:xfrm>
+                        <a:prstGeom prst="straightConnector1">
+                          <a:avLst/>
+                        </a:prstGeom>
+                        <a:ln>
+                          <a:tailEnd type="triangle"/>
+                        </a:ln>
+                      </wps:spPr>
+                      <wps:style>
+                        <a:lnRef idx="1">
+                          <a:schemeClr val="accent1"/>
+                        </a:lnRef>
+                        <a:fillRef idx="0">
+                          <a:schemeClr val="accent1"/>
+                        </a:fillRef>
+                        <a:effectRef idx="0">
+                          <a:schemeClr val="accent1"/>
+                        </a:effectRef>
+                        <a:fontRef idx="minor">
+                          <a:schemeClr val="tx1"/>
+                        </a:fontRef>
+                      </wps:style>
+                      <wps:bodyPr/>
+                    </wps:wsp>
+                  </a:graphicData>
+                </a:graphic>
+              </wp:anchor>
+            </w:drawing>
+          </mc:Choice>
+          <mc:Fallback>
+            <w:pict>
+              <v:shape w14:anchorId="21221D68" id="Conector de Seta Reta 41" o:spid="_x0000_s1026" type="#_x0000_t32" style="position:absolute;margin-left:109.95pt;margin-top:45.8pt;width:45.75pt;height:13.5pt;flip:x y;z-index:251674624;visibility:visible;mso-wrap-style:square;mso-wrap-distance-left:9pt;mso-wrap-distance-top:0;mso-wrap-distance-right:9pt;mso-wrap-distance-bottom:0;mso-position-horizontal:absolute;mso-position-horizontal-relative:text;mso-position-vertical:absolute;mso-position-vertical-relative:text" o:gfxdata="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" strokecolor="#4472c4 [3204]" strokeweight=".5pt">
+                <v:stroke endarrow="block" joinstyle="miter"/>
+              </v:shape>
+            </w:pict>
+          </mc:Fallback>
+        </mc:AlternateContent>
+      </w:r>
+      <w:r>
+        <w:rPr>
+          <w:noProof/>
+        </w:rPr>
+        <w:drawing>
+          <wp:inline distT="0" distB="0" distL="0" distR="0" wp14:anchorId="494AE98F" wp14:editId="2F325F51">
+            <wp:extent cx="2095792" cy="809738"/>
+            <wp:effectExtent l="0" t="0" r="0" b="9525"/>
+            <wp:docPr id="40" name="Imagem 40"/>
+            <wp:cNvGraphicFramePr>
+              <a:graphicFrameLocks xmlns:a="http://schemas.openxmlformats.org/drawingml/2006/main" noChangeAspect="1"/>
+            </wp:cNvGraphicFramePr>
+            <a:graphic xmlns:a="http://schemas.openxmlformats.org/drawingml/2006/main">
+              <a:graphicData uri="http://schemas.openxmlformats.org/drawingml/2006/picture">
+                <pic:pic xmlns:pic="http://schemas.openxmlformats.org/drawingml/2006/picture">
+                  <pic:nvPicPr>
+                    <pic:cNvPr id="1" name=""/>
+                    <pic:cNvPicPr/>
+                  </pic:nvPicPr>
+                  <pic:blipFill>
+                    <a:blip r:embed="rId29"/>
+                    <a:stretch>
+                      <a:fillRect/>
+                    </a:stretch>
+                  </pic:blipFill>
+                  <pic:spPr>
+                    <a:xfrm>
+                      <a:off x="0" y="0"/>
+                      <a:ext cx="2095792" cy="809738"/>
+                    </a:xfrm>
+                    <a:prstGeom prst="rect">
+                      <a:avLst/>
+                    </a:prstGeom>
+                  </pic:spPr>
+                </pic:pic>
+              </a:graphicData>
+            </a:graphic>
+          </wp:inline>
+        </w:drawing>
+      </w:r>
+    </w:p>
+    <w:p>
+      <w:r>
+        <w:rPr>
+          <w:noProof/>
+        </w:rPr>
+        <w:drawing>
+          <wp:inline distT="0" distB="0" distL="0" distR="0" wp14:anchorId="4C32BA12" wp14:editId="17480086">
+            <wp:extent cx="5400040" cy="2977515"/>
+            <wp:effectExtent l="0" t="0" r="0" b="0"/>
+            <wp:docPr id="42" name="Imagem 42"/>
+            <wp:cNvGraphicFramePr>
+              <a:graphicFrameLocks xmlns:a="http://schemas.openxmlformats.org/drawingml/2006/main" noChangeAspect="1"/>
+            </wp:cNvGraphicFramePr>
+            <a:graphic xmlns:a="http://schemas.openxmlformats.org/drawingml/2006/main">
+              <a:graphicData uri="http://schemas.openxmlformats.org/drawingml/2006/picture">
+                <pic:pic xmlns:pic="http://schemas.openxmlformats.org/drawingml/2006/picture">
+                  <pic:nvPicPr>
+                    <pic:cNvPr id="1" name=""/>
+                    <pic:cNvPicPr/>
+                  </pic:nvPicPr>
+                  <pic:blipFill>
+                    <a:blip r:embed="rId30"/>
+                    <a:stretch>
+                      <a:fillRect/>
+                    </a:stretch>
+                  </pic:blipFill>
+                  <pic:spPr>
+                    <a:xfrm>
+                      <a:off x="0" y="0"/>
+                      <a:ext cx="5400040" cy="2977515"/>
+                    </a:xfrm>
+                    <a:prstGeom prst="rect">
+                      <a:avLst/>
+                    </a:prstGeom>
+                  </pic:spPr>
+                </pic:pic>
+              </a:graphicData>
+            </a:graphic>
+          </wp:inline>
+        </w:drawing>
+      </w:r>
+    </w:p>
+    <w:p/>
+    <w:p>
+      <w:r>
+        <w:lastRenderedPageBreak/>
+        <w:t xml:space="preserve">15 </w:t>
+      </w:r>
+      <w:r>
+        <w:t>–</w:t>
+      </w:r>
+      <w:r>
+        <w:t xml:space="preserve"> </w:t>
+      </w:r>
+      <w:r>
+        <w:t>Ainda trabalhando com a lista definimos um tamanho para que ela ocupe 20% de largura e colocamos um espaço externo do lado direito de 15% os seguintes resultados:</w:t>
+      </w:r>
+    </w:p>
+    <w:p>
+      <w:r>
+        <w:rPr>
+          <w:noProof/>
+        </w:rPr>
+        <mc:AlternateContent>
+          <mc:Choice Requires="wps">
+            <w:drawing>
+              <wp:anchor distT="0" distB="0" distL="114300" distR="114300" simplePos="0" relativeHeight="251676672" behindDoc="0" locked="0" layoutInCell="1" allowOverlap="1">
+                <wp:simplePos x="0" y="0"/>
+                <wp:positionH relativeFrom="column">
+                  <wp:posOffset>1148715</wp:posOffset>
+                </wp:positionH>
+                <wp:positionV relativeFrom="paragraph">
+                  <wp:posOffset>868680</wp:posOffset>
+                </wp:positionV>
+                <wp:extent cx="733425" cy="95250"/>
+                <wp:effectExtent l="0" t="57150" r="28575" b="19050"/>
+                <wp:wrapNone/>
+                <wp:docPr id="45" name="Conector de Seta Reta 45"/>
+                <wp:cNvGraphicFramePr/>
+                <a:graphic xmlns:a="http://schemas.openxmlformats.org/drawingml/2006/main">
+                  <a:graphicData uri="http://schemas.microsoft.com/office/word/2010/wordprocessingShape">
+                    <wps:wsp>
+                      <wps:cNvCnPr/>
+                      <wps:spPr>
+                        <a:xfrm flipH="1" flipV="1">
+                          <a:off x="0" y="0"/>
+                          <a:ext cx="733425" cy="95250"/>
+                        </a:xfrm>
+                        <a:prstGeom prst="straightConnector1">
+                          <a:avLst/>
+                        </a:prstGeom>
+                        <a:ln>
+                          <a:tailEnd type="triangle"/>
+                        </a:ln>
+                      </wps:spPr>
+                      <wps:style>
+                        <a:lnRef idx="1">
+                          <a:schemeClr val="accent1"/>
+                        </a:lnRef>
+                        <a:fillRef idx="0">
+                          <a:schemeClr val="accent1"/>
+                        </a:fillRef>
+                        <a:effectRef idx="0">
+                          <a:schemeClr val="accent1"/>
+                        </a:effectRef>
+                        <a:fontRef idx="minor">
+                          <a:schemeClr val="tx1"/>
+                        </a:fontRef>
+                      </wps:style>
+                      <wps:bodyPr/>
+                    </wps:wsp>
+                  </a:graphicData>
+                </a:graphic>
+              </wp:anchor>
+            </w:drawing>
+          </mc:Choice>
+          <mc:Fallback>
+            <w:pict>
+              <v:shape w14:anchorId="2233BA4A" id="Conector de Seta Reta 45" o:spid="_x0000_s1026" type="#_x0000_t32" style="position:absolute;margin-left:90.45pt;margin-top:68.4pt;width:57.75pt;height:7.5pt;flip:x y;z-index:251676672;visibility:visible;mso-wrap-style:square;mso-wrap-distance-left:9pt;mso-wrap-distance-top:0;mso-wrap-distance-right:9pt;mso-wrap-distance-bottom:0;mso-position-horizontal:absolute;mso-position-horizontal-relative:text;mso-position-vertical:absolute;mso-position-vertical-relative:text" o:gfxdata="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" strokecolor="#4472c4 [3204]" strokeweight=".5pt">
+                <v:stroke endarrow="block" joinstyle="miter"/>
+              </v:shape>
+            </w:pict>
+          </mc:Fallback>
+        </mc:AlternateContent>
+      </w:r>
+      <w:r>
+        <w:rPr>
+          <w:noProof/>
+        </w:rPr>
+        <mc:AlternateContent>
+          <mc:Choice Requires="wps">
+            <w:drawing>
+              <wp:anchor distT="0" distB="0" distL="114300" distR="114300" simplePos="0" relativeHeight="251675648" behindDoc="0" locked="0" layoutInCell="1" allowOverlap="1">
+                <wp:simplePos x="0" y="0"/>
+                <wp:positionH relativeFrom="column">
+                  <wp:posOffset>1177290</wp:posOffset>
+                </wp:positionH>
+                <wp:positionV relativeFrom="paragraph">
+                  <wp:posOffset>97155</wp:posOffset>
+                </wp:positionV>
+                <wp:extent cx="723900" cy="495300"/>
+                <wp:effectExtent l="38100" t="0" r="19050" b="57150"/>
+                <wp:wrapNone/>
+                <wp:docPr id="44" name="Conector de Seta Reta 44"/>
+                <wp:cNvGraphicFramePr/>
+                <a:graphic xmlns:a="http://schemas.openxmlformats.org/drawingml/2006/main">
+                  <a:graphicData uri="http://schemas.microsoft.com/office/word/2010/wordprocessingShape">
+                    <wps:wsp>
+                      <wps:cNvCnPr/>
+                      <wps:spPr>
+                        <a:xfrm flipH="1">
+                          <a:off x="0" y="0"/>
+                          <a:ext cx="723900" cy="495300"/>
+                        </a:xfrm>
+                        <a:prstGeom prst="straightConnector1">
+                          <a:avLst/>
+                        </a:prstGeom>
+                        <a:ln>
+                          <a:tailEnd type="triangle"/>
+                        </a:ln>
+                      </wps:spPr>
+                      <wps:style>
+                        <a:lnRef idx="1">
+                          <a:schemeClr val="accent1"/>
+                        </a:lnRef>
+                        <a:fillRef idx="0">
+                          <a:schemeClr val="accent1"/>
+                        </a:fillRef>
+                        <a:effectRef idx="0">
+                          <a:schemeClr val="accent1"/>
+                        </a:effectRef>
+                        <a:fontRef idx="minor">
+                          <a:schemeClr val="tx1"/>
+                        </a:fontRef>
+                      </wps:style>
+                      <wps:bodyPr/>
+                    </wps:wsp>
+                  </a:graphicData>
+                </a:graphic>
+              </wp:anchor>
+            </w:drawing>
+          </mc:Choice>
+          <mc:Fallback>
+            <w:pict>
+              <v:shape w14:anchorId="0A64A33D" id="Conector de Seta Reta 44" o:spid="_x0000_s1026" type="#_x0000_t32" style="position:absolute;margin-left:92.7pt;margin-top:7.65pt;width:57pt;height:39pt;flip:x;z-index:251675648;visibility:visible;mso-wrap-style:square;mso-wrap-distance-left:9pt;mso-wrap-distance-top:0;mso-wrap-distance-right:9pt;mso-wrap-distance-bottom:0;mso-position-horizontal:absolute;mso-position-horizontal-relative:text;mso-position-vertical:absolute;mso-position-vertical-relative:text" o:gfxdata="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" strokecolor="#4472c4 [3204]" strokeweight=".5pt">
+                <v:stroke endarrow="block" joinstyle="miter"/>
+              </v:shape>
+            </w:pict>
+          </mc:Fallback>
+        </mc:AlternateContent>
+      </w:r>
+      <w:r>
+        <w:rPr>
+          <w:noProof/>
+        </w:rPr>
+        <w:drawing>
+          <wp:inline distT="0" distB="0" distL="0" distR="0" wp14:anchorId="36C3CFD7" wp14:editId="34C290C1">
+            <wp:extent cx="1991003" cy="1047896"/>
+            <wp:effectExtent l="0" t="0" r="9525" b="0"/>
+            <wp:docPr id="43" name="Imagem 43"/>
+            <wp:cNvGraphicFramePr>
+              <a:graphicFrameLocks xmlns:a="http://schemas.openxmlformats.org/drawingml/2006/main" noChangeAspect="1"/>
+            </wp:cNvGraphicFramePr>
+            <a:graphic xmlns:a="http://schemas.openxmlformats.org/drawingml/2006/main">
+              <a:graphicData uri="http://schemas.openxmlformats.org/drawingml/2006/picture">
+                <pic:pic xmlns:pic="http://schemas.openxmlformats.org/drawingml/2006/picture">
+                  <pic:nvPicPr>
+                    <pic:cNvPr id="1" name=""/>
+                    <pic:cNvPicPr/>
+                  </pic:nvPicPr>
+                  <pic:blipFill>
+                    <a:blip r:embed="rId31"/>
+                    <a:stretch>
+                      <a:fillRect/>
+                    </a:stretch>
+                  </pic:blipFill>
+                  <pic:spPr>
+                    <a:xfrm>
+                      <a:off x="0" y="0"/>
+                      <a:ext cx="1991003" cy="1047896"/>
+                    </a:xfrm>
+                    <a:prstGeom prst="rect">
+                      <a:avLst/>
+                    </a:prstGeom>
+                  </pic:spPr>
+                </pic:pic>
+              </a:graphicData>
+            </a:graphic>
+          </wp:inline>
+        </w:drawing>
+      </w:r>
+    </w:p>
+    <w:p>
+      <w:r>
+        <w:rPr>
+          <w:noProof/>
+        </w:rPr>
+        <w:drawing>
+          <wp:inline distT="0" distB="0" distL="0" distR="0" wp14:anchorId="69A358C1" wp14:editId="0D213FA8">
+            <wp:extent cx="5400040" cy="2016760"/>
+            <wp:effectExtent l="0" t="0" r="0" b="2540"/>
+            <wp:docPr id="46" name="Imagem 46"/>
+            <wp:cNvGraphicFramePr>
+              <a:graphicFrameLocks xmlns:a="http://schemas.openxmlformats.org/drawingml/2006/main" noChangeAspect="1"/>
+            </wp:cNvGraphicFramePr>
+            <a:graphic xmlns:a="http://schemas.openxmlformats.org/drawingml/2006/main">
+              <a:graphicData uri="http://schemas.openxmlformats.org/drawingml/2006/picture">
+                <pic:pic xmlns:pic="http://schemas.openxmlformats.org/drawingml/2006/picture">
+                  <pic:nvPicPr>
+                    <pic:cNvPr id="1" name=""/>
+                    <pic:cNvPicPr/>
+                  </pic:nvPicPr>
+                  <pic:blipFill>
+                    <a:blip r:embed="rId32"/>
+                    <a:stretch>
+                      <a:fillRect/>
+                    </a:stretch>
+                  </pic:blipFill>
+                  <pic:spPr>
+                    <a:xfrm>
+                      <a:off x="0" y="0"/>
+                      <a:ext cx="5400040" cy="2016760"/>
+                    </a:xfrm>
+                    <a:prstGeom prst="rect">
+                      <a:avLst/>
+                    </a:prstGeom>
+                  </pic:spPr>
+                </pic:pic>
+              </a:graphicData>
+            </a:graphic>
+          </wp:inline>
+        </w:drawing>
+      </w:r>
+    </w:p>
+    <w:p>
+      <w:r>
+        <w:t xml:space="preserve">16 </w:t>
+      </w:r>
+      <w:r>
+        <w:t>–</w:t>
+      </w:r>
+      <w:r>
+        <w:t xml:space="preserve"> </w:t>
+      </w:r>
+      <w:r>
+        <w:t xml:space="preserve">Na div benefícios centralizamos o subtítulo h2 </w:t>
+      </w:r>
+    </w:p>
+    <w:p>
+      <w:r>
+        <w:rPr>
+          <w:noProof/>
+        </w:rPr>
+        <w:drawing>
+          <wp:inline distT="0" distB="0" distL="0" distR="0" wp14:anchorId="04FB0AAF" wp14:editId="2C175559">
+            <wp:extent cx="1819529" cy="590632"/>
+            <wp:effectExtent l="0" t="0" r="9525" b="0"/>
+            <wp:docPr id="47" name="Imagem 47"/>
+            <wp:cNvGraphicFramePr>
+              <a:graphicFrameLocks xmlns:a="http://schemas.openxmlformats.org/drawingml/2006/main" noChangeAspect="1"/>
+            </wp:cNvGraphicFramePr>
+            <a:graphic xmlns:a="http://schemas.openxmlformats.org/drawingml/2006/main">
+              <a:graphicData uri="http://schemas.openxmlformats.org/drawingml/2006/picture">
+                <pic:pic xmlns:pic="http://schemas.openxmlformats.org/drawingml/2006/picture">
+                  <pic:nvPicPr>
+                    <pic:cNvPr id="1" name=""/>
+                    <pic:cNvPicPr/>
+                  </pic:nvPicPr>
+                  <pic:blipFill>
+                    <a:blip r:embed="rId33"/>
+                    <a:stretch>
+                      <a:fillRect/>
+                    </a:stretch>
+                  </pic:blipFill>
+                  <pic:spPr>
+                    <a:xfrm>
+                      <a:off x="0" y="0"/>
+                      <a:ext cx="1819529" cy="590632"/>
+                    </a:xfrm>
+                    <a:prstGeom prst="rect">
+                      <a:avLst/>
+                    </a:prstGeom>
+                  </pic:spPr>
+                </pic:pic>
+              </a:graphicData>
+            </a:graphic>
+          </wp:inline>
+        </w:drawing>
+      </w:r>
+    </w:p>
+    <w:p>
+      <w:r>
+        <w:t>17 – Na div principal inserimos um espaço interno tanto para cima, direita, baixo e esquerda conforme código:</w:t>
+      </w:r>
+    </w:p>
+    <w:p>
+      <w:r>
+        <w:rPr>
+          <w:noProof/>
+        </w:rPr>
+        <mc:AlternateContent>
+          <mc:Choice Requires="wps">
+            <w:drawing>
+              <wp:anchor distT="0" distB="0" distL="114300" distR="114300" simplePos="0" relativeHeight="251677696" behindDoc="0" locked="0" layoutInCell="1" allowOverlap="1">
+                <wp:simplePos x="0" y="0"/>
+                <wp:positionH relativeFrom="column">
+                  <wp:posOffset>1405890</wp:posOffset>
+                </wp:positionH>
+                <wp:positionV relativeFrom="paragraph">
+                  <wp:posOffset>501650</wp:posOffset>
+                </wp:positionV>
+                <wp:extent cx="723900" cy="295275"/>
+                <wp:effectExtent l="38100" t="38100" r="19050" b="28575"/>
+                <wp:wrapNone/>
+                <wp:docPr id="49" name="Conector de Seta Reta 49"/>
+                <wp:cNvGraphicFramePr/>
+                <a:graphic xmlns:a="http://schemas.openxmlformats.org/drawingml/2006/main">
+                  <a:graphicData uri="http://schemas.microsoft.com/office/word/2010/wordprocessingShape">
+                    <wps:wsp>
+                      <wps:cNvCnPr/>
+                      <wps:spPr>
+                        <a:xfrm flipH="1" flipV="1">
+                          <a:off x="0" y="0"/>
+                          <a:ext cx="723900" cy="295275"/>
+                        </a:xfrm>
+                        <a:prstGeom prst="straightConnector1">
+                          <a:avLst/>
+                        </a:prstGeom>
+                        <a:ln>
+                          <a:tailEnd type="triangle"/>
+                        </a:ln>
+                      </wps:spPr>
+                      <wps:style>
+                        <a:lnRef idx="1">
+                          <a:schemeClr val="accent1"/>
+                        </a:lnRef>
+                        <a:fillRef idx="0">
+                          <a:schemeClr val="accent1"/>
+                        </a:fillRef>
+                        <a:effectRef idx="0">
+                          <a:schemeClr val="accent1"/>
+                        </a:effectRef>
+                        <a:fontRef idx="minor">
+                          <a:schemeClr val="tx1"/>
+                        </a:fontRef>
+                      </wps:style>
+                      <wps:bodyPr/>
+                    </wps:wsp>
+                  </a:graphicData>
+                </a:graphic>
+              </wp:anchor>
+            </w:drawing>
+          </mc:Choice>
+          <mc:Fallback>
+            <w:pict>
+              <v:shape w14:anchorId="6A22D094" id="Conector de Seta Reta 49" o:spid="_x0000_s1026" type="#_x0000_t32" style="position:absolute;margin-left:110.7pt;margin-top:39.5pt;width:57pt;height:23.25pt;flip:x y;z-index:251677696;visibility:visible;mso-wrap-style:square;mso-wrap-distance-left:9pt;mso-wrap-distance-top:0;mso-wrap-distance-right:9pt;mso-wrap-distance-bottom:0;mso-position-horizontal:absolute;mso-position-horizontal-relative:text;mso-position-vertical:absolute;mso-position-vertical-relative:text" o:gfxdata="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" strokecolor="#4472c4 [3204]" strokeweight=".5pt">
+                <v:stroke endarrow="block" joinstyle="miter"/>
+              </v:shape>
+            </w:pict>
+          </mc:Fallback>
+        </mc:AlternateContent>
+      </w:r>
+      <w:r>
+        <w:rPr>
+          <w:noProof/>
+        </w:rPr>
+        <w:drawing>
+          <wp:inline distT="0" distB="0" distL="0" distR="0" wp14:anchorId="1B37374D" wp14:editId="380918C7">
+            <wp:extent cx="2400635" cy="914528"/>
+            <wp:effectExtent l="0" t="0" r="0" b="0"/>
+            <wp:docPr id="48" name="Imagem 48"/>
+            <wp:cNvGraphicFramePr>
+              <a:graphicFrameLocks xmlns:a="http://schemas.openxmlformats.org/drawingml/2006/main" noChangeAspect="1"/>
+            </wp:cNvGraphicFramePr>
+            <a:graphic xmlns:a="http://schemas.openxmlformats.org/drawingml/2006/main">
+              <a:graphicData uri="http://schemas.openxmlformats.org/drawingml/2006/picture">
+                <pic:pic xmlns:pic="http://schemas.openxmlformats.org/drawingml/2006/picture">
+                  <pic:nvPicPr>
+                    <pic:cNvPr id="1" name=""/>
+                    <pic:cNvPicPr/>
+                  </pic:nvPicPr>
+                  <pic:blipFill>
+                    <a:blip r:embed="rId34"/>
+                    <a:stretch>
+                      <a:fillRect/>
+                    </a:stretch>
+                  </pic:blipFill>
+                  <pic:spPr>
+                    <a:xfrm>
+                      <a:off x="0" y="0"/>
+                      <a:ext cx="2400635" cy="914528"/>
+                    </a:xfrm>
+                    <a:prstGeom prst="rect">
+                      <a:avLst/>
+                    </a:prstGeom>
+                  </pic:spPr>
+                </pic:pic>
+              </a:graphicData>
+            </a:graphic>
+          </wp:inline>
+        </w:drawing>
+      </w:r>
+    </w:p>
+    <w:p>
+      <w:r>
+        <w:rPr>
+          <w:noProof/>
+        </w:rPr>
+        <w:drawing>
+          <wp:inline distT="0" distB="0" distL="0" distR="0" wp14:anchorId="33365BD3" wp14:editId="314BAB7B">
+            <wp:extent cx="5400040" cy="2535555"/>
+            <wp:effectExtent l="0" t="0" r="0" b="0"/>
+            <wp:docPr id="51" name="Imagem 51"/>
+            <wp:cNvGraphicFramePr>
+              <a:graphicFrameLocks xmlns:a="http://schemas.openxmlformats.org/drawingml/2006/main" noChangeAspect="1"/>
+            </wp:cNvGraphicFramePr>
+            <a:graphic xmlns:a="http://schemas.openxmlformats.org/drawingml/2006/main">
+              <a:graphicData uri="http://schemas.openxmlformats.org/drawingml/2006/picture">
+                <pic:pic xmlns:pic="http://schemas.openxmlformats.org/drawingml/2006/picture">
+                  <pic:nvPicPr>
+                    <pic:cNvPr id="1" name=""/>
+                    <pic:cNvPicPr/>
+                  </pic:nvPicPr>
+                  <pic:blipFill>
+                    <a:blip r:embed="rId35"/>
+                    <a:stretch>
+                      <a:fillRect/>
+                    </a:stretch>
+                  </pic:blipFill>
+                  <pic:spPr>
+                    <a:xfrm>
+                      <a:off x="0" y="0"/>
+                      <a:ext cx="5400040" cy="2535555"/>
+                    </a:xfrm>
+                    <a:prstGeom prst="rect">
+                      <a:avLst/>
+                    </a:prstGeom>
+                  </pic:spPr>
+                </pic:pic>
+              </a:graphicData>
+            </a:graphic>
+          </wp:inline>
+        </w:drawing>
+      </w:r>
+    </w:p>
+    <w:p>
+      <w:r>
+        <w:lastRenderedPageBreak/>
+        <w:t xml:space="preserve">18 – Para deixar o código mais limpo criamos uma class que centraliza todos os títulos e subtítulos. </w:t>
+      </w:r>
+    </w:p>
+    <w:p>
+      <w:r>
+        <w:rPr>
+          <w:noProof/>
+        </w:rPr>
+        <mc:AlternateContent>
+          <mc:Choice Requires="wps">
+            <w:drawing>
+              <wp:anchor distT="0" distB="0" distL="114300" distR="114300" simplePos="0" relativeHeight="251678720" behindDoc="0" locked="0" layoutInCell="1" allowOverlap="1">
+                <wp:simplePos x="0" y="0"/>
+                <wp:positionH relativeFrom="column">
+                  <wp:posOffset>2377440</wp:posOffset>
+                </wp:positionH>
+                <wp:positionV relativeFrom="paragraph">
+                  <wp:posOffset>373380</wp:posOffset>
+                </wp:positionV>
+                <wp:extent cx="409575" cy="123825"/>
+                <wp:effectExtent l="38100" t="38100" r="28575" b="28575"/>
+                <wp:wrapNone/>
+                <wp:docPr id="54" name="Conector de Seta Reta 54"/>
+                <wp:cNvGraphicFramePr/>
+                <a:graphic xmlns:a="http://schemas.openxmlformats.org/drawingml/2006/main">
+                  <a:graphicData uri="http://schemas.microsoft.com/office/word/2010/wordprocessingShape">
+                    <wps:wsp>
+                      <wps:cNvCnPr/>
+                      <wps:spPr>
+                        <a:xfrm flipH="1" flipV="1">
+                          <a:off x="0" y="0"/>
+                          <a:ext cx="409575" cy="123825"/>
+                        </a:xfrm>
+                        <a:prstGeom prst="straightConnector1">
+                          <a:avLst/>
+                        </a:prstGeom>
+                        <a:ln>
+                          <a:tailEnd type="triangle"/>
+                        </a:ln>
+                      </wps:spPr>
+                      <wps:style>
+                        <a:lnRef idx="1">
+                          <a:schemeClr val="accent1"/>
+                        </a:lnRef>
+                        <a:fillRef idx="0">
+                          <a:schemeClr val="accent1"/>
+                        </a:fillRef>
+                        <a:effectRef idx="0">
+                          <a:schemeClr val="accent1"/>
+                        </a:effectRef>
+                        <a:fontRef idx="minor">
+                          <a:schemeClr val="tx1"/>
+                        </a:fontRef>
+                      </wps:style>
+                      <wps:bodyPr/>
+                    </wps:wsp>
+                  </a:graphicData>
+                </a:graphic>
+              </wp:anchor>
+            </w:drawing>
+          </mc:Choice>
+          <mc:Fallback>
+            <w:pict>
+              <v:shape w14:anchorId="3BF78BC9" id="Conector de Seta Reta 54" o:spid="_x0000_s1026" type="#_x0000_t32" style="position:absolute;margin-left:187.2pt;margin-top:29.4pt;width:32.25pt;height:9.75pt;flip:x y;z-index:251678720;visibility:visible;mso-wrap-style:square;mso-wrap-distance-left:9pt;mso-wrap-distance-top:0;mso-wrap-distance-right:9pt;mso-wrap-distance-bottom:0;mso-position-horizontal:absolute;mso-position-horizontal-relative:text;mso-position-vertical:absolute;mso-position-vertical-relative:text" o:gfxdata="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" strokecolor="#4472c4 [3204]" strokeweight=".5pt">
+                <v:stroke endarrow="block" joinstyle="miter"/>
+              </v:shape>
+            </w:pict>
+          </mc:Fallback>
+        </mc:AlternateContent>
+      </w:r>
+      <w:r>
+        <w:rPr>
+          <w:noProof/>
+        </w:rPr>
+        <w:drawing>
+          <wp:inline distT="0" distB="0" distL="0" distR="0" wp14:anchorId="7BDC9964" wp14:editId="417F0687">
+            <wp:extent cx="5400040" cy="560705"/>
+            <wp:effectExtent l="0" t="0" r="0" b="0"/>
+            <wp:docPr id="53" name="Imagem 53"/>
+            <wp:cNvGraphicFramePr>
+              <a:graphicFrameLocks xmlns:a="http://schemas.openxmlformats.org/drawingml/2006/main" noChangeAspect="1"/>
+            </wp:cNvGraphicFramePr>
+            <a:graphic xmlns:a="http://schemas.openxmlformats.org/drawingml/2006/main">
+              <a:graphicData uri="http://schemas.openxmlformats.org/drawingml/2006/picture">
+                <pic:pic xmlns:pic="http://schemas.openxmlformats.org/drawingml/2006/picture">
+                  <pic:nvPicPr>
+                    <pic:cNvPr id="1" name=""/>
+                    <pic:cNvPicPr/>
+                  </pic:nvPicPr>
+                  <pic:blipFill>
+                    <a:blip r:embed="rId36"/>
+                    <a:stretch>
+                      <a:fillRect/>
+                    </a:stretch>
+                  </pic:blipFill>
+                  <pic:spPr>
+                    <a:xfrm>
+                      <a:off x="0" y="0"/>
+                      <a:ext cx="5400040" cy="560705"/>
+                    </a:xfrm>
+                    <a:prstGeom prst="rect">
+                      <a:avLst/>
+                    </a:prstGeom>
+                  </pic:spPr>
+                </pic:pic>
+              </a:graphicData>
+            </a:graphic>
+          </wp:inline>
+        </w:drawing>
+      </w:r>
+    </w:p>
+    <w:p>
+      <w:r>
+        <w:rPr>
+          <w:noProof/>
+        </w:rPr>
+        <w:drawing>
+          <wp:inline distT="0" distB="0" distL="0" distR="0" wp14:anchorId="658D2229" wp14:editId="114D97B6">
+            <wp:extent cx="3486637" cy="171474"/>
+            <wp:effectExtent l="0" t="0" r="0" b="0"/>
+            <wp:docPr id="55" name="Imagem 55"/>
+            <wp:cNvGraphicFramePr>
+              <a:graphicFrameLocks xmlns:a="http://schemas.openxmlformats.org/drawingml/2006/main" noChangeAspect="1"/>
+            </wp:cNvGraphicFramePr>
+            <a:graphic xmlns:a="http://schemas.openxmlformats.org/drawingml/2006/main">
+              <a:graphicData uri="http://schemas.openxmlformats.org/drawingml/2006/picture">
+                <pic:pic xmlns:pic="http://schemas.openxmlformats.org/drawingml/2006/picture">
+                  <pic:nvPicPr>
+                    <pic:cNvPr id="1" name=""/>
+                    <pic:cNvPicPr/>
+                  </pic:nvPicPr>
+                  <pic:blipFill>
+                    <a:blip r:embed="rId37"/>
+                    <a:stretch>
+                      <a:fillRect/>
+                    </a:stretch>
+                  </pic:blipFill>
+                  <pic:spPr>
+                    <a:xfrm>
+                      <a:off x="0" y="0"/>
+                      <a:ext cx="3486637" cy="171474"/>
+                    </a:xfrm>
+                    <a:prstGeom prst="rect">
+                      <a:avLst/>
+                    </a:prstGeom>
+                  </pic:spPr>
+                </pic:pic>
+              </a:graphicData>
+            </a:graphic>
+          </wp:inline>
+        </w:drawing>
+      </w:r>
+    </w:p>
+    <w:p>
+      <w:r>
+        <w:rPr>
+          <w:noProof/>
+        </w:rPr>
+        <w:drawing>
+          <wp:inline distT="0" distB="0" distL="0" distR="0" wp14:anchorId="015D6F20" wp14:editId="527EF65B">
+            <wp:extent cx="1714739" cy="523948"/>
+            <wp:effectExtent l="0" t="0" r="0" b="9525"/>
+            <wp:docPr id="52" name="Imagem 52"/>
+            <wp:cNvGraphicFramePr>
+              <a:graphicFrameLocks xmlns:a="http://schemas.openxmlformats.org/drawingml/2006/main" noChangeAspect="1"/>
+            </wp:cNvGraphicFramePr>
+            <a:graphic xmlns:a="http://schemas.openxmlformats.org/drawingml/2006/main">
+              <a:graphicData uri="http://schemas.openxmlformats.org/drawingml/2006/picture">
+                <pic:pic xmlns:pic="http://schemas.openxmlformats.org/drawingml/2006/picture">
+                  <pic:nvPicPr>
+                    <pic:cNvPr id="1" name=""/>
+                    <pic:cNvPicPr/>
+                  </pic:nvPicPr>
+                  <pic:blipFill>
+                    <a:blip r:embed="rId38"/>
+                    <a:stretch>
+                      <a:fillRect/>
+                    </a:stretch>
+                  </pic:blipFill>
+                  <pic:spPr>
+                    <a:xfrm>
+                      <a:off x="0" y="0"/>
+                      <a:ext cx="1714739" cy="523948"/>
+                    </a:xfrm>
+                    <a:prstGeom prst="rect">
+                      <a:avLst/>
+                    </a:prstGeom>
+                  </pic:spPr>
+                </pic:pic>
+              </a:graphicData>
+            </a:graphic>
+          </wp:inline>
+        </w:drawing>
+      </w:r>
+    </w:p>
+    <w:p>
+      <w:r>
+        <w:t>19 – Criamos dois arquivos no projeto produtos.html e o produtos.css e ligamos o css no produtos.html</w:t>
+      </w:r>
+    </w:p>
+    <w:p>
+      <w:r>
+        <w:drawing>
+          <wp:inline distT="0" distB="0" distL="0" distR="0" wp14:anchorId="1D718933" wp14:editId="185E7169">
+            <wp:extent cx="1438476" cy="1533739"/>
+            <wp:effectExtent l="0" t="0" r="9525" b="9525"/>
+            <wp:docPr id="35" name="Imagem 35"/>
+            <wp:cNvGraphicFramePr>
+              <a:graphicFrameLocks xmlns:a="http://schemas.openxmlformats.org/drawingml/2006/main" noChangeAspect="1"/>
+            </wp:cNvGraphicFramePr>
+            <a:graphic xmlns:a="http://schemas.openxmlformats.org/drawingml/2006/main">
+              <a:graphicData uri="http://schemas.openxmlformats.org/drawingml/2006/picture">
+                <pic:pic xmlns:pic="http://schemas.openxmlformats.org/drawingml/2006/picture">
+                  <pic:nvPicPr>
+                    <pic:cNvPr id="1" name=""/>
+                    <pic:cNvPicPr/>
+                  </pic:nvPicPr>
+                  <pic:blipFill>
+                    <a:blip r:embed="rId39"/>
+                    <a:stretch>
+                      <a:fillRect/>
+                    </a:stretch>
+                  </pic:blipFill>
+                  <pic:spPr>
+                    <a:xfrm>
+                      <a:off x="0" y="0"/>
+                      <a:ext cx="1438476" cy="1533739"/>
+                    </a:xfrm>
+                    <a:prstGeom prst="rect">
+                      <a:avLst/>
+                    </a:prstGeom>
+                  </pic:spPr>
+                </pic:pic>
+              </a:graphicData>
+            </a:graphic>
+          </wp:inline>
+        </w:drawing>
+      </w:r>
+    </w:p>
+    <w:p>
+      <w:r>
+        <w:rPr>
+          <w:noProof/>
+        </w:rPr>
+        <mc:AlternateContent>
+          <mc:Choice Requires="wps">
+            <w:drawing>
+              <wp:anchor distT="0" distB="0" distL="114300" distR="114300" simplePos="0" relativeHeight="251681792" behindDoc="0" locked="0" layoutInCell="1" allowOverlap="1" wp14:anchorId="0B4542BF" wp14:editId="7B1E3D46">
+                <wp:simplePos x="0" y="0"/>
+                <wp:positionH relativeFrom="margin">
+                  <wp:align>left</wp:align>
+                </wp:positionH>
+                <wp:positionV relativeFrom="paragraph">
+                  <wp:posOffset>761365</wp:posOffset>
+                </wp:positionV>
+                <wp:extent cx="323850" cy="45719"/>
+                <wp:effectExtent l="0" t="57150" r="38100" b="50165"/>
+                <wp:wrapNone/>
+                <wp:docPr id="50" name="Conector de Seta Reta 50"/>
+                <wp:cNvGraphicFramePr/>
+                <a:graphic xmlns:a="http://schemas.openxmlformats.org/drawingml/2006/main">
+                  <a:graphicData uri="http://schemas.microsoft.com/office/word/2010/wordprocessingShape">
+                    <wps:wsp>
+                      <wps:cNvCnPr/>
+                      <wps:spPr>
+                        <a:xfrm flipV="1">
+                          <a:off x="0" y="0"/>
+                          <a:ext cx="323850" cy="45719"/>
+                        </a:xfrm>
+                        <a:prstGeom prst="straightConnector1">
+                          <a:avLst/>
+                        </a:prstGeom>
+                        <a:ln>
+                          <a:tailEnd type="triangle"/>
+                        </a:ln>
+                      </wps:spPr>
+                      <wps:style>
+                        <a:lnRef idx="1">
+                          <a:schemeClr val="accent1"/>
+                        </a:lnRef>
+                        <a:fillRef idx="0">
+                          <a:schemeClr val="accent1"/>
+                        </a:fillRef>
+                        <a:effectRef idx="0">
+                          <a:schemeClr val="accent1"/>
+                        </a:effectRef>
+                        <a:fontRef idx="minor">
+                          <a:schemeClr val="tx1"/>
+                        </a:fontRef>
+                      </wps:style>
+                      <wps:bodyPr/>
+                    </wps:wsp>
+                  </a:graphicData>
+                </a:graphic>
+                <wp14:sizeRelH relativeFrom="margin">
+                  <wp14:pctWidth>0</wp14:pctWidth>
+                </wp14:sizeRelH>
+                <wp14:sizeRelV relativeFrom="margin">
+                  <wp14:pctHeight>0</wp14:pctHeight>
+                </wp14:sizeRelV>
+              </wp:anchor>
+            </w:drawing>
+          </mc:Choice>
+          <mc:Fallback>
+            <w:pict>
+              <v:shapetype w14:anchorId="7B262C5B" id="_x0000_t32" coordsize="21600,21600" o:spt="32" o:oned="t" path="m,l21600,21600e" filled="f">
+                <v:path arrowok="t" fillok="f" o:connecttype="none"/>
+                <o:lock v:ext="edit" shapetype="t"/>
+              </v:shapetype>
+              <v:shape id="Conector de Seta Reta 50" o:spid="_x0000_s1026" type="#_x0000_t32" style="position:absolute;margin-left:0;margin-top:59.95pt;width:25.5pt;height:3.6pt;flip:y;z-index:251681792;visibility:visible;mso-wrap-style:square;mso-width-percent:0;mso-height-percent:0;mso-wrap-distance-left:9pt;mso-wrap-distance-top:0;mso-wrap-distance-right:9pt;mso-wrap-distance-bottom:0;mso-position-horizontal:left;mso-position-horizontal-relative:margin;mso-position-vertical:absolute;mso-position-vertical-relative:text;mso-width-percent:0;mso-height-percent:0;mso-width-relative:margin;mso-height-relative:margin" o:gfxdata="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" strokecolor="#4472c4 [3204]" strokeweight=".5pt">
+                <v:stroke endarrow="block" joinstyle="miter"/>
+                <w10:wrap anchorx="margin"/>
+              </v:shape>
+            </w:pict>
+          </mc:Fallback>
+        </mc:AlternateContent>
+      </w:r>
+      <w:r>
+        <w:rPr>
+          <w:noProof/>
+        </w:rPr>
+        <mc:AlternateContent>
+          <mc:Choice Requires="wps">
+            <w:drawing>
+              <wp:anchor distT="0" distB="0" distL="114300" distR="114300" simplePos="0" relativeHeight="251679744" behindDoc="0" locked="0" layoutInCell="1" allowOverlap="1">
+                <wp:simplePos x="0" y="0"/>
+                <wp:positionH relativeFrom="column">
+                  <wp:posOffset>3415665</wp:posOffset>
+                </wp:positionH>
+                <wp:positionV relativeFrom="paragraph">
+                  <wp:posOffset>864235</wp:posOffset>
+                </wp:positionV>
+                <wp:extent cx="619125" cy="123825"/>
+                <wp:effectExtent l="19050" t="57150" r="28575" b="28575"/>
+                <wp:wrapNone/>
+                <wp:docPr id="39" name="Conector de Seta Reta 39"/>
+                <wp:cNvGraphicFramePr/>
+                <a:graphic xmlns:a="http://schemas.openxmlformats.org/drawingml/2006/main">
+                  <a:graphicData uri="http://schemas.microsoft.com/office/word/2010/wordprocessingShape">
+                    <wps:wsp>
+                      <wps:cNvCnPr/>
+                      <wps:spPr>
+                        <a:xfrm flipH="1" flipV="1">
+                          <a:off x="0" y="0"/>
+                          <a:ext cx="619125" cy="123825"/>
+                        </a:xfrm>
+                        <a:prstGeom prst="straightConnector1">
+                          <a:avLst/>
+                        </a:prstGeom>
+                        <a:ln>
+                          <a:tailEnd type="triangle"/>
+                        </a:ln>
+                      </wps:spPr>
+                      <wps:style>
+                        <a:lnRef idx="1">
+                          <a:schemeClr val="accent1"/>
+                        </a:lnRef>
+                        <a:fillRef idx="0">
+                          <a:schemeClr val="accent1"/>
+                        </a:fillRef>
+                        <a:effectRef idx="0">
+                          <a:schemeClr val="accent1"/>
+                        </a:effectRef>
+                        <a:fontRef idx="minor">
+                          <a:schemeClr val="tx1"/>
+                        </a:fontRef>
+                      </wps:style>
+                      <wps:bodyPr/>
+                    </wps:wsp>
+                  </a:graphicData>
+                </a:graphic>
+              </wp:anchor>
+            </w:drawing>
+          </mc:Choice>
+          <mc:Fallback>
+            <w:pict>
+              <v:shape w14:anchorId="7F4F1770" id="Conector de Seta Reta 39" o:spid="_x0000_s1026" type="#_x0000_t32" style="position:absolute;margin-left:268.95pt;margin-top:68.05pt;width:48.75pt;height:9.75pt;flip:x y;z-index:251679744;visibility:visible;mso-wrap-style:square;mso-wrap-distance-left:9pt;mso-wrap-distance-top:0;mso-wrap-distance-right:9pt;mso-wrap-distance-bottom:0;mso-position-horizontal:absolute;mso-position-horizontal-relative:text;mso-position-vertical:absolute;mso-position-vertical-relative:text" o:gfxdata="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" strokecolor="#4472c4 [3204]" strokeweight=".5pt">
+                <v:stroke endarrow="block" joinstyle="miter"/>
+              </v:shape>
+            </w:pict>
+          </mc:Fallback>
+        </mc:AlternateContent>
+      </w:r>
+      <w:r>
+        <w:drawing>
+          <wp:inline distT="0" distB="0" distL="0" distR="0" wp14:anchorId="1F238ABF" wp14:editId="769925EC">
+            <wp:extent cx="5400040" cy="1070610"/>
+            <wp:effectExtent l="0" t="0" r="0" b="0"/>
+            <wp:docPr id="38" name="Imagem 38"/>
+            <wp:cNvGraphicFramePr>
+              <a:graphicFrameLocks xmlns:a="http://schemas.openxmlformats.org/drawingml/2006/main" noChangeAspect="1"/>
+            </wp:cNvGraphicFramePr>
+            <a:graphic xmlns:a="http://schemas.openxmlformats.org/drawingml/2006/main">
+              <a:graphicData uri="http://schemas.openxmlformats.org/drawingml/2006/picture">
+                <pic:pic xmlns:pic="http://schemas.openxmlformats.org/drawingml/2006/picture">
+                  <pic:nvPicPr>
+                    <pic:cNvPr id="1" name=""/>
+                    <pic:cNvPicPr/>
+                  </pic:nvPicPr>
+                  <pic:blipFill>
+                    <a:blip r:embed="rId40"/>
+                    <a:stretch>
+                      <a:fillRect/>
+                    </a:stretch>
+                  </pic:blipFill>
+                  <pic:spPr>
+                    <a:xfrm>
+                      <a:off x="0" y="0"/>
+                      <a:ext cx="5400040" cy="1070610"/>
+                    </a:xfrm>
+                    <a:prstGeom prst="rect">
+                      <a:avLst/>
+                    </a:prstGeom>
+                  </pic:spPr>
+                </pic:pic>
+              </a:graphicData>
+            </a:graphic>
+          </wp:inline>
+        </w:drawing>
+      </w:r>
+    </w:p>
+    <w:p>
+      <w:r>
+        <w:t xml:space="preserve">20 </w:t>
+      </w:r>
+      <w:r>
+        <w:t>–</w:t>
+      </w:r>
+      <w:r>
+        <w:t xml:space="preserve"> </w:t>
+      </w:r>
+      <w:r>
+        <w:t>Na página do produtos.html estruturamos colocando header, main e footer, dentro do header inserimos uma imagem que será a logo do site e criamos uma lista não ordenada para que mais tarde ela será o menu do nosso site.</w:t>
+      </w:r>
+    </w:p>
+    <w:p>
+      <w:r>
+        <w:drawing>
+          <wp:inline distT="0" distB="0" distL="0" distR="0" wp14:anchorId="31C26F4D" wp14:editId="61529B59">
+            <wp:extent cx="3896269" cy="1629002"/>
+            <wp:effectExtent l="0" t="0" r="9525" b="9525"/>
+            <wp:docPr id="56" name="Imagem 56"/>
+            <wp:cNvGraphicFramePr>
+              <a:graphicFrameLocks xmlns:a="http://schemas.openxmlformats.org/drawingml/2006/main" noChangeAspect="1"/>
+            </wp:cNvGraphicFramePr>
+            <a:graphic xmlns:a="http://schemas.openxmlformats.org/drawingml/2006/main">
+              <a:graphicData uri="http://schemas.openxmlformats.org/drawingml/2006/picture">
+                <pic:pic xmlns:pic="http://schemas.openxmlformats.org/drawingml/2006/picture">
+                  <pic:nvPicPr>
+                    <pic:cNvPr id="1" name=""/>
+                    <pic:cNvPicPr/>
+                  </pic:nvPicPr>
+                  <pic:blipFill>
+                    <a:blip r:embed="rId41"/>
+                    <a:stretch>
+                      <a:fillRect/>
+                    </a:stretch>
+                  </pic:blipFill>
+                  <pic:spPr>
+                    <a:xfrm>
+                      <a:off x="0" y="0"/>
+                      <a:ext cx="3896269" cy="1629002"/>
+                    </a:xfrm>
+                    <a:prstGeom prst="rect">
+                      <a:avLst/>
+                    </a:prstGeom>
+                  </pic:spPr>
+                </pic:pic>
+              </a:graphicData>
+            </a:graphic>
+          </wp:inline>
+        </w:drawing>
+      </w:r>
+    </w:p>
+    <w:p/>
+    <w:p/>
+    <w:p>
+      <w:r>
+        <w:lastRenderedPageBreak/>
+        <w:t xml:space="preserve">21 </w:t>
+      </w:r>
+      <w:r>
+        <w:t>–</w:t>
+      </w:r>
+      <w:r>
+        <w:t xml:space="preserve"> </w:t>
+      </w:r>
+      <w:r>
+        <w:t>No produtos.css inserimos uma cor de fundo no header e no html adicionamos a tag Nav que significa Navegação, ou seja, nossa lista se tornará em um menu para navegar entre as páginas.</w:t>
+      </w:r>
+    </w:p>
+    <w:p>
+      <w:r>
+        <w:drawing>
+          <wp:inline distT="0" distB="0" distL="0" distR="0" wp14:anchorId="18764B42" wp14:editId="50863D90">
+            <wp:extent cx="2819794" cy="685896"/>
+            <wp:effectExtent l="0" t="0" r="0" b="0"/>
+            <wp:docPr id="57" name="Imagem 57"/>
+            <wp:cNvGraphicFramePr>
+              <a:graphicFrameLocks xmlns:a="http://schemas.openxmlformats.org/drawingml/2006/main" noChangeAspect="1"/>
+            </wp:cNvGraphicFramePr>
+            <a:graphic xmlns:a="http://schemas.openxmlformats.org/drawingml/2006/main">
+              <a:graphicData uri="http://schemas.openxmlformats.org/drawingml/2006/picture">
+                <pic:pic xmlns:pic="http://schemas.openxmlformats.org/drawingml/2006/picture">
+                  <pic:nvPicPr>
+                    <pic:cNvPr id="1" name=""/>
+                    <pic:cNvPicPr/>
+                  </pic:nvPicPr>
+                  <pic:blipFill>
+                    <a:blip r:embed="rId42"/>
+                    <a:stretch>
+                      <a:fillRect/>
+                    </a:stretch>
+                  </pic:blipFill>
+                  <pic:spPr>
+                    <a:xfrm>
+                      <a:off x="0" y="0"/>
+                      <a:ext cx="2819794" cy="685896"/>
+                    </a:xfrm>
+                    <a:prstGeom prst="rect">
+                      <a:avLst/>
+                    </a:prstGeom>
+                  </pic:spPr>
+                </pic:pic>
+              </a:graphicData>
+            </a:graphic>
+          </wp:inline>
+        </w:drawing>
+      </w:r>
+    </w:p>
+    <w:p>
+      <w:r>
+        <w:drawing>
+          <wp:inline distT="0" distB="0" distL="0" distR="0" wp14:anchorId="263644AD" wp14:editId="0137DFC0">
+            <wp:extent cx="3696216" cy="1829055"/>
+            <wp:effectExtent l="0" t="0" r="0" b="0"/>
+            <wp:docPr id="58" name="Imagem 58"/>
+            <wp:cNvGraphicFramePr>
+              <a:graphicFrameLocks xmlns:a="http://schemas.openxmlformats.org/drawingml/2006/main" noChangeAspect="1"/>
+            </wp:cNvGraphicFramePr>
+            <a:graphic xmlns:a="http://schemas.openxmlformats.org/drawingml/2006/main">
+              <a:graphicData uri="http://schemas.openxmlformats.org/drawingml/2006/picture">
+                <pic:pic xmlns:pic="http://schemas.openxmlformats.org/drawingml/2006/picture">
+                  <pic:nvPicPr>
+                    <pic:cNvPr id="1" name=""/>
+                    <pic:cNvPicPr/>
+                  </pic:nvPicPr>
+                  <pic:blipFill>
+                    <a:blip r:embed="rId43"/>
+                    <a:stretch>
+                      <a:fillRect/>
+                    </a:stretch>
+                  </pic:blipFill>
+                  <pic:spPr>
+                    <a:xfrm>
+                      <a:off x="0" y="0"/>
+                      <a:ext cx="3696216" cy="1829055"/>
+                    </a:xfrm>
+                    <a:prstGeom prst="rect">
+                      <a:avLst/>
+                    </a:prstGeom>
+                  </pic:spPr>
+                </pic:pic>
+              </a:graphicData>
+            </a:graphic>
+          </wp:inline>
+        </w:drawing>
+      </w:r>
+    </w:p>
+    <w:p>
+      <w:r>
+        <w:t>22 – Na lista ordenada incluímos uma ancora a Tag “a” para criar os links entre as páginas conforme imagem.</w:t>
+      </w:r>
+    </w:p>
+    <w:p>
+      <w:r>
+        <w:drawing>
+          <wp:inline distT="0" distB="0" distL="0" distR="0" wp14:anchorId="2A18235E" wp14:editId="6FAB8789">
+            <wp:extent cx="4305901" cy="1952898"/>
+            <wp:effectExtent l="0" t="0" r="0" b="9525"/>
+            <wp:docPr id="59" name="Imagem 59"/>
+            <wp:cNvGraphicFramePr>
+              <a:graphicFrameLocks xmlns:a="http://schemas.openxmlformats.org/drawingml/2006/main" noChangeAspect="1"/>
+            </wp:cNvGraphicFramePr>
+            <a:graphic xmlns:a="http://schemas.openxmlformats.org/drawingml/2006/main">
+              <a:graphicData uri="http://schemas.openxmlformats.org/drawingml/2006/picture">
+                <pic:pic xmlns:pic="http://schemas.openxmlformats.org/drawingml/2006/picture">
+                  <pic:nvPicPr>
+                    <pic:cNvPr id="1" name=""/>
+                    <pic:cNvPicPr/>
+                  </pic:nvPicPr>
+                  <pic:blipFill>
+                    <a:blip r:embed="rId44"/>
+                    <a:stretch>
+                      <a:fillRect/>
+                    </a:stretch>
+                  </pic:blipFill>
+                  <pic:spPr>
+                    <a:xfrm>
+                      <a:off x="0" y="0"/>
+                      <a:ext cx="4305901" cy="1952898"/>
+                    </a:xfrm>
+                    <a:prstGeom prst="rect">
+                      <a:avLst/>
+                    </a:prstGeom>
+                  </pic:spPr>
+                </pic:pic>
+              </a:graphicData>
+            </a:graphic>
+          </wp:inline>
+        </w:drawing>
+      </w:r>
+    </w:p>
+    <w:p/>
+    <w:p/>
+    <w:p/>
+    <w:p/>
+    <w:p/>
+    <w:p/>
+    <w:p/>
+    <w:p/>
+    <w:p/>
+    <w:p>
+      <w:r>
+        <w:lastRenderedPageBreak/>
+        <w:t xml:space="preserve">23 – Para colocar a nossa lista os itens um do lado do outro para que assim possamos ter um menu horizontal utilizamos o css por referência, ou seja, </w:t>
+      </w:r>
+      <w:r>
+        <w:t>no nosso site a onde tiver nav e li deixar a natureza (display) de forma inline (em linha).</w:t>
+      </w:r>
+    </w:p>
+    <w:p>
+      <w:r>
+        <w:drawing>
+          <wp:inline distT="0" distB="0" distL="0" distR="0" wp14:anchorId="23B2C56C" wp14:editId="65641878">
+            <wp:extent cx="1533739" cy="590632"/>
+            <wp:effectExtent l="0" t="0" r="9525" b="0"/>
+            <wp:docPr id="60" name="Imagem 60"/>
+            <wp:cNvGraphicFramePr>
+              <a:graphicFrameLocks xmlns:a="http://schemas.openxmlformats.org/drawingml/2006/main" noChangeAspect="1"/>
+            </wp:cNvGraphicFramePr>
+            <a:graphic xmlns:a="http://schemas.openxmlformats.org/drawingml/2006/main">
+              <a:graphicData uri="http://schemas.openxmlformats.org/drawingml/2006/picture">
+                <pic:pic xmlns:pic="http://schemas.openxmlformats.org/drawingml/2006/picture">
+                  <pic:nvPicPr>
+                    <pic:cNvPr id="1" name=""/>
+                    <pic:cNvPicPr/>
+                  </pic:nvPicPr>
+                  <pic:blipFill>
+                    <a:blip r:embed="rId45"/>
+                    <a:stretch>
+                      <a:fillRect/>
+                    </a:stretch>
+                  </pic:blipFill>
+                  <pic:spPr>
+                    <a:xfrm>
+                      <a:off x="0" y="0"/>
+                      <a:ext cx="1533739" cy="590632"/>
+                    </a:xfrm>
+                    <a:prstGeom prst="rect">
+                      <a:avLst/>
+                    </a:prstGeom>
+                  </pic:spPr>
+                </pic:pic>
+              </a:graphicData>
+            </a:graphic>
+          </wp:inline>
+        </w:drawing>
+      </w:r>
+    </w:p>
+    <w:p>
+      <w:r>
+        <w:drawing>
+          <wp:inline distT="0" distB="0" distL="0" distR="0" wp14:anchorId="7510D26A" wp14:editId="7B37610A">
+            <wp:extent cx="2200582" cy="2924583"/>
+            <wp:effectExtent l="0" t="0" r="9525" b="9525"/>
+            <wp:docPr id="61" name="Imagem 61"/>
+            <wp:cNvGraphicFramePr>
+              <a:graphicFrameLocks xmlns:a="http://schemas.openxmlformats.org/drawingml/2006/main" noChangeAspect="1"/>
+            </wp:cNvGraphicFramePr>
+            <a:graphic xmlns:a="http://schemas.openxmlformats.org/drawingml/2006/main">
+              <a:graphicData uri="http://schemas.openxmlformats.org/drawingml/2006/picture">
+                <pic:pic xmlns:pic="http://schemas.openxmlformats.org/drawingml/2006/picture">
+                  <pic:nvPicPr>
+                    <pic:cNvPr id="1" name=""/>
+                    <pic:cNvPicPr/>
+                  </pic:nvPicPr>
+                  <pic:blipFill>
+                    <a:blip r:embed="rId46"/>
+                    <a:stretch>
+                      <a:fillRect/>
+                    </a:stretch>
+                  </pic:blipFill>
+                  <pic:spPr>
+                    <a:xfrm>
+                      <a:off x="0" y="0"/>
+                      <a:ext cx="2200582" cy="2924583"/>
+                    </a:xfrm>
+                    <a:prstGeom prst="rect">
+                      <a:avLst/>
+                    </a:prstGeom>
+                  </pic:spPr>
+                </pic:pic>
+              </a:graphicData>
+            </a:graphic>
+          </wp:inline>
+        </w:drawing>
+      </w:r>
+    </w:p>
+    <w:p>
+      <w:r>
+        <w:t xml:space="preserve">24 </w:t>
+      </w:r>
+      <w:r>
+        <w:t>–</w:t>
+      </w:r>
+      <w:r>
+        <w:t xml:space="preserve"> </w:t>
+      </w:r>
+      <w:r>
+        <w:t xml:space="preserve">Adicionamos a nossa lista o </w:t>
+      </w:r>
+      <w:proofErr w:type="spellStart"/>
+      <w:r>
+        <w:t>uppercase</w:t>
+      </w:r>
+      <w:proofErr w:type="spellEnd"/>
+      <w:r>
+        <w:t xml:space="preserve"> para que todo o texto fique em letra maiúscula e utilizamos a referência do </w:t>
+      </w:r>
+      <w:proofErr w:type="spellStart"/>
+      <w:r>
+        <w:t>nav</w:t>
+      </w:r>
+      <w:proofErr w:type="spellEnd"/>
+      <w:r>
+        <w:t xml:space="preserve"> a que os textos dos nossos links e definimos que a cor seja Preto.</w:t>
+      </w:r>
+    </w:p>
+    <w:p>
+      <w:r>
+        <w:drawing>
+          <wp:inline distT="0" distB="0" distL="0" distR="0" wp14:anchorId="1995749C" wp14:editId="58B1A500">
+            <wp:extent cx="2295845" cy="762106"/>
+            <wp:effectExtent l="0" t="0" r="9525" b="0"/>
+            <wp:docPr id="62" name="Imagem 62"/>
+            <wp:cNvGraphicFramePr>
+              <a:graphicFrameLocks xmlns:a="http://schemas.openxmlformats.org/drawingml/2006/main" noChangeAspect="1"/>
+            </wp:cNvGraphicFramePr>
+            <a:graphic xmlns:a="http://schemas.openxmlformats.org/drawingml/2006/main">
+              <a:graphicData uri="http://schemas.openxmlformats.org/drawingml/2006/picture">
+                <pic:pic xmlns:pic="http://schemas.openxmlformats.org/drawingml/2006/picture">
+                  <pic:nvPicPr>
+                    <pic:cNvPr id="1" name=""/>
+                    <pic:cNvPicPr/>
+                  </pic:nvPicPr>
+                  <pic:blipFill>
+                    <a:blip r:embed="rId47"/>
+                    <a:stretch>
+                      <a:fillRect/>
+                    </a:stretch>
+                  </pic:blipFill>
+                  <pic:spPr>
+                    <a:xfrm>
+                      <a:off x="0" y="0"/>
+                      <a:ext cx="2295845" cy="762106"/>
+                    </a:xfrm>
+                    <a:prstGeom prst="rect">
+                      <a:avLst/>
+                    </a:prstGeom>
+                  </pic:spPr>
+                </pic:pic>
+              </a:graphicData>
+            </a:graphic>
+          </wp:inline>
+        </w:drawing>
+      </w:r>
+      <w:r>
+        <w:drawing>
+          <wp:inline distT="0" distB="0" distL="0" distR="0" wp14:anchorId="10FC8C8E" wp14:editId="43A8D244">
+            <wp:extent cx="2847975" cy="2895600"/>
+            <wp:effectExtent l="0" t="0" r="9525" b="0"/>
+            <wp:docPr id="63" name="Imagem 63"/>
+            <wp:cNvGraphicFramePr>
+              <a:graphicFrameLocks xmlns:a="http://schemas.openxmlformats.org/drawingml/2006/main" noChangeAspect="1"/>
+            </wp:cNvGraphicFramePr>
+            <a:graphic xmlns:a="http://schemas.openxmlformats.org/drawingml/2006/main">
+              <a:graphicData uri="http://schemas.openxmlformats.org/drawingml/2006/picture">
+                <pic:pic xmlns:pic="http://schemas.openxmlformats.org/drawingml/2006/picture">
+                  <pic:nvPicPr>
+                    <pic:cNvPr id="1" name=""/>
+                    <pic:cNvPicPr/>
+                  </pic:nvPicPr>
+                  <pic:blipFill>
+                    <a:blip r:embed="rId48"/>
+                    <a:stretch>
+                      <a:fillRect/>
+                    </a:stretch>
+                  </pic:blipFill>
+                  <pic:spPr>
+                    <a:xfrm>
+                      <a:off x="0" y="0"/>
+                      <a:ext cx="2848380" cy="2896012"/>
+                    </a:xfrm>
+                    <a:prstGeom prst="rect">
+                      <a:avLst/>
+                    </a:prstGeom>
+                  </pic:spPr>
+                </pic:pic>
+              </a:graphicData>
+            </a:graphic>
+          </wp:inline>
+        </w:drawing>
+      </w:r>
+    </w:p>
+    <w:p/>
+    <w:p/>
+    <w:p/>
+    <w:p>
+      <w:r>
+        <w:lastRenderedPageBreak/>
+        <w:t xml:space="preserve">25 </w:t>
+      </w:r>
+      <w:r>
+        <w:t>–</w:t>
+      </w:r>
+      <w:r>
+        <w:t xml:space="preserve"> </w:t>
+      </w:r>
+      <w:r>
+        <w:t xml:space="preserve">Ainda trabalhando com o </w:t>
+      </w:r>
+      <w:proofErr w:type="spellStart"/>
+      <w:r>
+        <w:t>nav</w:t>
+      </w:r>
+      <w:proofErr w:type="spellEnd"/>
+      <w:r>
+        <w:t xml:space="preserve"> a, inserimos os seguintes comandos:</w:t>
+      </w:r>
+    </w:p>
+    <w:p>
+      <w:pPr>
+        <w:pStyle w:val="PargrafodaLista"/>
+        <w:numPr>
+          <w:ilvl w:val="0"/>
+          <w:numId w:val="7"/>
+        </w:numPr>
+      </w:pPr>
+      <w:r>
+        <w:t>Deixamos os textos mais encorpado.</w:t>
+      </w:r>
+    </w:p>
+    <w:p>
+      <w:pPr>
+        <w:pStyle w:val="PargrafodaLista"/>
+        <w:numPr>
+          <w:ilvl w:val="0"/>
+          <w:numId w:val="7"/>
+        </w:numPr>
+      </w:pPr>
+      <w:r>
+        <w:t>Aumentamos o tamanho da fonte.</w:t>
+      </w:r>
+    </w:p>
+    <w:p>
+      <w:pPr>
+        <w:pStyle w:val="PargrafodaLista"/>
+        <w:numPr>
+          <w:ilvl w:val="0"/>
+          <w:numId w:val="7"/>
+        </w:numPr>
+      </w:pPr>
+      <w:r>
+        <w:t>Tiramos a linha que sublinhava o texto.</w:t>
+      </w:r>
+    </w:p>
+    <w:p>
+      <w:r>
+        <w:rPr>
+          <w:noProof/>
+        </w:rPr>
+        <mc:AlternateContent>
+          <mc:Choice Requires="wps">
+            <w:drawing>
+              <wp:anchor distT="0" distB="0" distL="114300" distR="114300" simplePos="0" relativeHeight="251683840" behindDoc="0" locked="0" layoutInCell="1" allowOverlap="1">
+                <wp:simplePos x="0" y="0"/>
+                <wp:positionH relativeFrom="column">
+                  <wp:posOffset>5716</wp:posOffset>
+                </wp:positionH>
+                <wp:positionV relativeFrom="paragraph">
+                  <wp:posOffset>760095</wp:posOffset>
+                </wp:positionV>
+                <wp:extent cx="304800" cy="45719"/>
+                <wp:effectExtent l="0" t="57150" r="38100" b="50165"/>
+                <wp:wrapNone/>
+                <wp:docPr id="66" name="Conector de Seta Reta 66"/>
+                <wp:cNvGraphicFramePr/>
+                <a:graphic xmlns:a="http://schemas.openxmlformats.org/drawingml/2006/main">
+                  <a:graphicData uri="http://schemas.microsoft.com/office/word/2010/wordprocessingShape">
+                    <wps:wsp>
+                      <wps:cNvCnPr/>
+                      <wps:spPr>
+                        <a:xfrm flipV="1">
+                          <a:off x="0" y="0"/>
+                          <a:ext cx="304800" cy="45719"/>
+                        </a:xfrm>
+                        <a:prstGeom prst="straightConnector1">
+                          <a:avLst/>
+                        </a:prstGeom>
+                        <a:ln>
+                          <a:tailEnd type="triangle"/>
+                        </a:ln>
+                      </wps:spPr>
+                      <wps:style>
+                        <a:lnRef idx="1">
+                          <a:schemeClr val="accent1"/>
+                        </a:lnRef>
+                        <a:fillRef idx="0">
+                          <a:schemeClr val="accent1"/>
+                        </a:fillRef>
+                        <a:effectRef idx="0">
+                          <a:schemeClr val="accent1"/>
+                        </a:effectRef>
+                        <a:fontRef idx="minor">
+                          <a:schemeClr val="tx1"/>
+                        </a:fontRef>
+                      </wps:style>
+                      <wps:bodyPr/>
+                    </wps:wsp>
+                  </a:graphicData>
+                </a:graphic>
+                <wp14:sizeRelH relativeFrom="margin">
+                  <wp14:pctWidth>0</wp14:pctWidth>
+                </wp14:sizeRelH>
+                <wp14:sizeRelV relativeFrom="margin">
+                  <wp14:pctHeight>0</wp14:pctHeight>
+                </wp14:sizeRelV>
+              </wp:anchor>
+            </w:drawing>
+          </mc:Choice>
+          <mc:Fallback>
+            <w:pict>
+              <v:shape w14:anchorId="0C06931C" id="Conector de Seta Reta 66" o:spid="_x0000_s1026" type="#_x0000_t32" style="position:absolute;margin-left:.45pt;margin-top:59.85pt;width:24pt;height:3.6pt;flip:y;z-index:251683840;visibility:visible;mso-wrap-style:square;mso-width-percent:0;mso-height-percent:0;mso-wrap-distance-left:9pt;mso-wrap-distance-top:0;mso-wrap-distance-right:9pt;mso-wrap-distance-bottom:0;mso-position-horizontal:absolute;mso-position-horizontal-relative:text;mso-position-vertical:absolute;mso-position-vertical-relative:text;mso-width-percent:0;mso-height-percent:0;mso-width-relative:margin;mso-height-relative:margin" o:gfxdata="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" strokecolor="#4472c4 [3204]" strokeweight=".5pt">
+                <v:stroke endarrow="block" joinstyle="miter"/>
+              </v:shape>
+            </w:pict>
+          </mc:Fallback>
+        </mc:AlternateContent>
+      </w:r>
+      <w:r>
+        <w:rPr>
+          <w:noProof/>
+        </w:rPr>
+        <mc:AlternateContent>
+          <mc:Choice Requires="wps">
+            <w:drawing>
+              <wp:anchor distT="0" distB="0" distL="114300" distR="114300" simplePos="0" relativeHeight="251682816" behindDoc="0" locked="0" layoutInCell="1" allowOverlap="1">
+                <wp:simplePos x="0" y="0"/>
+                <wp:positionH relativeFrom="column">
+                  <wp:posOffset>1729739</wp:posOffset>
+                </wp:positionH>
+                <wp:positionV relativeFrom="paragraph">
+                  <wp:posOffset>386714</wp:posOffset>
+                </wp:positionV>
+                <wp:extent cx="561975" cy="180975"/>
+                <wp:effectExtent l="38100" t="0" r="28575" b="66675"/>
+                <wp:wrapNone/>
+                <wp:docPr id="65" name="Conector de Seta Reta 65"/>
+                <wp:cNvGraphicFramePr/>
+                <a:graphic xmlns:a="http://schemas.openxmlformats.org/drawingml/2006/main">
+                  <a:graphicData uri="http://schemas.microsoft.com/office/word/2010/wordprocessingShape">
+                    <wps:wsp>
+                      <wps:cNvCnPr/>
+                      <wps:spPr>
+                        <a:xfrm flipH="1">
+                          <a:off x="0" y="0"/>
+                          <a:ext cx="561975" cy="180975"/>
+                        </a:xfrm>
+                        <a:prstGeom prst="straightConnector1">
+                          <a:avLst/>
+                        </a:prstGeom>
+                        <a:ln>
+                          <a:tailEnd type="triangle"/>
+                        </a:ln>
+                      </wps:spPr>
+                      <wps:style>
+                        <a:lnRef idx="1">
+                          <a:schemeClr val="accent1"/>
+                        </a:lnRef>
+                        <a:fillRef idx="0">
+                          <a:schemeClr val="accent1"/>
+                        </a:fillRef>
+                        <a:effectRef idx="0">
+                          <a:schemeClr val="accent1"/>
+                        </a:effectRef>
+                        <a:fontRef idx="minor">
+                          <a:schemeClr val="tx1"/>
+                        </a:fontRef>
+                      </wps:style>
+                      <wps:bodyPr/>
+                    </wps:wsp>
+                  </a:graphicData>
+                </a:graphic>
+                <wp14:sizeRelH relativeFrom="margin">
+                  <wp14:pctWidth>0</wp14:pctWidth>
+                </wp14:sizeRelH>
+                <wp14:sizeRelV relativeFrom="margin">
+                  <wp14:pctHeight>0</wp14:pctHeight>
+                </wp14:sizeRelV>
+              </wp:anchor>
+            </w:drawing>
+          </mc:Choice>
+          <mc:Fallback>
+            <w:pict>
+              <v:shape w14:anchorId="093CA1A9" id="Conector de Seta Reta 65" o:spid="_x0000_s1026" type="#_x0000_t32" style="position:absolute;margin-left:136.2pt;margin-top:30.45pt;width:44.25pt;height:14.25pt;flip:x;z-index:251682816;visibility:visible;mso-wrap-style:square;mso-width-percent:0;mso-height-percent:0;mso-wrap-distance-left:9pt;mso-wrap-distance-top:0;mso-wrap-distance-right:9pt;mso-wrap-distance-bottom:0;mso-position-horizontal:absolute;mso-position-horizontal-relative:text;mso-position-vertical:absolute;mso-position-vertical-relative:text;mso-width-percent:0;mso-height-percent:0;mso-width-relative:margin;mso-height-relative:margin" o:gfxdata="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" strokecolor="#4472c4 [3204]" strokeweight=".5pt">
+                <v:stroke endarrow="block" joinstyle="miter"/>
+              </v:shape>
+            </w:pict>
+          </mc:Fallback>
+        </mc:AlternateContent>
+      </w:r>
+      <w:r>
+        <w:rPr>
+          <w:noProof/>
+        </w:rPr>
+        <mc:AlternateContent>
+          <mc:Choice Requires="wps">
+            <w:drawing>
+              <wp:anchor distT="0" distB="0" distL="114300" distR="114300" simplePos="0" relativeHeight="251684864" behindDoc="0" locked="0" layoutInCell="1" allowOverlap="1">
+                <wp:simplePos x="0" y="0"/>
+                <wp:positionH relativeFrom="column">
+                  <wp:posOffset>1958340</wp:posOffset>
+                </wp:positionH>
+                <wp:positionV relativeFrom="paragraph">
+                  <wp:posOffset>1043940</wp:posOffset>
+                </wp:positionV>
+                <wp:extent cx="209550" cy="219075"/>
+                <wp:effectExtent l="38100" t="38100" r="19050" b="28575"/>
+                <wp:wrapNone/>
+                <wp:docPr id="67" name="Conector de Seta Reta 67"/>
+                <wp:cNvGraphicFramePr/>
+                <a:graphic xmlns:a="http://schemas.openxmlformats.org/drawingml/2006/main">
+                  <a:graphicData uri="http://schemas.microsoft.com/office/word/2010/wordprocessingShape">
+                    <wps:wsp>
+                      <wps:cNvCnPr/>
+                      <wps:spPr>
+                        <a:xfrm flipH="1" flipV="1">
+                          <a:off x="0" y="0"/>
+                          <a:ext cx="209550" cy="219075"/>
+                        </a:xfrm>
+                        <a:prstGeom prst="straightConnector1">
+                          <a:avLst/>
+                        </a:prstGeom>
+                        <a:ln>
+                          <a:tailEnd type="triangle"/>
+                        </a:ln>
+                      </wps:spPr>
+                      <wps:style>
+                        <a:lnRef idx="1">
+                          <a:schemeClr val="accent1"/>
+                        </a:lnRef>
+                        <a:fillRef idx="0">
+                          <a:schemeClr val="accent1"/>
+                        </a:fillRef>
+                        <a:effectRef idx="0">
+                          <a:schemeClr val="accent1"/>
+                        </a:effectRef>
+                        <a:fontRef idx="minor">
+                          <a:schemeClr val="tx1"/>
+                        </a:fontRef>
+                      </wps:style>
+                      <wps:bodyPr/>
+                    </wps:wsp>
+                  </a:graphicData>
+                </a:graphic>
+              </wp:anchor>
+            </w:drawing>
+          </mc:Choice>
+          <mc:Fallback>
+            <w:pict>
+              <v:shape w14:anchorId="4CAE936A" id="Conector de Seta Reta 67" o:spid="_x0000_s1026" type="#_x0000_t32" style="position:absolute;margin-left:154.2pt;margin-top:82.2pt;width:16.5pt;height:17.25pt;flip:x y;z-index:251684864;visibility:visible;mso-wrap-style:square;mso-wrap-distance-left:9pt;mso-wrap-distance-top:0;mso-wrap-distance-right:9pt;mso-wrap-distance-bottom:0;mso-position-horizontal:absolute;mso-position-horizontal-relative:text;mso-position-vertical:absolute;mso-position-vertical-relative:text" o:gfxdata="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" strokecolor="#4472c4 [3204]" strokeweight=".5pt">
+                <v:stroke endarrow="block" joinstyle="miter"/>
+              </v:shape>
+            </w:pict>
+          </mc:Fallback>
+        </mc:AlternateContent>
+      </w:r>
+      <w:r>
+        <w:drawing>
+          <wp:inline distT="0" distB="0" distL="0" distR="0" wp14:anchorId="6163C18C" wp14:editId="1BAD042E">
+            <wp:extent cx="2324424" cy="1276528"/>
+            <wp:effectExtent l="0" t="0" r="0" b="0"/>
+            <wp:docPr id="64" name="Imagem 64"/>
+            <wp:cNvGraphicFramePr>
+              <a:graphicFrameLocks xmlns:a="http://schemas.openxmlformats.org/drawingml/2006/main" noChangeAspect="1"/>
+            </wp:cNvGraphicFramePr>
+            <a:graphic xmlns:a="http://schemas.openxmlformats.org/drawingml/2006/main">
+              <a:graphicData uri="http://schemas.openxmlformats.org/drawingml/2006/picture">
+                <pic:pic xmlns:pic="http://schemas.openxmlformats.org/drawingml/2006/picture">
+                  <pic:nvPicPr>
+                    <pic:cNvPr id="1" name=""/>
+                    <pic:cNvPicPr/>
+                  </pic:nvPicPr>
+                  <pic:blipFill>
+                    <a:blip r:embed="rId49"/>
+                    <a:stretch>
+                      <a:fillRect/>
+                    </a:stretch>
+                  </pic:blipFill>
+                  <pic:spPr>
+                    <a:xfrm>
+                      <a:off x="0" y="0"/>
+                      <a:ext cx="2324424" cy="1276528"/>
+                    </a:xfrm>
+                    <a:prstGeom prst="rect">
+                      <a:avLst/>
+                    </a:prstGeom>
+                  </pic:spPr>
+                </pic:pic>
+              </a:graphicData>
+            </a:graphic>
+          </wp:inline>
+        </w:drawing>
+      </w:r>
+    </w:p>
+    <w:p>
+      <w:r>
+        <w:t>26 – Para melhorar o espaço entre os itens do menu utilizamos o seguinte código:</w:t>
+      </w:r>
+    </w:p>
+    <w:p>
+      <w:r>
+        <w:rPr>
+          <w:noProof/>
+        </w:rPr>
+        <mc:AlternateContent>
+          <mc:Choice Requires="wps">
+            <w:drawing>
+              <wp:anchor distT="0" distB="0" distL="114300" distR="114300" simplePos="0" relativeHeight="251685888" behindDoc="0" locked="0" layoutInCell="1" allowOverlap="1">
+                <wp:simplePos x="0" y="0"/>
+                <wp:positionH relativeFrom="column">
+                  <wp:posOffset>348615</wp:posOffset>
+                </wp:positionH>
+                <wp:positionV relativeFrom="paragraph">
+                  <wp:posOffset>605155</wp:posOffset>
+                </wp:positionV>
+                <wp:extent cx="161925" cy="171450"/>
+                <wp:effectExtent l="0" t="38100" r="47625" b="19050"/>
+                <wp:wrapNone/>
+                <wp:docPr id="69" name="Conector de Seta Reta 69"/>
+                <wp:cNvGraphicFramePr/>
+                <a:graphic xmlns:a="http://schemas.openxmlformats.org/drawingml/2006/main">
+                  <a:graphicData uri="http://schemas.microsoft.com/office/word/2010/wordprocessingShape">
+                    <wps:wsp>
+                      <wps:cNvCnPr/>
+                      <wps:spPr>
+                        <a:xfrm flipV="1">
+                          <a:off x="0" y="0"/>
+                          <a:ext cx="161925" cy="171450"/>
+                        </a:xfrm>
+                        <a:prstGeom prst="straightConnector1">
+                          <a:avLst/>
+                        </a:prstGeom>
+                        <a:ln>
+                          <a:tailEnd type="triangle"/>
+                        </a:ln>
+                      </wps:spPr>
+                      <wps:style>
+                        <a:lnRef idx="1">
+                          <a:schemeClr val="accent1"/>
+                        </a:lnRef>
+                        <a:fillRef idx="0">
+                          <a:schemeClr val="accent1"/>
+                        </a:fillRef>
+                        <a:effectRef idx="0">
+                          <a:schemeClr val="accent1"/>
+                        </a:effectRef>
+                        <a:fontRef idx="minor">
+                          <a:schemeClr val="tx1"/>
+                        </a:fontRef>
+                      </wps:style>
+                      <wps:bodyPr/>
+                    </wps:wsp>
+                  </a:graphicData>
+                </a:graphic>
+              </wp:anchor>
+            </w:drawing>
+          </mc:Choice>
+          <mc:Fallback>
+            <w:pict>
+              <v:shape w14:anchorId="3F82F852" id="Conector de Seta Reta 69" o:spid="_x0000_s1026" type="#_x0000_t32" style="position:absolute;margin-left:27.45pt;margin-top:47.65pt;width:12.75pt;height:13.5pt;flip:y;z-index:251685888;visibility:visible;mso-wrap-style:square;mso-wrap-distance-left:9pt;mso-wrap-distance-top:0;mso-wrap-distance-right:9pt;mso-wrap-distance-bottom:0;mso-position-horizontal:absolute;mso-position-horizontal-relative:text;mso-position-vertical:absolute;mso-position-vertical-relative:text" o:gfxdata="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" strokecolor="#4472c4 [3204]" strokeweight=".5pt">
+                <v:stroke endarrow="block" joinstyle="miter"/>
+              </v:shape>
+            </w:pict>
+          </mc:Fallback>
+        </mc:AlternateContent>
+      </w:r>
+      <w:r>
+        <w:drawing>
+          <wp:inline distT="0" distB="0" distL="0" distR="0" wp14:anchorId="0E5B22C1" wp14:editId="57BB866E">
+            <wp:extent cx="1771897" cy="847843"/>
+            <wp:effectExtent l="0" t="0" r="0" b="9525"/>
+            <wp:docPr id="68" name="Imagem 68"/>
+            <wp:cNvGraphicFramePr>
+              <a:graphicFrameLocks xmlns:a="http://schemas.openxmlformats.org/drawingml/2006/main" noChangeAspect="1"/>
+            </wp:cNvGraphicFramePr>
+            <a:graphic xmlns:a="http://schemas.openxmlformats.org/drawingml/2006/main">
+              <a:graphicData uri="http://schemas.openxmlformats.org/drawingml/2006/picture">
+                <pic:pic xmlns:pic="http://schemas.openxmlformats.org/drawingml/2006/picture">
+                  <pic:nvPicPr>
+                    <pic:cNvPr id="1" name=""/>
+                    <pic:cNvPicPr/>
+                  </pic:nvPicPr>
+                  <pic:blipFill>
+                    <a:blip r:embed="rId50"/>
+                    <a:stretch>
+                      <a:fillRect/>
+                    </a:stretch>
+                  </pic:blipFill>
+                  <pic:spPr>
+                    <a:xfrm>
+                      <a:off x="0" y="0"/>
+                      <a:ext cx="1771897" cy="847843"/>
+                    </a:xfrm>
+                    <a:prstGeom prst="rect">
+                      <a:avLst/>
+                    </a:prstGeom>
+                  </pic:spPr>
+                </pic:pic>
+              </a:graphicData>
+            </a:graphic>
+          </wp:inline>
+        </w:drawing>
+      </w:r>
+    </w:p>
+    <w:p>
+      <w:r>
+        <w:drawing>
+          <wp:inline distT="0" distB="0" distL="0" distR="0" wp14:anchorId="71A3BCFA" wp14:editId="58B556F2">
+            <wp:extent cx="3886742" cy="2934109"/>
+            <wp:effectExtent l="0" t="0" r="0" b="0"/>
+            <wp:docPr id="70" name="Imagem 70"/>
+            <wp:cNvGraphicFramePr>
+              <a:graphicFrameLocks xmlns:a="http://schemas.openxmlformats.org/drawingml/2006/main" noChangeAspect="1"/>
+            </wp:cNvGraphicFramePr>
+            <a:graphic xmlns:a="http://schemas.openxmlformats.org/drawingml/2006/main">
+              <a:graphicData uri="http://schemas.openxmlformats.org/drawingml/2006/picture">
+                <pic:pic xmlns:pic="http://schemas.openxmlformats.org/drawingml/2006/picture">
+                  <pic:nvPicPr>
+                    <pic:cNvPr id="1" name=""/>
+                    <pic:cNvPicPr/>
+                  </pic:nvPicPr>
+                  <pic:blipFill>
+                    <a:blip r:embed="rId51"/>
+                    <a:stretch>
+                      <a:fillRect/>
+                    </a:stretch>
+                  </pic:blipFill>
+                  <pic:spPr>
+                    <a:xfrm>
+                      <a:off x="0" y="0"/>
+                      <a:ext cx="3886742" cy="2934109"/>
+                    </a:xfrm>
+                    <a:prstGeom prst="rect">
+                      <a:avLst/>
+                    </a:prstGeom>
+                  </pic:spPr>
+                </pic:pic>
+              </a:graphicData>
+            </a:graphic>
+          </wp:inline>
+        </w:drawing>
+      </w:r>
+    </w:p>
+    <w:p/>
+    <w:p/>
+    <w:p/>
+    <w:p/>
+    <w:p/>
+    <w:p/>
+    <w:p/>
+    <w:p/>
+    <w:p>
+      <w:r>
+        <w:lastRenderedPageBreak/>
+        <w:t xml:space="preserve">27 </w:t>
+      </w:r>
+      <w:r>
+        <w:t>–</w:t>
+      </w:r>
+      <w:r>
+        <w:t xml:space="preserve"> </w:t>
+      </w:r>
+      <w:r>
+        <w:t xml:space="preserve">Para resetar o </w:t>
+      </w:r>
+      <w:proofErr w:type="spellStart"/>
+      <w:r>
+        <w:t>css</w:t>
+      </w:r>
+      <w:proofErr w:type="spellEnd"/>
+      <w:r>
+        <w:t xml:space="preserve"> do navegador utilizamos o reset.css onde retiramos do seguinte site:</w:t>
+      </w:r>
+    </w:p>
+    <w:p>
+      <w:hyperlink r:id="rId52" w:history="1">
+        <w:r>
+          <w:rPr>
+            <w:rStyle w:val="Hyperlink"/>
+          </w:rPr>
+          <w:t>https://meyerweb.com/eric/tools/css/reset/</w:t>
+        </w:r>
+      </w:hyperlink>
+    </w:p>
+    <w:p>
+      <w:r>
+        <w:t xml:space="preserve">criamos um arquivo chamado reset.css e adicionamos ao nosso site e ele retirou todo o </w:t>
+      </w:r>
+      <w:proofErr w:type="spellStart"/>
+      <w:r>
+        <w:t>css</w:t>
+      </w:r>
+      <w:proofErr w:type="spellEnd"/>
+      <w:r>
+        <w:t xml:space="preserve"> do navegador, deixando apenas o nosso </w:t>
+      </w:r>
+      <w:proofErr w:type="spellStart"/>
+      <w:r>
+        <w:t>css</w:t>
+      </w:r>
+      <w:proofErr w:type="spellEnd"/>
+      <w:r>
+        <w:t>.</w:t>
+      </w:r>
+    </w:p>
+    <w:p>
+      <w:r>
+        <w:drawing>
+          <wp:inline distT="0" distB="0" distL="0" distR="0" wp14:anchorId="3E1DDDB8" wp14:editId="1ACFA80C">
+            <wp:extent cx="4353533" cy="5449060"/>
+            <wp:effectExtent l="0" t="0" r="9525" b="0"/>
+            <wp:docPr id="71" name="Imagem 71"/>
+            <wp:cNvGraphicFramePr>
+              <a:graphicFrameLocks xmlns:a="http://schemas.openxmlformats.org/drawingml/2006/main" noChangeAspect="1"/>
+            </wp:cNvGraphicFramePr>
+            <a:graphic xmlns:a="http://schemas.openxmlformats.org/drawingml/2006/main">
+              <a:graphicData uri="http://schemas.openxmlformats.org/drawingml/2006/picture">
+                <pic:pic xmlns:pic="http://schemas.openxmlformats.org/drawingml/2006/picture">
+                  <pic:nvPicPr>
+                    <pic:cNvPr id="1" name=""/>
+                    <pic:cNvPicPr/>
+                  </pic:nvPicPr>
+                  <pic:blipFill>
+                    <a:blip r:embed="rId53"/>
+                    <a:stretch>
+                      <a:fillRect/>
+                    </a:stretch>
+                  </pic:blipFill>
+                  <pic:spPr>
+                    <a:xfrm>
+                      <a:off x="0" y="0"/>
+                      <a:ext cx="4353533" cy="5449060"/>
+                    </a:xfrm>
+                    <a:prstGeom prst="rect">
+                      <a:avLst/>
+                    </a:prstGeom>
+                  </pic:spPr>
+                </pic:pic>
+              </a:graphicData>
+            </a:graphic>
+          </wp:inline>
+        </w:drawing>
+      </w:r>
+      <w:r>
+        <w:drawing>
+          <wp:inline distT="0" distB="0" distL="0" distR="0" wp14:anchorId="4AB3DE3A" wp14:editId="7161328E">
+            <wp:extent cx="4343400" cy="2290193"/>
+            <wp:effectExtent l="0" t="0" r="0" b="0"/>
+            <wp:docPr id="72" name="Imagem 72"/>
+            <wp:cNvGraphicFramePr>
+              <a:graphicFrameLocks xmlns:a="http://schemas.openxmlformats.org/drawingml/2006/main" noChangeAspect="1"/>
+            </wp:cNvGraphicFramePr>
+            <a:graphic xmlns:a="http://schemas.openxmlformats.org/drawingml/2006/main">
+              <a:graphicData uri="http://schemas.openxmlformats.org/drawingml/2006/picture">
+                <pic:pic xmlns:pic="http://schemas.openxmlformats.org/drawingml/2006/picture">
+                  <pic:nvPicPr>
+                    <pic:cNvPr id="1" name=""/>
+                    <pic:cNvPicPr/>
+                  </pic:nvPicPr>
+                  <pic:blipFill>
+                    <a:blip r:embed="rId54"/>
+                    <a:stretch>
+                      <a:fillRect/>
+                    </a:stretch>
+                  </pic:blipFill>
+                  <pic:spPr>
+                    <a:xfrm>
+                      <a:off x="0" y="0"/>
+                      <a:ext cx="4389212" cy="2314349"/>
+                    </a:xfrm>
+                    <a:prstGeom prst="rect">
+                      <a:avLst/>
+                    </a:prstGeom>
+                  </pic:spPr>
+                </pic:pic>
+              </a:graphicData>
+            </a:graphic>
+          </wp:inline>
+        </w:drawing>
+      </w:r>
+    </w:p>
+    <w:p>
+      <w:r>
+        <w:lastRenderedPageBreak/>
+        <w:drawing>
+          <wp:inline distT="0" distB="0" distL="0" distR="0" wp14:anchorId="5507EE69" wp14:editId="14C35048">
+            <wp:extent cx="5400040" cy="1289685"/>
+            <wp:effectExtent l="0" t="0" r="0" b="5715"/>
+            <wp:docPr id="73" name="Imagem 73"/>
+            <wp:cNvGraphicFramePr>
+              <a:graphicFrameLocks xmlns:a="http://schemas.openxmlformats.org/drawingml/2006/main" noChangeAspect="1"/>
+            </wp:cNvGraphicFramePr>
+            <a:graphic xmlns:a="http://schemas.openxmlformats.org/drawingml/2006/main">
+              <a:graphicData uri="http://schemas.openxmlformats.org/drawingml/2006/picture">
+                <pic:pic xmlns:pic="http://schemas.openxmlformats.org/drawingml/2006/picture">
+                  <pic:nvPicPr>
+                    <pic:cNvPr id="1" name=""/>
+                    <pic:cNvPicPr/>
+                  </pic:nvPicPr>
+                  <pic:blipFill>
+                    <a:blip r:embed="rId55"/>
+                    <a:stretch>
+                      <a:fillRect/>
+                    </a:stretch>
+                  </pic:blipFill>
+                  <pic:spPr>
+                    <a:xfrm>
+                      <a:off x="0" y="0"/>
+                      <a:ext cx="5400040" cy="1289685"/>
+                    </a:xfrm>
+                    <a:prstGeom prst="rect">
+                      <a:avLst/>
+                    </a:prstGeom>
+                  </pic:spPr>
+                </pic:pic>
+              </a:graphicData>
+            </a:graphic>
+          </wp:inline>
+        </w:drawing>
+      </w:r>
+    </w:p>
+    <w:p>
+      <w:proofErr w:type="spellStart"/>
+      <w:r>
+        <w:t>Obs</w:t>
+      </w:r>
+      <w:proofErr w:type="spellEnd"/>
+      <w:r>
+        <w:t xml:space="preserve">: O reset sempre deve estar acima do nosso </w:t>
+      </w:r>
+      <w:proofErr w:type="spellStart"/>
+      <w:r>
+        <w:t>css</w:t>
+      </w:r>
+      <w:proofErr w:type="spellEnd"/>
+      <w:r>
+        <w:t xml:space="preserve">, caso contrário, ele irá resetar o nosso </w:t>
+      </w:r>
+      <w:proofErr w:type="spellStart"/>
+      <w:r>
+        <w:t>css</w:t>
+      </w:r>
+      <w:proofErr w:type="spellEnd"/>
+      <w:r>
+        <w:t xml:space="preserve"> também</w:t>
       </w:r>
       <w:bookmarkStart w:id="0" w:name="_GoBack"/>
       <w:bookmarkEnd w:id="0"/>
@@ -1307,6 +4456,119 @@
     </w:lvl>
   </w:abstractNum>
   <w:abstractNum w:abstractNumId="2" w15:restartNumberingAfterBreak="0">
+    <w:nsid w:val="35B17321"/>
+    <w:multiLevelType w:val="hybridMultilevel"/>
+    <w:tmpl w:val="2FA665E0"/>
+    <w:lvl w:ilvl="0" w:tplc="04160001">
+      <w:start w:val="1"/>
+      <w:numFmt w:val="bullet"/>
+      <w:lvlText w:val=""/>
+      <w:lvlJc w:val="left"/>
+      <w:pPr>
+        <w:ind w:left="720" w:hanging="360"/>
+      </w:pPr>
+      <w:rPr>
+        <w:rFonts w:ascii="Symbol" w:hAnsi="Symbol" w:hint="default"/>
+      </w:rPr>
+    </w:lvl>
+    <w:lvl w:ilvl="1" w:tplc="04160003" w:tentative="1">
+      <w:start w:val="1"/>
+      <w:numFmt w:val="bullet"/>
+      <w:lvlText w:val="o"/>
+      <w:lvlJc w:val="left"/>
+      <w:pPr>
+        <w:ind w:left="1440" w:hanging="360"/>
+      </w:pPr>
+      <w:rPr>
+        <w:rFonts w:ascii="Courier New" w:hAnsi="Courier New" w:cs="Courier New" w:hint="default"/>
+      </w:rPr>
+    </w:lvl>
+    <w:lvl w:ilvl="2" w:tplc="04160005" w:tentative="1">
+      <w:start w:val="1"/>
+      <w:numFmt w:val="bullet"/>
+      <w:lvlText w:val=""/>
+      <w:lvlJc w:val="left"/>
+      <w:pPr>
+        <w:ind w:left="2160" w:hanging="360"/>
+      </w:pPr>
+      <w:rPr>
+        <w:rFonts w:ascii="Wingdings" w:hAnsi="Wingdings" w:hint="default"/>
+      </w:rPr>
+    </w:lvl>
+    <w:lvl w:ilvl="3" w:tplc="04160001" w:tentative="1">
+      <w:start w:val="1"/>
+      <w:numFmt w:val="bullet"/>
+      <w:lvlText w:val=""/>
+      <w:lvlJc w:val="left"/>
+      <w:pPr>
+        <w:ind w:left="2880" w:hanging="360"/>
+      </w:pPr>
+      <w:rPr>
+        <w:rFonts w:ascii="Symbol" w:hAnsi="Symbol" w:hint="default"/>
+      </w:rPr>
+    </w:lvl>
+    <w:lvl w:ilvl="4" w:tplc="04160003" w:tentative="1">
+      <w:start w:val="1"/>
+      <w:numFmt w:val="bullet"/>
+      <w:lvlText w:val="o"/>
+      <w:lvlJc w:val="left"/>
+      <w:pPr>
+        <w:ind w:left="3600" w:hanging="360"/>
+      </w:pPr>
+      <w:rPr>
+        <w:rFonts w:ascii="Courier New" w:hAnsi="Courier New" w:cs="Courier New" w:hint="default"/>
+      </w:rPr>
+    </w:lvl>
+    <w:lvl w:ilvl="5" w:tplc="04160005" w:tentative="1">
+      <w:start w:val="1"/>
+      <w:numFmt w:val="bullet"/>
+      <w:lvlText w:val=""/>
+      <w:lvlJc w:val="left"/>
+      <w:pPr>
+        <w:ind w:left="4320" w:hanging="360"/>
+      </w:pPr>
+      <w:rPr>
+        <w:rFonts w:ascii="Wingdings" w:hAnsi="Wingdings" w:hint="default"/>
+      </w:rPr>
+    </w:lvl>
+    <w:lvl w:ilvl="6" w:tplc="04160001" w:tentative="1">
+      <w:start w:val="1"/>
+      <w:numFmt w:val="bullet"/>
+      <w:lvlText w:val=""/>
+      <w:lvlJc w:val="left"/>
+      <w:pPr>
+        <w:ind w:left="5040" w:hanging="360"/>
+      </w:pPr>
+      <w:rPr>
+        <w:rFonts w:ascii="Symbol" w:hAnsi="Symbol" w:hint="default"/>
+      </w:rPr>
+    </w:lvl>
+    <w:lvl w:ilvl="7" w:tplc="04160003" w:tentative="1">
+      <w:start w:val="1"/>
+      <w:numFmt w:val="bullet"/>
+      <w:lvlText w:val="o"/>
+      <w:lvlJc w:val="left"/>
+      <w:pPr>
+        <w:ind w:left="5760" w:hanging="360"/>
+      </w:pPr>
+      <w:rPr>
+        <w:rFonts w:ascii="Courier New" w:hAnsi="Courier New" w:cs="Courier New" w:hint="default"/>
+      </w:rPr>
+    </w:lvl>
+    <w:lvl w:ilvl="8" w:tplc="04160005" w:tentative="1">
+      <w:start w:val="1"/>
+      <w:numFmt w:val="bullet"/>
+      <w:lvlText w:val=""/>
+      <w:lvlJc w:val="left"/>
+      <w:pPr>
+        <w:ind w:left="6480" w:hanging="360"/>
+      </w:pPr>
+      <w:rPr>
+        <w:rFonts w:ascii="Wingdings" w:hAnsi="Wingdings" w:hint="default"/>
+      </w:rPr>
+    </w:lvl>
+  </w:abstractNum>
+  <w:abstractNum w:abstractNumId="3" w15:restartNumberingAfterBreak="0">
     <w:nsid w:val="480C2855"/>
     <w:multiLevelType w:val="hybridMultilevel"/>
     <w:tmpl w:val="E5C43278"/>
@@ -1419,7 +4681,7 @@
       </w:rPr>
     </w:lvl>
   </w:abstractNum>
-  <w:abstractNum w:abstractNumId="3" w15:restartNumberingAfterBreak="0">
+  <w:abstractNum w:abstractNumId="4" w15:restartNumberingAfterBreak="0">
     <w:nsid w:val="4F52492F"/>
     <w:multiLevelType w:val="hybridMultilevel"/>
     <w:tmpl w:val="9CA03F90"/>
@@ -1508,7 +4770,120 @@
       </w:pPr>
     </w:lvl>
   </w:abstractNum>
-  <w:abstractNum w:abstractNumId="4" w15:restartNumberingAfterBreak="0">
+  <w:abstractNum w:abstractNumId="5" w15:restartNumberingAfterBreak="0">
+    <w:nsid w:val="55DE784F"/>
+    <w:multiLevelType w:val="hybridMultilevel"/>
+    <w:tmpl w:val="5DC851B4"/>
+    <w:lvl w:ilvl="0" w:tplc="04160001">
+      <w:start w:val="1"/>
+      <w:numFmt w:val="bullet"/>
+      <w:lvlText w:val=""/>
+      <w:lvlJc w:val="left"/>
+      <w:pPr>
+        <w:ind w:left="720" w:hanging="360"/>
+      </w:pPr>
+      <w:rPr>
+        <w:rFonts w:ascii="Symbol" w:hAnsi="Symbol" w:hint="default"/>
+      </w:rPr>
+    </w:lvl>
+    <w:lvl w:ilvl="1" w:tplc="04160003" w:tentative="1">
+      <w:start w:val="1"/>
+      <w:numFmt w:val="bullet"/>
+      <w:lvlText w:val="o"/>
+      <w:lvlJc w:val="left"/>
+      <w:pPr>
+        <w:ind w:left="1440" w:hanging="360"/>
+      </w:pPr>
+      <w:rPr>
+        <w:rFonts w:ascii="Courier New" w:hAnsi="Courier New" w:cs="Courier New" w:hint="default"/>
+      </w:rPr>
+    </w:lvl>
+    <w:lvl w:ilvl="2" w:tplc="04160005" w:tentative="1">
+      <w:start w:val="1"/>
+      <w:numFmt w:val="bullet"/>
+      <w:lvlText w:val=""/>
+      <w:lvlJc w:val="left"/>
+      <w:pPr>
+        <w:ind w:left="2160" w:hanging="360"/>
+      </w:pPr>
+      <w:rPr>
+        <w:rFonts w:ascii="Wingdings" w:hAnsi="Wingdings" w:hint="default"/>
+      </w:rPr>
+    </w:lvl>
+    <w:lvl w:ilvl="3" w:tplc="04160001" w:tentative="1">
+      <w:start w:val="1"/>
+      <w:numFmt w:val="bullet"/>
+      <w:lvlText w:val=""/>
+      <w:lvlJc w:val="left"/>
+      <w:pPr>
+        <w:ind w:left="2880" w:hanging="360"/>
+      </w:pPr>
+      <w:rPr>
+        <w:rFonts w:ascii="Symbol" w:hAnsi="Symbol" w:hint="default"/>
+      </w:rPr>
+    </w:lvl>
+    <w:lvl w:ilvl="4" w:tplc="04160003" w:tentative="1">
+      <w:start w:val="1"/>
+      <w:numFmt w:val="bullet"/>
+      <w:lvlText w:val="o"/>
+      <w:lvlJc w:val="left"/>
+      <w:pPr>
+        <w:ind w:left="3600" w:hanging="360"/>
+      </w:pPr>
+      <w:rPr>
+        <w:rFonts w:ascii="Courier New" w:hAnsi="Courier New" w:cs="Courier New" w:hint="default"/>
+      </w:rPr>
+    </w:lvl>
+    <w:lvl w:ilvl="5" w:tplc="04160005" w:tentative="1">
+      <w:start w:val="1"/>
+      <w:numFmt w:val="bullet"/>
+      <w:lvlText w:val=""/>
+      <w:lvlJc w:val="left"/>
+      <w:pPr>
+        <w:ind w:left="4320" w:hanging="360"/>
+      </w:pPr>
+      <w:rPr>
+        <w:rFonts w:ascii="Wingdings" w:hAnsi="Wingdings" w:hint="default"/>
+      </w:rPr>
+    </w:lvl>
+    <w:lvl w:ilvl="6" w:tplc="04160001" w:tentative="1">
+      <w:start w:val="1"/>
+      <w:numFmt w:val="bullet"/>
+      <w:lvlText w:val=""/>
+      <w:lvlJc w:val="left"/>
+      <w:pPr>
+        <w:ind w:left="5040" w:hanging="360"/>
+      </w:pPr>
+      <w:rPr>
+        <w:rFonts w:ascii="Symbol" w:hAnsi="Symbol" w:hint="default"/>
+      </w:rPr>
+    </w:lvl>
+    <w:lvl w:ilvl="7" w:tplc="04160003" w:tentative="1">
+      <w:start w:val="1"/>
+      <w:numFmt w:val="bullet"/>
+      <w:lvlText w:val="o"/>
+      <w:lvlJc w:val="left"/>
+      <w:pPr>
+        <w:ind w:left="5760" w:hanging="360"/>
+      </w:pPr>
+      <w:rPr>
+        <w:rFonts w:ascii="Courier New" w:hAnsi="Courier New" w:cs="Courier New" w:hint="default"/>
+      </w:rPr>
+    </w:lvl>
+    <w:lvl w:ilvl="8" w:tplc="04160005" w:tentative="1">
+      <w:start w:val="1"/>
+      <w:numFmt w:val="bullet"/>
+      <w:lvlText w:val=""/>
+      <w:lvlJc w:val="left"/>
+      <w:pPr>
+        <w:ind w:left="6480" w:hanging="360"/>
+      </w:pPr>
+      <w:rPr>
+        <w:rFonts w:ascii="Wingdings" w:hAnsi="Wingdings" w:hint="default"/>
+      </w:rPr>
+    </w:lvl>
+  </w:abstractNum>
+  <w:abstractNum w:abstractNumId="6" w15:restartNumberingAfterBreak="0">
     <w:nsid w:val="5D2C3BB7"/>
     <w:multiLevelType w:val="hybridMultilevel"/>
     <w:tmpl w:val="152225AA"/>
@@ -1601,16 +4976,22 @@
     <w:abstractNumId w:val="1"/>
   </w:num>
   <w:num w:numId="2">
-    <w:abstractNumId w:val="4"/>
+    <w:abstractNumId w:val="6"/>
   </w:num>
   <w:num w:numId="3">
-    <w:abstractNumId w:val="2"/>
+    <w:abstractNumId w:val="3"/>
   </w:num>
   <w:num w:numId="4">
-    <w:abstractNumId w:val="3"/>
+    <w:abstractNumId w:val="4"/>
   </w:num>
   <w:num w:numId="5">
     <w:abstractNumId w:val="0"/>
+  </w:num>
+  <w:num w:numId="6">
+    <w:abstractNumId w:val="2"/>
+  </w:num>
+  <w:num w:numId="7">
+    <w:abstractNumId w:val="5"/>
   </w:num>
 </w:numbering>
 </file>
@@ -2370,4 +5751,16 @@
     </a:ext>
   </a:extLst>
 </a:theme>
+</file>
+
+<file path=customXml/item1.xml><?xml version="1.0" encoding="utf-8"?>
+<b:Sources xmlns:b="http://schemas.openxmlformats.org/officeDocument/2006/bibliography" xmlns="http://schemas.openxmlformats.org/officeDocument/2006/bibliography" SelectedStyle="\APASixthEditionOfficeOnline.xsl" StyleName="APA" Version="6"/>
+</file>
+
+<file path=customXml/itemProps1.xml><?xml version="1.0" encoding="utf-8"?>
+<ds:datastoreItem xmlns:ds="http://schemas.openxmlformats.org/officeDocument/2006/customXml" ds:itemID="{8377670F-9282-4386-9FB9-B7F39CF20D88}">
+  <ds:schemaRefs>
+    <ds:schemaRef ds:uri="http://schemas.openxmlformats.org/officeDocument/2006/bibliography"/>
+  </ds:schemaRefs>
+</ds:datastoreItem>
 </file>
</xml_diff>

<commit_message>
continuando o site Space for Men com o professor
</commit_message>
<xml_diff>
--- a/apostila/Projeto Space For Men.docx
+++ b/apostila/Projeto Space For Men.docx
@@ -2986,6 +2986,9 @@
     </w:p>
     <w:p>
       <w:r>
+        <w:rPr>
+          <w:noProof/>
+        </w:rPr>
         <w:drawing>
           <wp:inline distT="0" distB="0" distL="0" distR="0" wp14:anchorId="1D718933" wp14:editId="185E7169">
             <wp:extent cx="1438476" cy="1533739"/>
@@ -3168,6 +3171,9 @@
         </mc:AlternateContent>
       </w:r>
       <w:r>
+        <w:rPr>
+          <w:noProof/>
+        </w:rPr>
         <w:drawing>
           <wp:inline distT="0" distB="0" distL="0" distR="0" wp14:anchorId="1F238ABF" wp14:editId="769925EC">
             <wp:extent cx="5400040" cy="1070610"/>
@@ -3221,6 +3227,9 @@
     </w:p>
     <w:p>
       <w:r>
+        <w:rPr>
+          <w:noProof/>
+        </w:rPr>
         <w:drawing>
           <wp:inline distT="0" distB="0" distL="0" distR="0" wp14:anchorId="31C26F4D" wp14:editId="61529B59">
             <wp:extent cx="3896269" cy="1629002"/>
@@ -3277,6 +3286,9 @@
     </w:p>
     <w:p>
       <w:r>
+        <w:rPr>
+          <w:noProof/>
+        </w:rPr>
         <w:drawing>
           <wp:inline distT="0" distB="0" distL="0" distR="0" wp14:anchorId="18764B42" wp14:editId="50863D90">
             <wp:extent cx="2819794" cy="685896"/>
@@ -3316,6 +3328,9 @@
     </w:p>
     <w:p>
       <w:r>
+        <w:rPr>
+          <w:noProof/>
+        </w:rPr>
         <w:drawing>
           <wp:inline distT="0" distB="0" distL="0" distR="0" wp14:anchorId="263644AD" wp14:editId="0137DFC0">
             <wp:extent cx="3696216" cy="1829055"/>
@@ -3360,6 +3375,9 @@
     </w:p>
     <w:p>
       <w:r>
+        <w:rPr>
+          <w:noProof/>
+        </w:rPr>
         <w:drawing>
           <wp:inline distT="0" distB="0" distL="0" distR="0" wp14:anchorId="2A18235E" wp14:editId="6FAB8789">
             <wp:extent cx="4305901" cy="1952898"/>
@@ -3417,6 +3435,9 @@
     </w:p>
     <w:p>
       <w:r>
+        <w:rPr>
+          <w:noProof/>
+        </w:rPr>
         <w:drawing>
           <wp:inline distT="0" distB="0" distL="0" distR="0" wp14:anchorId="23B2C56C" wp14:editId="65641878">
             <wp:extent cx="1533739" cy="590632"/>
@@ -3456,6 +3477,9 @@
     </w:p>
     <w:p>
       <w:r>
+        <w:rPr>
+          <w:noProof/>
+        </w:rPr>
         <w:drawing>
           <wp:inline distT="0" distB="0" distL="0" distR="0" wp14:anchorId="7510D26A" wp14:editId="7B37610A">
             <wp:extent cx="2200582" cy="2924583"/>
@@ -3525,6 +3549,9 @@
     </w:p>
     <w:p>
       <w:r>
+        <w:rPr>
+          <w:noProof/>
+        </w:rPr>
         <w:drawing>
           <wp:inline distT="0" distB="0" distL="0" distR="0" wp14:anchorId="1995749C" wp14:editId="58B1A500">
             <wp:extent cx="2295845" cy="762106"/>
@@ -3562,6 +3589,9 @@
         </w:drawing>
       </w:r>
       <w:r>
+        <w:rPr>
+          <w:noProof/>
+        </w:rPr>
         <w:drawing>
           <wp:inline distT="0" distB="0" distL="0" distR="0" wp14:anchorId="10FC8C8E" wp14:editId="43A8D244">
             <wp:extent cx="2847975" cy="2895600"/>
@@ -3873,6 +3903,9 @@
         </mc:AlternateContent>
       </w:r>
       <w:r>
+        <w:rPr>
+          <w:noProof/>
+        </w:rPr>
         <w:drawing>
           <wp:inline distT="0" distB="0" distL="0" distR="0" wp14:anchorId="6163C18C" wp14:editId="1BAD042E">
             <wp:extent cx="2324424" cy="1276528"/>
@@ -3983,6 +4016,9 @@
         </mc:AlternateContent>
       </w:r>
       <w:r>
+        <w:rPr>
+          <w:noProof/>
+        </w:rPr>
         <w:drawing>
           <wp:inline distT="0" distB="0" distL="0" distR="0" wp14:anchorId="0E5B22C1" wp14:editId="57BB866E">
             <wp:extent cx="1771897" cy="847843"/>
@@ -4022,6 +4058,9 @@
     </w:p>
     <w:p>
       <w:r>
+        <w:rPr>
+          <w:noProof/>
+        </w:rPr>
         <w:drawing>
           <wp:inline distT="0" distB="0" distL="0" distR="0" wp14:anchorId="71A3BCFA" wp14:editId="58B556F2">
             <wp:extent cx="3886742" cy="2934109"/>
@@ -4123,6 +4162,9 @@
     </w:p>
     <w:p>
       <w:r>
+        <w:rPr>
+          <w:noProof/>
+        </w:rPr>
         <w:drawing>
           <wp:inline distT="0" distB="0" distL="0" distR="0" wp14:anchorId="3E1DDDB8" wp14:editId="1ACFA80C">
             <wp:extent cx="4353533" cy="5449060"/>
@@ -4160,6 +4202,9 @@
         </w:drawing>
       </w:r>
       <w:r>
+        <w:rPr>
+          <w:noProof/>
+        </w:rPr>
         <w:drawing>
           <wp:inline distT="0" distB="0" distL="0" distR="0" wp14:anchorId="4AB3DE3A" wp14:editId="7161328E">
             <wp:extent cx="4343400" cy="2290193"/>
@@ -4199,6 +4244,9 @@
     </w:p>
     <w:p>
       <w:r>
+        <w:rPr>
+          <w:noProof/>
+        </w:rPr>
         <w:lastRenderedPageBreak/>
         <w:drawing>
           <wp:inline distT="0" distB="0" distL="0" distR="0" wp14:anchorId="5507EE69" wp14:editId="14C35048">
@@ -4262,6 +4310,748 @@
       <w:r>
         <w:t xml:space="preserve"> também</w:t>
       </w:r>
+    </w:p>
+    <w:p>
+      <w:pPr>
+        <w:jc w:val="center"/>
+      </w:pPr>
+      <w:r>
+        <w:t xml:space="preserve">28 </w:t>
+      </w:r>
+      <w:r>
+        <w:t>–</w:t>
+      </w:r>
+      <w:r>
+        <w:t xml:space="preserve"> </w:t>
+      </w:r>
+      <w:r>
+        <w:t>Trabalhando com posicionamento</w:t>
+      </w:r>
+    </w:p>
+    <w:p>
+      <w:r>
+        <w:t xml:space="preserve">Queremos centralizar o nosso menu e a imagem dentro do header, para isso vimos 3 tipos de posicionamento: </w:t>
+      </w:r>
+    </w:p>
+    <w:p>
+      <w:pPr>
+        <w:pStyle w:val="PargrafodaLista"/>
+        <w:numPr>
+          <w:ilvl w:val="0"/>
+          <w:numId w:val="8"/>
+        </w:numPr>
+      </w:pPr>
+      <w:proofErr w:type="spellStart"/>
+      <w:r>
+        <w:t>Static</w:t>
+      </w:r>
+      <w:proofErr w:type="spellEnd"/>
+      <w:r>
+        <w:t xml:space="preserve"> = Ele fica fixo na posição de origem.</w:t>
+      </w:r>
+    </w:p>
+    <w:p>
+      <w:pPr>
+        <w:pStyle w:val="PargrafodaLista"/>
+        <w:numPr>
+          <w:ilvl w:val="0"/>
+          <w:numId w:val="8"/>
+        </w:numPr>
+      </w:pPr>
+      <w:proofErr w:type="spellStart"/>
+      <w:r>
+        <w:t>Relative</w:t>
+      </w:r>
+      <w:proofErr w:type="spellEnd"/>
+      <w:r>
+        <w:t xml:space="preserve"> = ele anda conforme sua posição original.</w:t>
+      </w:r>
+    </w:p>
+    <w:p>
+      <w:pPr>
+        <w:pStyle w:val="PargrafodaLista"/>
+        <w:numPr>
+          <w:ilvl w:val="0"/>
+          <w:numId w:val="8"/>
+        </w:numPr>
+      </w:pPr>
+      <w:proofErr w:type="spellStart"/>
+      <w:r>
+        <w:t>A</w:t>
+      </w:r>
+      <w:r>
+        <w:t>b</w:t>
+      </w:r>
+      <w:r>
+        <w:t>solute</w:t>
+      </w:r>
+      <w:proofErr w:type="spellEnd"/>
+      <w:r>
+        <w:t xml:space="preserve"> = ele anda conforme a posição absoluta do sita.</w:t>
+      </w:r>
+    </w:p>
+    <w:p>
+      <w:r>
+        <w:rPr>
+          <w:noProof/>
+        </w:rPr>
+        <mc:AlternateContent>
+          <mc:Choice Requires="wps">
+            <w:drawing>
+              <wp:anchor distT="0" distB="0" distL="114300" distR="114300" simplePos="0" relativeHeight="251687936" behindDoc="0" locked="0" layoutInCell="1" allowOverlap="1">
+                <wp:simplePos x="0" y="0"/>
+                <wp:positionH relativeFrom="column">
+                  <wp:posOffset>605790</wp:posOffset>
+                </wp:positionH>
+                <wp:positionV relativeFrom="paragraph">
+                  <wp:posOffset>370204</wp:posOffset>
+                </wp:positionV>
+                <wp:extent cx="1638300" cy="1323975"/>
+                <wp:effectExtent l="38100" t="0" r="19050" b="47625"/>
+                <wp:wrapNone/>
+                <wp:docPr id="78" name="Conector de Seta Reta 78"/>
+                <wp:cNvGraphicFramePr/>
+                <a:graphic xmlns:a="http://schemas.openxmlformats.org/drawingml/2006/main">
+                  <a:graphicData uri="http://schemas.microsoft.com/office/word/2010/wordprocessingShape">
+                    <wps:wsp>
+                      <wps:cNvCnPr/>
+                      <wps:spPr>
+                        <a:xfrm flipH="1">
+                          <a:off x="0" y="0"/>
+                          <a:ext cx="1638300" cy="1323975"/>
+                        </a:xfrm>
+                        <a:prstGeom prst="straightConnector1">
+                          <a:avLst/>
+                        </a:prstGeom>
+                        <a:ln>
+                          <a:tailEnd type="triangle"/>
+                        </a:ln>
+                      </wps:spPr>
+                      <wps:style>
+                        <a:lnRef idx="1">
+                          <a:schemeClr val="accent1"/>
+                        </a:lnRef>
+                        <a:fillRef idx="0">
+                          <a:schemeClr val="accent1"/>
+                        </a:fillRef>
+                        <a:effectRef idx="0">
+                          <a:schemeClr val="accent1"/>
+                        </a:effectRef>
+                        <a:fontRef idx="minor">
+                          <a:schemeClr val="tx1"/>
+                        </a:fontRef>
+                      </wps:style>
+                      <wps:bodyPr/>
+                    </wps:wsp>
+                  </a:graphicData>
+                </a:graphic>
+              </wp:anchor>
+            </w:drawing>
+          </mc:Choice>
+          <mc:Fallback>
+            <w:pict>
+              <v:shapetype w14:anchorId="77A4E527" id="_x0000_t32" coordsize="21600,21600" o:spt="32" o:oned="t" path="m,l21600,21600e" filled="f">
+                <v:path arrowok="t" fillok="f" o:connecttype="none"/>
+                <o:lock v:ext="edit" shapetype="t"/>
+              </v:shapetype>
+              <v:shape id="Conector de Seta Reta 78" o:spid="_x0000_s1026" type="#_x0000_t32" style="position:absolute;margin-left:47.7pt;margin-top:29.15pt;width:129pt;height:104.25pt;flip:x;z-index:251687936;visibility:visible;mso-wrap-style:square;mso-wrap-distance-left:9pt;mso-wrap-distance-top:0;mso-wrap-distance-right:9pt;mso-wrap-distance-bottom:0;mso-position-horizontal:absolute;mso-position-horizontal-relative:text;mso-position-vertical:absolute;mso-position-vertical-relative:text" o:gfxdata="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" strokecolor="#4472c4 [3204]" strokeweight=".5pt">
+                <v:stroke endarrow="block" joinstyle="miter"/>
+              </v:shape>
+            </w:pict>
+          </mc:Fallback>
+        </mc:AlternateContent>
+      </w:r>
+      <w:r>
+        <w:rPr>
+          <w:noProof/>
+        </w:rPr>
+        <mc:AlternateContent>
+          <mc:Choice Requires="wps">
+            <w:drawing>
+              <wp:anchor distT="0" distB="0" distL="114300" distR="114300" simplePos="0" relativeHeight="251686912" behindDoc="0" locked="0" layoutInCell="1" allowOverlap="1">
+                <wp:simplePos x="0" y="0"/>
+                <wp:positionH relativeFrom="column">
+                  <wp:posOffset>701040</wp:posOffset>
+                </wp:positionH>
+                <wp:positionV relativeFrom="paragraph">
+                  <wp:posOffset>370205</wp:posOffset>
+                </wp:positionV>
+                <wp:extent cx="2857500" cy="390525"/>
+                <wp:effectExtent l="0" t="0" r="76200" b="85725"/>
+                <wp:wrapNone/>
+                <wp:docPr id="77" name="Conector de Seta Reta 77"/>
+                <wp:cNvGraphicFramePr/>
+                <a:graphic xmlns:a="http://schemas.openxmlformats.org/drawingml/2006/main">
+                  <a:graphicData uri="http://schemas.microsoft.com/office/word/2010/wordprocessingShape">
+                    <wps:wsp>
+                      <wps:cNvCnPr/>
+                      <wps:spPr>
+                        <a:xfrm>
+                          <a:off x="0" y="0"/>
+                          <a:ext cx="2857500" cy="390525"/>
+                        </a:xfrm>
+                        <a:prstGeom prst="straightConnector1">
+                          <a:avLst/>
+                        </a:prstGeom>
+                        <a:ln>
+                          <a:tailEnd type="triangle"/>
+                        </a:ln>
+                      </wps:spPr>
+                      <wps:style>
+                        <a:lnRef idx="1">
+                          <a:schemeClr val="accent1"/>
+                        </a:lnRef>
+                        <a:fillRef idx="0">
+                          <a:schemeClr val="accent1"/>
+                        </a:fillRef>
+                        <a:effectRef idx="0">
+                          <a:schemeClr val="accent1"/>
+                        </a:effectRef>
+                        <a:fontRef idx="minor">
+                          <a:schemeClr val="tx1"/>
+                        </a:fontRef>
+                      </wps:style>
+                      <wps:bodyPr/>
+                    </wps:wsp>
+                  </a:graphicData>
+                </a:graphic>
+              </wp:anchor>
+            </w:drawing>
+          </mc:Choice>
+          <mc:Fallback>
+            <w:pict>
+              <v:shape w14:anchorId="097001F0" id="Conector de Seta Reta 77" o:spid="_x0000_s1026" type="#_x0000_t32" style="position:absolute;margin-left:55.2pt;margin-top:29.15pt;width:225pt;height:30.75pt;z-index:251686912;visibility:visible;mso-wrap-style:square;mso-wrap-distance-left:9pt;mso-wrap-distance-top:0;mso-wrap-distance-right:9pt;mso-wrap-distance-bottom:0;mso-position-horizontal:absolute;mso-position-horizontal-relative:text;mso-position-vertical:absolute;mso-position-vertical-relative:text" o:gfxdata="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" strokecolor="#4472c4 [3204]" strokeweight=".5pt">
+                <v:stroke endarrow="block" joinstyle="miter"/>
+              </v:shape>
+            </w:pict>
+          </mc:Fallback>
+        </mc:AlternateContent>
+      </w:r>
+      <w:r>
+        <w:t xml:space="preserve">29 – Ao centralizar a altura do menu dentro do header, utilizamos o inspecionador de código ou </w:t>
+      </w:r>
+      <w:proofErr w:type="spellStart"/>
+      <w:r>
+        <w:t>DevTools</w:t>
+      </w:r>
+      <w:proofErr w:type="spellEnd"/>
+      <w:r>
+        <w:t xml:space="preserve"> (F12) para saber a altura do elemento dentro do header </w:t>
+      </w:r>
+    </w:p>
+    <w:p>
+      <w:r>
+        <w:drawing>
+          <wp:inline distT="0" distB="0" distL="0" distR="0" wp14:anchorId="3A4F7370">
+            <wp:extent cx="6032425" cy="1314450"/>
+            <wp:effectExtent l="0" t="0" r="6985" b="0"/>
+            <wp:docPr id="76" name="Imagem 76"/>
+            <wp:cNvGraphicFramePr>
+              <a:graphicFrameLocks xmlns:a="http://schemas.openxmlformats.org/drawingml/2006/main" noChangeAspect="1"/>
+            </wp:cNvGraphicFramePr>
+            <a:graphic xmlns:a="http://schemas.openxmlformats.org/drawingml/2006/main">
+              <a:graphicData uri="http://schemas.openxmlformats.org/drawingml/2006/picture">
+                <pic:pic xmlns:pic="http://schemas.openxmlformats.org/drawingml/2006/picture">
+                  <pic:nvPicPr>
+                    <pic:cNvPr id="1" name=""/>
+                    <pic:cNvPicPr/>
+                  </pic:nvPicPr>
+                  <pic:blipFill>
+                    <a:blip r:embed="rId56">
+                      <a:extLst>
+                        <a:ext uri="{28A0092B-C50C-407E-A947-70E740481C1C}">
+                          <a14:useLocalDpi xmlns:a14="http://schemas.microsoft.com/office/drawing/2010/main" val="0"/>
+                        </a:ext>
+                      </a:extLst>
+                    </a:blip>
+                    <a:stretch>
+                      <a:fillRect/>
+                    </a:stretch>
+                  </pic:blipFill>
+                  <pic:spPr>
+                    <a:xfrm>
+                      <a:off x="0" y="0"/>
+                      <a:ext cx="6032425" cy="1314450"/>
+                    </a:xfrm>
+                    <a:prstGeom prst="rect">
+                      <a:avLst/>
+                    </a:prstGeom>
+                  </pic:spPr>
+                </pic:pic>
+              </a:graphicData>
+            </a:graphic>
+          </wp:inline>
+        </w:drawing>
+      </w:r>
+    </w:p>
+    <w:p>
+      <w:r>
+        <w:t>Conforme imagem acima verificamos que é 253px a altura do header então dividimos por 2 e colocamos em nosso código o arredondamento do valor de 126px</w:t>
+      </w:r>
+    </w:p>
+    <w:p>
+      <w:r>
+        <w:drawing>
+          <wp:inline distT="0" distB="0" distL="0" distR="0" wp14:anchorId="2FFD63E8" wp14:editId="14682A8C">
+            <wp:extent cx="1914792" cy="981212"/>
+            <wp:effectExtent l="0" t="0" r="9525" b="9525"/>
+            <wp:docPr id="80" name="Imagem 80"/>
+            <wp:cNvGraphicFramePr>
+              <a:graphicFrameLocks xmlns:a="http://schemas.openxmlformats.org/drawingml/2006/main" noChangeAspect="1"/>
+            </wp:cNvGraphicFramePr>
+            <a:graphic xmlns:a="http://schemas.openxmlformats.org/drawingml/2006/main">
+              <a:graphicData uri="http://schemas.openxmlformats.org/drawingml/2006/picture">
+                <pic:pic xmlns:pic="http://schemas.openxmlformats.org/drawingml/2006/picture">
+                  <pic:nvPicPr>
+                    <pic:cNvPr id="1" name=""/>
+                    <pic:cNvPicPr/>
+                  </pic:nvPicPr>
+                  <pic:blipFill>
+                    <a:blip r:embed="rId57"/>
+                    <a:stretch>
+                      <a:fillRect/>
+                    </a:stretch>
+                  </pic:blipFill>
+                  <pic:spPr>
+                    <a:xfrm>
+                      <a:off x="0" y="0"/>
+                      <a:ext cx="1914792" cy="981212"/>
+                    </a:xfrm>
+                    <a:prstGeom prst="rect">
+                      <a:avLst/>
+                    </a:prstGeom>
+                  </pic:spPr>
+                </pic:pic>
+              </a:graphicData>
+            </a:graphic>
+          </wp:inline>
+        </w:drawing>
+      </w:r>
+    </w:p>
+    <w:p/>
+    <w:p/>
+    <w:p/>
+    <w:p/>
+    <w:p/>
+    <w:p/>
+    <w:p/>
+    <w:p>
+      <w:r>
+        <w:lastRenderedPageBreak/>
+        <w:t>30</w:t>
+      </w:r>
+      <w:r>
+        <w:t xml:space="preserve"> – Para centralizar o logo e nossa lista (menu) envolvemos eles dentro uma </w:t>
+      </w:r>
+      <w:proofErr w:type="spellStart"/>
+      <w:r>
+        <w:t>div</w:t>
+      </w:r>
+      <w:proofErr w:type="spellEnd"/>
+      <w:r>
+        <w:t xml:space="preserve"> chamada caixa.</w:t>
+      </w:r>
+    </w:p>
+    <w:p>
+      <w:r>
+        <w:rPr>
+          <w:noProof/>
+        </w:rPr>
+        <mc:AlternateContent>
+          <mc:Choice Requires="wps">
+            <w:drawing>
+              <wp:anchor distT="0" distB="0" distL="114300" distR="114300" simplePos="0" relativeHeight="251689984" behindDoc="0" locked="0" layoutInCell="1" allowOverlap="1">
+                <wp:simplePos x="0" y="0"/>
+                <wp:positionH relativeFrom="column">
+                  <wp:posOffset>805815</wp:posOffset>
+                </wp:positionH>
+                <wp:positionV relativeFrom="paragraph">
+                  <wp:posOffset>1916430</wp:posOffset>
+                </wp:positionV>
+                <wp:extent cx="1085850" cy="228600"/>
+                <wp:effectExtent l="19050" t="57150" r="19050" b="19050"/>
+                <wp:wrapNone/>
+                <wp:docPr id="83" name="Conector de Seta Reta 83"/>
+                <wp:cNvGraphicFramePr/>
+                <a:graphic xmlns:a="http://schemas.openxmlformats.org/drawingml/2006/main">
+                  <a:graphicData uri="http://schemas.microsoft.com/office/word/2010/wordprocessingShape">
+                    <wps:wsp>
+                      <wps:cNvCnPr/>
+                      <wps:spPr>
+                        <a:xfrm flipH="1" flipV="1">
+                          <a:off x="0" y="0"/>
+                          <a:ext cx="1085850" cy="228600"/>
+                        </a:xfrm>
+                        <a:prstGeom prst="straightConnector1">
+                          <a:avLst/>
+                        </a:prstGeom>
+                        <a:ln>
+                          <a:tailEnd type="triangle"/>
+                        </a:ln>
+                      </wps:spPr>
+                      <wps:style>
+                        <a:lnRef idx="1">
+                          <a:schemeClr val="accent1"/>
+                        </a:lnRef>
+                        <a:fillRef idx="0">
+                          <a:schemeClr val="accent1"/>
+                        </a:fillRef>
+                        <a:effectRef idx="0">
+                          <a:schemeClr val="accent1"/>
+                        </a:effectRef>
+                        <a:fontRef idx="minor">
+                          <a:schemeClr val="tx1"/>
+                        </a:fontRef>
+                      </wps:style>
+                      <wps:bodyPr/>
+                    </wps:wsp>
+                  </a:graphicData>
+                </a:graphic>
+              </wp:anchor>
+            </w:drawing>
+          </mc:Choice>
+          <mc:Fallback>
+            <w:pict>
+              <v:shape w14:anchorId="227BC5A6" id="Conector de Seta Reta 83" o:spid="_x0000_s1026" type="#_x0000_t32" style="position:absolute;margin-left:63.45pt;margin-top:150.9pt;width:85.5pt;height:18pt;flip:x y;z-index:251689984;visibility:visible;mso-wrap-style:square;mso-wrap-distance-left:9pt;mso-wrap-distance-top:0;mso-wrap-distance-right:9pt;mso-wrap-distance-bottom:0;mso-position-horizontal:absolute;mso-position-horizontal-relative:text;mso-position-vertical:absolute;mso-position-vertical-relative:text" o:gfxdata="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" strokecolor="#4472c4 [3204]" strokeweight=".5pt">
+                <v:stroke endarrow="block" joinstyle="miter"/>
+              </v:shape>
+            </w:pict>
+          </mc:Fallback>
+        </mc:AlternateContent>
+      </w:r>
+      <w:r>
+        <w:rPr>
+          <w:noProof/>
+        </w:rPr>
+        <mc:AlternateContent>
+          <mc:Choice Requires="wps">
+            <w:drawing>
+              <wp:anchor distT="0" distB="0" distL="114300" distR="114300" simplePos="0" relativeHeight="251688960" behindDoc="0" locked="0" layoutInCell="1" allowOverlap="1">
+                <wp:simplePos x="0" y="0"/>
+                <wp:positionH relativeFrom="column">
+                  <wp:posOffset>1796415</wp:posOffset>
+                </wp:positionH>
+                <wp:positionV relativeFrom="paragraph">
+                  <wp:posOffset>97155</wp:posOffset>
+                </wp:positionV>
+                <wp:extent cx="885825" cy="142875"/>
+                <wp:effectExtent l="38100" t="0" r="28575" b="85725"/>
+                <wp:wrapNone/>
+                <wp:docPr id="82" name="Conector de Seta Reta 82"/>
+                <wp:cNvGraphicFramePr/>
+                <a:graphic xmlns:a="http://schemas.openxmlformats.org/drawingml/2006/main">
+                  <a:graphicData uri="http://schemas.microsoft.com/office/word/2010/wordprocessingShape">
+                    <wps:wsp>
+                      <wps:cNvCnPr/>
+                      <wps:spPr>
+                        <a:xfrm flipH="1">
+                          <a:off x="0" y="0"/>
+                          <a:ext cx="885825" cy="142875"/>
+                        </a:xfrm>
+                        <a:prstGeom prst="straightConnector1">
+                          <a:avLst/>
+                        </a:prstGeom>
+                        <a:ln>
+                          <a:tailEnd type="triangle"/>
+                        </a:ln>
+                      </wps:spPr>
+                      <wps:style>
+                        <a:lnRef idx="1">
+                          <a:schemeClr val="accent1"/>
+                        </a:lnRef>
+                        <a:fillRef idx="0">
+                          <a:schemeClr val="accent1"/>
+                        </a:fillRef>
+                        <a:effectRef idx="0">
+                          <a:schemeClr val="accent1"/>
+                        </a:effectRef>
+                        <a:fontRef idx="minor">
+                          <a:schemeClr val="tx1"/>
+                        </a:fontRef>
+                      </wps:style>
+                      <wps:bodyPr/>
+                    </wps:wsp>
+                  </a:graphicData>
+                </a:graphic>
+              </wp:anchor>
+            </w:drawing>
+          </mc:Choice>
+          <mc:Fallback>
+            <w:pict>
+              <v:shape w14:anchorId="5C40947B" id="Conector de Seta Reta 82" o:spid="_x0000_s1026" type="#_x0000_t32" style="position:absolute;margin-left:141.45pt;margin-top:7.65pt;width:69.75pt;height:11.25pt;flip:x;z-index:251688960;visibility:visible;mso-wrap-style:square;mso-wrap-distance-left:9pt;mso-wrap-distance-top:0;mso-wrap-distance-right:9pt;mso-wrap-distance-bottom:0;mso-position-horizontal:absolute;mso-position-horizontal-relative:text;mso-position-vertical:absolute;mso-position-vertical-relative:text" o:gfxdata="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" strokecolor="#4472c4 [3204]" strokeweight=".5pt">
+                <v:stroke endarrow="block" joinstyle="miter"/>
+              </v:shape>
+            </w:pict>
+          </mc:Fallback>
+        </mc:AlternateContent>
+      </w:r>
+      <w:r>
+        <w:drawing>
+          <wp:inline distT="0" distB="0" distL="0" distR="0" wp14:anchorId="5AD0B58B" wp14:editId="512FEC0F">
+            <wp:extent cx="4601217" cy="2200582"/>
+            <wp:effectExtent l="0" t="0" r="8890" b="9525"/>
+            <wp:docPr id="81" name="Imagem 81"/>
+            <wp:cNvGraphicFramePr>
+              <a:graphicFrameLocks xmlns:a="http://schemas.openxmlformats.org/drawingml/2006/main" noChangeAspect="1"/>
+            </wp:cNvGraphicFramePr>
+            <a:graphic xmlns:a="http://schemas.openxmlformats.org/drawingml/2006/main">
+              <a:graphicData uri="http://schemas.openxmlformats.org/drawingml/2006/picture">
+                <pic:pic xmlns:pic="http://schemas.openxmlformats.org/drawingml/2006/picture">
+                  <pic:nvPicPr>
+                    <pic:cNvPr id="1" name=""/>
+                    <pic:cNvPicPr/>
+                  </pic:nvPicPr>
+                  <pic:blipFill>
+                    <a:blip r:embed="rId58"/>
+                    <a:stretch>
+                      <a:fillRect/>
+                    </a:stretch>
+                  </pic:blipFill>
+                  <pic:spPr>
+                    <a:xfrm>
+                      <a:off x="0" y="0"/>
+                      <a:ext cx="4601217" cy="2200582"/>
+                    </a:xfrm>
+                    <a:prstGeom prst="rect">
+                      <a:avLst/>
+                    </a:prstGeom>
+                  </pic:spPr>
+                </pic:pic>
+              </a:graphicData>
+            </a:graphic>
+          </wp:inline>
+        </w:drawing>
+      </w:r>
+    </w:p>
+    <w:p>
+      <w:r>
+        <w:t xml:space="preserve">31 – E definimos uma largura para a </w:t>
+      </w:r>
+      <w:proofErr w:type="spellStart"/>
+      <w:r>
+        <w:t>div</w:t>
+      </w:r>
+      <w:proofErr w:type="spellEnd"/>
+      <w:r>
+        <w:t xml:space="preserve"> caixa, assim deixando uma medida padrão e centralizamos tanto a logo quanto a lista, utilizando o </w:t>
+      </w:r>
+      <w:proofErr w:type="spellStart"/>
+      <w:r>
+        <w:t>margin</w:t>
+      </w:r>
+      <w:proofErr w:type="spellEnd"/>
+      <w:r>
+        <w:t>: 0 auto.</w:t>
+      </w:r>
+    </w:p>
+    <w:p>
+      <w:r>
+        <w:t xml:space="preserve">Como o header estava utilizando position </w:t>
+      </w:r>
+      <w:proofErr w:type="spellStart"/>
+      <w:r>
+        <w:t>absolute</w:t>
+      </w:r>
+      <w:proofErr w:type="spellEnd"/>
+      <w:r>
+        <w:t xml:space="preserve"> na </w:t>
+      </w:r>
+      <w:proofErr w:type="spellStart"/>
+      <w:r>
+        <w:t>div</w:t>
+      </w:r>
+      <w:proofErr w:type="spellEnd"/>
+      <w:r>
+        <w:t xml:space="preserve"> se fez necessário colocar position </w:t>
+      </w:r>
+      <w:proofErr w:type="spellStart"/>
+      <w:r>
+        <w:t>relative</w:t>
+      </w:r>
+      <w:proofErr w:type="spellEnd"/>
+      <w:r>
+        <w:t xml:space="preserve"> par que a lista ficasse centralizada automaticamente tanto para direita como para esquerda.</w:t>
+      </w:r>
+    </w:p>
+    <w:p>
+      <w:r>
+        <w:drawing>
+          <wp:inline distT="0" distB="0" distL="0" distR="0" wp14:anchorId="1D982A4E" wp14:editId="268D5FE8">
+            <wp:extent cx="2181225" cy="1120089"/>
+            <wp:effectExtent l="0" t="0" r="0" b="4445"/>
+            <wp:docPr id="85" name="Imagem 85"/>
+            <wp:cNvGraphicFramePr>
+              <a:graphicFrameLocks xmlns:a="http://schemas.openxmlformats.org/drawingml/2006/main" noChangeAspect="1"/>
+            </wp:cNvGraphicFramePr>
+            <a:graphic xmlns:a="http://schemas.openxmlformats.org/drawingml/2006/main">
+              <a:graphicData uri="http://schemas.openxmlformats.org/drawingml/2006/picture">
+                <pic:pic xmlns:pic="http://schemas.openxmlformats.org/drawingml/2006/picture">
+                  <pic:nvPicPr>
+                    <pic:cNvPr id="1" name=""/>
+                    <pic:cNvPicPr/>
+                  </pic:nvPicPr>
+                  <pic:blipFill>
+                    <a:blip r:embed="rId59"/>
+                    <a:stretch>
+                      <a:fillRect/>
+                    </a:stretch>
+                  </pic:blipFill>
+                  <pic:spPr>
+                    <a:xfrm>
+                      <a:off x="0" y="0"/>
+                      <a:ext cx="2198474" cy="1128947"/>
+                    </a:xfrm>
+                    <a:prstGeom prst="rect">
+                      <a:avLst/>
+                    </a:prstGeom>
+                  </pic:spPr>
+                </pic:pic>
+              </a:graphicData>
+            </a:graphic>
+          </wp:inline>
+        </w:drawing>
+      </w:r>
+      <w:r>
+        <w:drawing>
+          <wp:inline distT="0" distB="0" distL="0" distR="0" wp14:anchorId="40D9F731" wp14:editId="62F16ECF">
+            <wp:extent cx="5400040" cy="993140"/>
+            <wp:effectExtent l="0" t="0" r="0" b="0"/>
+            <wp:docPr id="86" name="Imagem 86"/>
+            <wp:cNvGraphicFramePr>
+              <a:graphicFrameLocks xmlns:a="http://schemas.openxmlformats.org/drawingml/2006/main" noChangeAspect="1"/>
+            </wp:cNvGraphicFramePr>
+            <a:graphic xmlns:a="http://schemas.openxmlformats.org/drawingml/2006/main">
+              <a:graphicData uri="http://schemas.openxmlformats.org/drawingml/2006/picture">
+                <pic:pic xmlns:pic="http://schemas.openxmlformats.org/drawingml/2006/picture">
+                  <pic:nvPicPr>
+                    <pic:cNvPr id="1" name=""/>
+                    <pic:cNvPicPr/>
+                  </pic:nvPicPr>
+                  <pic:blipFill>
+                    <a:blip r:embed="rId60"/>
+                    <a:stretch>
+                      <a:fillRect/>
+                    </a:stretch>
+                  </pic:blipFill>
+                  <pic:spPr>
+                    <a:xfrm>
+                      <a:off x="0" y="0"/>
+                      <a:ext cx="5400040" cy="993140"/>
+                    </a:xfrm>
+                    <a:prstGeom prst="rect">
+                      <a:avLst/>
+                    </a:prstGeom>
+                  </pic:spPr>
+                </pic:pic>
+              </a:graphicData>
+            </a:graphic>
+          </wp:inline>
+        </w:drawing>
+      </w:r>
+    </w:p>
+    <w:p>
+      <w:r>
+        <w:t xml:space="preserve">32 </w:t>
+      </w:r>
+      <w:r>
+        <w:t>–</w:t>
+      </w:r>
+      <w:r>
+        <w:t xml:space="preserve"> </w:t>
+      </w:r>
+      <w:r>
+        <w:t xml:space="preserve">Para melhorar o espaço interno do header utilizamos o </w:t>
+      </w:r>
+      <w:proofErr w:type="spellStart"/>
+      <w:r>
+        <w:t>padding</w:t>
+      </w:r>
+      <w:proofErr w:type="spellEnd"/>
+      <w:r>
+        <w:t xml:space="preserve"> tanto para cima quanto para baixo conforme imagem do código.</w:t>
+      </w:r>
+    </w:p>
+    <w:p>
+      <w:r>
+        <w:drawing>
+          <wp:inline distT="0" distB="0" distL="0" distR="0" wp14:anchorId="3B7A5952" wp14:editId="101A29A7">
+            <wp:extent cx="2791215" cy="714475"/>
+            <wp:effectExtent l="0" t="0" r="0" b="9525"/>
+            <wp:docPr id="87" name="Imagem 87"/>
+            <wp:cNvGraphicFramePr>
+              <a:graphicFrameLocks xmlns:a="http://schemas.openxmlformats.org/drawingml/2006/main" noChangeAspect="1"/>
+            </wp:cNvGraphicFramePr>
+            <a:graphic xmlns:a="http://schemas.openxmlformats.org/drawingml/2006/main">
+              <a:graphicData uri="http://schemas.openxmlformats.org/drawingml/2006/picture">
+                <pic:pic xmlns:pic="http://schemas.openxmlformats.org/drawingml/2006/picture">
+                  <pic:nvPicPr>
+                    <pic:cNvPr id="1" name=""/>
+                    <pic:cNvPicPr/>
+                  </pic:nvPicPr>
+                  <pic:blipFill>
+                    <a:blip r:embed="rId61"/>
+                    <a:stretch>
+                      <a:fillRect/>
+                    </a:stretch>
+                  </pic:blipFill>
+                  <pic:spPr>
+                    <a:xfrm>
+                      <a:off x="0" y="0"/>
+                      <a:ext cx="2791215" cy="714475"/>
+                    </a:xfrm>
+                    <a:prstGeom prst="rect">
+                      <a:avLst/>
+                    </a:prstGeom>
+                  </pic:spPr>
+                </pic:pic>
+              </a:graphicData>
+            </a:graphic>
+          </wp:inline>
+        </w:drawing>
+      </w:r>
+      <w:r>
+        <w:drawing>
+          <wp:inline distT="0" distB="0" distL="0" distR="0" wp14:anchorId="24917C23" wp14:editId="50AF8511">
+            <wp:extent cx="5400040" cy="1222375"/>
+            <wp:effectExtent l="0" t="0" r="0" b="0"/>
+            <wp:docPr id="88" name="Imagem 88"/>
+            <wp:cNvGraphicFramePr>
+              <a:graphicFrameLocks xmlns:a="http://schemas.openxmlformats.org/drawingml/2006/main" noChangeAspect="1"/>
+            </wp:cNvGraphicFramePr>
+            <a:graphic xmlns:a="http://schemas.openxmlformats.org/drawingml/2006/main">
+              <a:graphicData uri="http://schemas.openxmlformats.org/drawingml/2006/picture">
+                <pic:pic xmlns:pic="http://schemas.openxmlformats.org/drawingml/2006/picture">
+                  <pic:nvPicPr>
+                    <pic:cNvPr id="1" name=""/>
+                    <pic:cNvPicPr/>
+                  </pic:nvPicPr>
+                  <pic:blipFill>
+                    <a:blip r:embed="rId62"/>
+                    <a:stretch>
+                      <a:fillRect/>
+                    </a:stretch>
+                  </pic:blipFill>
+                  <pic:spPr>
+                    <a:xfrm>
+                      <a:off x="0" y="0"/>
+                      <a:ext cx="5400040" cy="1222375"/>
+                    </a:xfrm>
+                    <a:prstGeom prst="rect">
+                      <a:avLst/>
+                    </a:prstGeom>
+                  </pic:spPr>
+                </pic:pic>
+              </a:graphicData>
+            </a:graphic>
+          </wp:inline>
+        </w:drawing>
+      </w:r>
+      <w:r>
+        <w:t xml:space="preserve"> </w:t>
+      </w:r>
+    </w:p>
+    <w:p/>
+    <w:p>
       <w:bookmarkStart w:id="0" w:name="_GoBack"/>
       <w:bookmarkEnd w:id="0"/>
     </w:p>
@@ -4367,6 +5157,119 @@
     </w:lvl>
   </w:abstractNum>
   <w:abstractNum w:abstractNumId="1" w15:restartNumberingAfterBreak="0">
+    <w:nsid w:val="140707F0"/>
+    <w:multiLevelType w:val="hybridMultilevel"/>
+    <w:tmpl w:val="6BB67C74"/>
+    <w:lvl w:ilvl="0" w:tplc="04160001">
+      <w:start w:val="1"/>
+      <w:numFmt w:val="bullet"/>
+      <w:lvlText w:val=""/>
+      <w:lvlJc w:val="left"/>
+      <w:pPr>
+        <w:ind w:left="720" w:hanging="360"/>
+      </w:pPr>
+      <w:rPr>
+        <w:rFonts w:ascii="Symbol" w:hAnsi="Symbol" w:hint="default"/>
+      </w:rPr>
+    </w:lvl>
+    <w:lvl w:ilvl="1" w:tplc="04160003" w:tentative="1">
+      <w:start w:val="1"/>
+      <w:numFmt w:val="bullet"/>
+      <w:lvlText w:val="o"/>
+      <w:lvlJc w:val="left"/>
+      <w:pPr>
+        <w:ind w:left="1440" w:hanging="360"/>
+      </w:pPr>
+      <w:rPr>
+        <w:rFonts w:ascii="Courier New" w:hAnsi="Courier New" w:cs="Courier New" w:hint="default"/>
+      </w:rPr>
+    </w:lvl>
+    <w:lvl w:ilvl="2" w:tplc="04160005" w:tentative="1">
+      <w:start w:val="1"/>
+      <w:numFmt w:val="bullet"/>
+      <w:lvlText w:val=""/>
+      <w:lvlJc w:val="left"/>
+      <w:pPr>
+        <w:ind w:left="2160" w:hanging="360"/>
+      </w:pPr>
+      <w:rPr>
+        <w:rFonts w:ascii="Wingdings" w:hAnsi="Wingdings" w:hint="default"/>
+      </w:rPr>
+    </w:lvl>
+    <w:lvl w:ilvl="3" w:tplc="04160001" w:tentative="1">
+      <w:start w:val="1"/>
+      <w:numFmt w:val="bullet"/>
+      <w:lvlText w:val=""/>
+      <w:lvlJc w:val="left"/>
+      <w:pPr>
+        <w:ind w:left="2880" w:hanging="360"/>
+      </w:pPr>
+      <w:rPr>
+        <w:rFonts w:ascii="Symbol" w:hAnsi="Symbol" w:hint="default"/>
+      </w:rPr>
+    </w:lvl>
+    <w:lvl w:ilvl="4" w:tplc="04160003" w:tentative="1">
+      <w:start w:val="1"/>
+      <w:numFmt w:val="bullet"/>
+      <w:lvlText w:val="o"/>
+      <w:lvlJc w:val="left"/>
+      <w:pPr>
+        <w:ind w:left="3600" w:hanging="360"/>
+      </w:pPr>
+      <w:rPr>
+        <w:rFonts w:ascii="Courier New" w:hAnsi="Courier New" w:cs="Courier New" w:hint="default"/>
+      </w:rPr>
+    </w:lvl>
+    <w:lvl w:ilvl="5" w:tplc="04160005" w:tentative="1">
+      <w:start w:val="1"/>
+      <w:numFmt w:val="bullet"/>
+      <w:lvlText w:val=""/>
+      <w:lvlJc w:val="left"/>
+      <w:pPr>
+        <w:ind w:left="4320" w:hanging="360"/>
+      </w:pPr>
+      <w:rPr>
+        <w:rFonts w:ascii="Wingdings" w:hAnsi="Wingdings" w:hint="default"/>
+      </w:rPr>
+    </w:lvl>
+    <w:lvl w:ilvl="6" w:tplc="04160001" w:tentative="1">
+      <w:start w:val="1"/>
+      <w:numFmt w:val="bullet"/>
+      <w:lvlText w:val=""/>
+      <w:lvlJc w:val="left"/>
+      <w:pPr>
+        <w:ind w:left="5040" w:hanging="360"/>
+      </w:pPr>
+      <w:rPr>
+        <w:rFonts w:ascii="Symbol" w:hAnsi="Symbol" w:hint="default"/>
+      </w:rPr>
+    </w:lvl>
+    <w:lvl w:ilvl="7" w:tplc="04160003" w:tentative="1">
+      <w:start w:val="1"/>
+      <w:numFmt w:val="bullet"/>
+      <w:lvlText w:val="o"/>
+      <w:lvlJc w:val="left"/>
+      <w:pPr>
+        <w:ind w:left="5760" w:hanging="360"/>
+      </w:pPr>
+      <w:rPr>
+        <w:rFonts w:ascii="Courier New" w:hAnsi="Courier New" w:cs="Courier New" w:hint="default"/>
+      </w:rPr>
+    </w:lvl>
+    <w:lvl w:ilvl="8" w:tplc="04160005" w:tentative="1">
+      <w:start w:val="1"/>
+      <w:numFmt w:val="bullet"/>
+      <w:lvlText w:val=""/>
+      <w:lvlJc w:val="left"/>
+      <w:pPr>
+        <w:ind w:left="6480" w:hanging="360"/>
+      </w:pPr>
+      <w:rPr>
+        <w:rFonts w:ascii="Wingdings" w:hAnsi="Wingdings" w:hint="default"/>
+      </w:rPr>
+    </w:lvl>
+  </w:abstractNum>
+  <w:abstractNum w:abstractNumId="2" w15:restartNumberingAfterBreak="0">
     <w:nsid w:val="1F7D485F"/>
     <w:multiLevelType w:val="hybridMultilevel"/>
     <w:tmpl w:val="DE66A444"/>
@@ -4455,7 +5358,7 @@
       </w:pPr>
     </w:lvl>
   </w:abstractNum>
-  <w:abstractNum w:abstractNumId="2" w15:restartNumberingAfterBreak="0">
+  <w:abstractNum w:abstractNumId="3" w15:restartNumberingAfterBreak="0">
     <w:nsid w:val="35B17321"/>
     <w:multiLevelType w:val="hybridMultilevel"/>
     <w:tmpl w:val="2FA665E0"/>
@@ -4568,7 +5471,7 @@
       </w:rPr>
     </w:lvl>
   </w:abstractNum>
-  <w:abstractNum w:abstractNumId="3" w15:restartNumberingAfterBreak="0">
+  <w:abstractNum w:abstractNumId="4" w15:restartNumberingAfterBreak="0">
     <w:nsid w:val="480C2855"/>
     <w:multiLevelType w:val="hybridMultilevel"/>
     <w:tmpl w:val="E5C43278"/>
@@ -4681,7 +5584,7 @@
       </w:rPr>
     </w:lvl>
   </w:abstractNum>
-  <w:abstractNum w:abstractNumId="4" w15:restartNumberingAfterBreak="0">
+  <w:abstractNum w:abstractNumId="5" w15:restartNumberingAfterBreak="0">
     <w:nsid w:val="4F52492F"/>
     <w:multiLevelType w:val="hybridMultilevel"/>
     <w:tmpl w:val="9CA03F90"/>
@@ -4770,7 +5673,7 @@
       </w:pPr>
     </w:lvl>
   </w:abstractNum>
-  <w:abstractNum w:abstractNumId="5" w15:restartNumberingAfterBreak="0">
+  <w:abstractNum w:abstractNumId="6" w15:restartNumberingAfterBreak="0">
     <w:nsid w:val="55DE784F"/>
     <w:multiLevelType w:val="hybridMultilevel"/>
     <w:tmpl w:val="5DC851B4"/>
@@ -4883,7 +5786,7 @@
       </w:rPr>
     </w:lvl>
   </w:abstractNum>
-  <w:abstractNum w:abstractNumId="6" w15:restartNumberingAfterBreak="0">
+  <w:abstractNum w:abstractNumId="7" w15:restartNumberingAfterBreak="0">
     <w:nsid w:val="5D2C3BB7"/>
     <w:multiLevelType w:val="hybridMultilevel"/>
     <w:tmpl w:val="152225AA"/>
@@ -4973,25 +5876,28 @@
     </w:lvl>
   </w:abstractNum>
   <w:num w:numId="1">
-    <w:abstractNumId w:val="1"/>
+    <w:abstractNumId w:val="2"/>
   </w:num>
   <w:num w:numId="2">
-    <w:abstractNumId w:val="6"/>
+    <w:abstractNumId w:val="7"/>
   </w:num>
   <w:num w:numId="3">
-    <w:abstractNumId w:val="3"/>
+    <w:abstractNumId w:val="4"/>
   </w:num>
   <w:num w:numId="4">
-    <w:abstractNumId w:val="4"/>
+    <w:abstractNumId w:val="5"/>
   </w:num>
   <w:num w:numId="5">
     <w:abstractNumId w:val="0"/>
   </w:num>
   <w:num w:numId="6">
-    <w:abstractNumId w:val="2"/>
+    <w:abstractNumId w:val="3"/>
   </w:num>
   <w:num w:numId="7">
-    <w:abstractNumId w:val="5"/>
+    <w:abstractNumId w:val="6"/>
+  </w:num>
+  <w:num w:numId="8">
+    <w:abstractNumId w:val="1"/>
   </w:num>
 </w:numbering>
 </file>
@@ -5758,7 +6664,7 @@
 </file>
 
 <file path=customXml/itemProps1.xml><?xml version="1.0" encoding="utf-8"?>
-<ds:datastoreItem xmlns:ds="http://schemas.openxmlformats.org/officeDocument/2006/customXml" ds:itemID="{8377670F-9282-4386-9FB9-B7F39CF20D88}">
+<ds:datastoreItem xmlns:ds="http://schemas.openxmlformats.org/officeDocument/2006/customXml" ds:itemID="{E069FB34-5773-4AAD-9796-0EB17BCD4F8C}">
   <ds:schemaRefs>
     <ds:schemaRef ds:uri="http://schemas.openxmlformats.org/officeDocument/2006/bibliography"/>
   </ds:schemaRefs>

</xml_diff>